<commit_message>
Implement React login and application routing
</commit_message>
<xml_diff>
--- a/docs/scrum/Sprint_1_to_4_Documentation_initial_Draft.docx
+++ b/docs/scrum/Sprint_1_to_4_Documentation_initial_Draft.docx
@@ -2166,6 +2166,3460 @@
         <w:br w:type="page"/>
       </w:r>
     </w:p>
+    <w:p>
+      <w:pPr>
+        <w:pStyle w:val="Title"/>
+      </w:pPr>
+      <w:r>
+        <w:lastRenderedPageBreak/>
+        <w:t>Container Management System - Scrum Sprint Documentation (Sprints 1–4)</w:t>
+      </w:r>
+    </w:p>
+    <w:p>
+      <w:r>
+        <w:t xml:space="preserve">This document </w:t>
+      </w:r>
+      <w:proofErr w:type="spellStart"/>
+      <w:r>
+        <w:t>summarises</w:t>
+      </w:r>
+      <w:proofErr w:type="spellEnd"/>
+      <w:r>
+        <w:t xml:space="preserve"> the Scrum activities completed during backend development. The sprint content is based on Git commit history, implemented functionality and testing evidence.</w:t>
+      </w:r>
+    </w:p>
+    <w:p>
+      <w:pPr>
+        <w:pStyle w:val="Heading1"/>
+      </w:pPr>
+      <w:r>
+        <w:t>Sprint 1</w:t>
+      </w:r>
+    </w:p>
+    <w:p>
+      <w:r>
+        <w:rPr>
+          <w:b/>
+        </w:rPr>
+        <w:t xml:space="preserve">Sprint Goal: </w:t>
+      </w:r>
+      <w:r>
+        <w:t>Establish the project foundation by implementing authentication, role-based access control, and container registration.</w:t>
+      </w:r>
+    </w:p>
+    <w:p>
+      <w:pPr>
+        <w:pStyle w:val="Heading2"/>
+      </w:pPr>
+      <w:r>
+        <w:t>Sprint Backlog</w:t>
+      </w:r>
+    </w:p>
+    <w:tbl>
+      <w:tblPr>
+        <w:tblStyle w:val="TableGrid"/>
+        <w:tblW w:w="0" w:type="auto"/>
+        <w:tblLook w:val="04A0" w:firstRow="1" w:lastRow="0" w:firstColumn="1" w:lastColumn="0" w:noHBand="0" w:noVBand="1"/>
+      </w:tblPr>
+      <w:tblGrid>
+        <w:gridCol w:w="1724"/>
+        <w:gridCol w:w="1728"/>
+        <w:gridCol w:w="1726"/>
+        <w:gridCol w:w="1726"/>
+        <w:gridCol w:w="1726"/>
+      </w:tblGrid>
+      <w:tr>
+        <w:tc>
+          <w:tcPr>
+            <w:tcW w:w="1728" w:type="dxa"/>
+          </w:tcPr>
+          <w:p>
+            <w:r>
+              <w:t>ID</w:t>
+            </w:r>
+          </w:p>
+        </w:tc>
+        <w:tc>
+          <w:tcPr>
+            <w:tcW w:w="1728" w:type="dxa"/>
+          </w:tcPr>
+          <w:p>
+            <w:r>
+              <w:t>User Story</w:t>
+            </w:r>
+          </w:p>
+        </w:tc>
+        <w:tc>
+          <w:tcPr>
+            <w:tcW w:w="1728" w:type="dxa"/>
+          </w:tcPr>
+          <w:p>
+            <w:r>
+              <w:t>Priority</w:t>
+            </w:r>
+          </w:p>
+        </w:tc>
+        <w:tc>
+          <w:tcPr>
+            <w:tcW w:w="1728" w:type="dxa"/>
+          </w:tcPr>
+          <w:p>
+            <w:r>
+              <w:t>Story Points</w:t>
+            </w:r>
+          </w:p>
+        </w:tc>
+        <w:tc>
+          <w:tcPr>
+            <w:tcW w:w="1728" w:type="dxa"/>
+          </w:tcPr>
+          <w:p>
+            <w:r>
+              <w:t>Status</w:t>
+            </w:r>
+          </w:p>
+        </w:tc>
+      </w:tr>
+      <w:tr>
+        <w:tc>
+          <w:tcPr>
+            <w:tcW w:w="1728" w:type="dxa"/>
+          </w:tcPr>
+          <w:p>
+            <w:r>
+              <w:t>PB-001</w:t>
+            </w:r>
+          </w:p>
+        </w:tc>
+        <w:tc>
+          <w:tcPr>
+            <w:tcW w:w="1728" w:type="dxa"/>
+          </w:tcPr>
+          <w:p>
+            <w:r>
+              <w:t>User Authentication</w:t>
+            </w:r>
+          </w:p>
+        </w:tc>
+        <w:tc>
+          <w:tcPr>
+            <w:tcW w:w="1728" w:type="dxa"/>
+          </w:tcPr>
+          <w:p>
+            <w:r>
+              <w:t>Must</w:t>
+            </w:r>
+          </w:p>
+        </w:tc>
+        <w:tc>
+          <w:tcPr>
+            <w:tcW w:w="1728" w:type="dxa"/>
+          </w:tcPr>
+          <w:p>
+            <w:r>
+              <w:t>3</w:t>
+            </w:r>
+          </w:p>
+        </w:tc>
+        <w:tc>
+          <w:tcPr>
+            <w:tcW w:w="1728" w:type="dxa"/>
+          </w:tcPr>
+          <w:p>
+            <w:r>
+              <w:t>Done</w:t>
+            </w:r>
+          </w:p>
+        </w:tc>
+      </w:tr>
+      <w:tr>
+        <w:tc>
+          <w:tcPr>
+            <w:tcW w:w="1728" w:type="dxa"/>
+          </w:tcPr>
+          <w:p>
+            <w:r>
+              <w:t>PB-002</w:t>
+            </w:r>
+          </w:p>
+        </w:tc>
+        <w:tc>
+          <w:tcPr>
+            <w:tcW w:w="1728" w:type="dxa"/>
+          </w:tcPr>
+          <w:p>
+            <w:r>
+              <w:t>Role-Based Access Control</w:t>
+            </w:r>
+          </w:p>
+        </w:tc>
+        <w:tc>
+          <w:tcPr>
+            <w:tcW w:w="1728" w:type="dxa"/>
+          </w:tcPr>
+          <w:p>
+            <w:r>
+              <w:t>Must</w:t>
+            </w:r>
+          </w:p>
+        </w:tc>
+        <w:tc>
+          <w:tcPr>
+            <w:tcW w:w="1728" w:type="dxa"/>
+          </w:tcPr>
+          <w:p>
+            <w:r>
+              <w:t>5</w:t>
+            </w:r>
+          </w:p>
+        </w:tc>
+        <w:tc>
+          <w:tcPr>
+            <w:tcW w:w="1728" w:type="dxa"/>
+          </w:tcPr>
+          <w:p>
+            <w:r>
+              <w:t>Done</w:t>
+            </w:r>
+          </w:p>
+        </w:tc>
+      </w:tr>
+      <w:tr>
+        <w:tc>
+          <w:tcPr>
+            <w:tcW w:w="1728" w:type="dxa"/>
+          </w:tcPr>
+          <w:p>
+            <w:r>
+              <w:t>PB-003</w:t>
+            </w:r>
+          </w:p>
+        </w:tc>
+        <w:tc>
+          <w:tcPr>
+            <w:tcW w:w="1728" w:type="dxa"/>
+          </w:tcPr>
+          <w:p>
+            <w:r>
+              <w:t>Register Container</w:t>
+            </w:r>
+          </w:p>
+        </w:tc>
+        <w:tc>
+          <w:tcPr>
+            <w:tcW w:w="1728" w:type="dxa"/>
+          </w:tcPr>
+          <w:p>
+            <w:r>
+              <w:t>Must</w:t>
+            </w:r>
+          </w:p>
+        </w:tc>
+        <w:tc>
+          <w:tcPr>
+            <w:tcW w:w="1728" w:type="dxa"/>
+          </w:tcPr>
+          <w:p>
+            <w:r>
+              <w:t>3</w:t>
+            </w:r>
+          </w:p>
+        </w:tc>
+        <w:tc>
+          <w:tcPr>
+            <w:tcW w:w="1728" w:type="dxa"/>
+          </w:tcPr>
+          <w:p>
+            <w:r>
+              <w:t>Done</w:t>
+            </w:r>
+          </w:p>
+        </w:tc>
+      </w:tr>
+    </w:tbl>
+    <w:p>
+      <w:pPr>
+        <w:pStyle w:val="Heading2"/>
+      </w:pPr>
+      <w:r>
+        <w:t>Development Tasks</w:t>
+      </w:r>
+    </w:p>
+    <w:p>
+      <w:pPr>
+        <w:pStyle w:val="ListBullet"/>
+      </w:pPr>
+      <w:r>
+        <w:t>Implement JWT authentication</w:t>
+      </w:r>
+    </w:p>
+    <w:p>
+      <w:pPr>
+        <w:pStyle w:val="ListBullet"/>
+      </w:pPr>
+      <w:r>
+        <w:t>Configure role-based access</w:t>
+      </w:r>
+    </w:p>
+    <w:p>
+      <w:pPr>
+        <w:pStyle w:val="ListBullet"/>
+      </w:pPr>
+      <w:r>
+        <w:t>Create container registration</w:t>
+      </w:r>
+    </w:p>
+    <w:p>
+      <w:pPr>
+        <w:pStyle w:val="ListBullet"/>
+      </w:pPr>
+      <w:r>
+        <w:t>Test authentication and registration</w:t>
+      </w:r>
+    </w:p>
+    <w:p>
+      <w:pPr>
+        <w:pStyle w:val="Heading2"/>
+      </w:pPr>
+      <w:r>
+        <w:t>GitHub Evidence</w:t>
+      </w:r>
+    </w:p>
+    <w:p>
+      <w:pPr>
+        <w:pStyle w:val="ListBullet"/>
+      </w:pPr>
+      <w:r>
+        <w:t>29 Jun 2026 – Complete JWT authentication module</w:t>
+      </w:r>
+    </w:p>
+    <w:p>
+      <w:pPr>
+        <w:pStyle w:val="ListBullet"/>
+      </w:pPr>
+      <w:r>
+        <w:t>29 Jun 2026 – Implement container management module</w:t>
+      </w:r>
+    </w:p>
+    <w:p>
+      <w:pPr>
+        <w:pStyle w:val="Heading2"/>
+      </w:pPr>
+      <w:r>
+        <w:t>Definition of Done</w:t>
+      </w:r>
+    </w:p>
+    <w:p>
+      <w:pPr>
+        <w:pStyle w:val="ListBullet"/>
+      </w:pPr>
+      <w:r>
+        <w:t>Feature implemented</w:t>
+      </w:r>
+    </w:p>
+    <w:p>
+      <w:pPr>
+        <w:pStyle w:val="ListBullet"/>
+      </w:pPr>
+      <w:r>
+        <w:t>Business rules satisfied</w:t>
+      </w:r>
+    </w:p>
+    <w:p>
+      <w:pPr>
+        <w:pStyle w:val="ListBullet"/>
+      </w:pPr>
+      <w:r>
+        <w:t>Tested using Postman and database verification</w:t>
+      </w:r>
+    </w:p>
+    <w:p>
+      <w:pPr>
+        <w:pStyle w:val="ListBullet"/>
+      </w:pPr>
+      <w:r>
+        <w:t>Committed to Git</w:t>
+      </w:r>
+    </w:p>
+    <w:p>
+      <w:pPr>
+        <w:pStyle w:val="ListBullet"/>
+      </w:pPr>
+      <w:r>
+        <w:t>Integrated successfully</w:t>
+      </w:r>
+    </w:p>
+    <w:p>
+      <w:pPr>
+        <w:pStyle w:val="Heading2"/>
+      </w:pPr>
+      <w:r>
+        <w:t>Sprint Review</w:t>
+      </w:r>
+    </w:p>
+    <w:p>
+      <w:pPr>
+        <w:pStyle w:val="ListBullet"/>
+      </w:pPr>
+      <w:r>
+        <w:t>Authentication implemented</w:t>
+      </w:r>
+    </w:p>
+    <w:p>
+      <w:pPr>
+        <w:pStyle w:val="ListBullet"/>
+      </w:pPr>
+      <w:r>
+        <w:t>Role-based security operational</w:t>
+      </w:r>
+    </w:p>
+    <w:p>
+      <w:pPr>
+        <w:pStyle w:val="ListBullet"/>
+      </w:pPr>
+      <w:r>
+        <w:lastRenderedPageBreak/>
+        <w:t>Container registration completed</w:t>
+      </w:r>
+    </w:p>
+    <w:p>
+      <w:pPr>
+        <w:pStyle w:val="Heading2"/>
+      </w:pPr>
+      <w:r>
+        <w:t>What Went Well</w:t>
+      </w:r>
+    </w:p>
+    <w:p>
+      <w:pPr>
+        <w:pStyle w:val="ListBullet"/>
+      </w:pPr>
+      <w:r>
+        <w:t>Strong project foundation established</w:t>
+      </w:r>
+    </w:p>
+    <w:p>
+      <w:pPr>
+        <w:pStyle w:val="ListBullet"/>
+      </w:pPr>
+      <w:r>
+        <w:t>Backend architecture created</w:t>
+      </w:r>
+    </w:p>
+    <w:p>
+      <w:pPr>
+        <w:pStyle w:val="Heading2"/>
+      </w:pPr>
+      <w:r>
+        <w:t>Challenges</w:t>
+      </w:r>
+    </w:p>
+    <w:p>
+      <w:pPr>
+        <w:pStyle w:val="ListBullet"/>
+      </w:pPr>
+      <w:r>
+        <w:t>Learning JWT</w:t>
+      </w:r>
+    </w:p>
+    <w:p>
+      <w:pPr>
+        <w:pStyle w:val="ListBullet"/>
+      </w:pPr>
+      <w:r>
+        <w:t>Designing database relationships</w:t>
+      </w:r>
+    </w:p>
+    <w:p>
+      <w:pPr>
+        <w:pStyle w:val="Heading2"/>
+      </w:pPr>
+      <w:r>
+        <w:t>Focus for Next Sprint</w:t>
+      </w:r>
+    </w:p>
+    <w:p>
+      <w:r>
+        <w:t xml:space="preserve">Implement workflow </w:t>
+      </w:r>
+      <w:proofErr w:type="gramStart"/>
+      <w:r>
+        <w:t>engine</w:t>
+      </w:r>
+      <w:proofErr w:type="gramEnd"/>
+      <w:r>
+        <w:t xml:space="preserve"> and approval process.</w:t>
+      </w:r>
+    </w:p>
+    <w:p>
+      <w:r>
+        <w:br w:type="page"/>
+      </w:r>
+    </w:p>
+    <w:p>
+      <w:pPr>
+        <w:pStyle w:val="Heading1"/>
+      </w:pPr>
+      <w:r>
+        <w:lastRenderedPageBreak/>
+        <w:t>Sprint 2</w:t>
+      </w:r>
+    </w:p>
+    <w:p>
+      <w:r>
+        <w:rPr>
+          <w:b/>
+        </w:rPr>
+        <w:t xml:space="preserve">Sprint Goal: </w:t>
+      </w:r>
+      <w:r>
+        <w:t>Implement workflow management and approval processes.</w:t>
+      </w:r>
+    </w:p>
+    <w:p>
+      <w:pPr>
+        <w:pStyle w:val="Heading2"/>
+      </w:pPr>
+      <w:r>
+        <w:t>Sprint Backlog</w:t>
+      </w:r>
+    </w:p>
+    <w:tbl>
+      <w:tblPr>
+        <w:tblStyle w:val="TableGrid"/>
+        <w:tblW w:w="0" w:type="auto"/>
+        <w:tblLook w:val="04A0" w:firstRow="1" w:lastRow="0" w:firstColumn="1" w:lastColumn="0" w:noHBand="0" w:noVBand="1"/>
+      </w:tblPr>
+      <w:tblGrid>
+        <w:gridCol w:w="1725"/>
+        <w:gridCol w:w="1727"/>
+        <w:gridCol w:w="1726"/>
+        <w:gridCol w:w="1726"/>
+        <w:gridCol w:w="1726"/>
+      </w:tblGrid>
+      <w:tr>
+        <w:tc>
+          <w:tcPr>
+            <w:tcW w:w="1728" w:type="dxa"/>
+          </w:tcPr>
+          <w:p>
+            <w:r>
+              <w:t>ID</w:t>
+            </w:r>
+          </w:p>
+        </w:tc>
+        <w:tc>
+          <w:tcPr>
+            <w:tcW w:w="1728" w:type="dxa"/>
+          </w:tcPr>
+          <w:p>
+            <w:r>
+              <w:t>User Story</w:t>
+            </w:r>
+          </w:p>
+        </w:tc>
+        <w:tc>
+          <w:tcPr>
+            <w:tcW w:w="1728" w:type="dxa"/>
+          </w:tcPr>
+          <w:p>
+            <w:r>
+              <w:t>Priority</w:t>
+            </w:r>
+          </w:p>
+        </w:tc>
+        <w:tc>
+          <w:tcPr>
+            <w:tcW w:w="1728" w:type="dxa"/>
+          </w:tcPr>
+          <w:p>
+            <w:r>
+              <w:t>Story Points</w:t>
+            </w:r>
+          </w:p>
+        </w:tc>
+        <w:tc>
+          <w:tcPr>
+            <w:tcW w:w="1728" w:type="dxa"/>
+          </w:tcPr>
+          <w:p>
+            <w:r>
+              <w:t>Status</w:t>
+            </w:r>
+          </w:p>
+        </w:tc>
+      </w:tr>
+      <w:tr>
+        <w:tc>
+          <w:tcPr>
+            <w:tcW w:w="1728" w:type="dxa"/>
+          </w:tcPr>
+          <w:p>
+            <w:r>
+              <w:t>PB-005</w:t>
+            </w:r>
+          </w:p>
+        </w:tc>
+        <w:tc>
+          <w:tcPr>
+            <w:tcW w:w="1728" w:type="dxa"/>
+          </w:tcPr>
+          <w:p>
+            <w:r>
+              <w:t>Move Containers Through Workflow</w:t>
+            </w:r>
+          </w:p>
+        </w:tc>
+        <w:tc>
+          <w:tcPr>
+            <w:tcW w:w="1728" w:type="dxa"/>
+          </w:tcPr>
+          <w:p>
+            <w:r>
+              <w:t>Must</w:t>
+            </w:r>
+          </w:p>
+        </w:tc>
+        <w:tc>
+          <w:tcPr>
+            <w:tcW w:w="1728" w:type="dxa"/>
+          </w:tcPr>
+          <w:p>
+            <w:r>
+              <w:t>8</w:t>
+            </w:r>
+          </w:p>
+        </w:tc>
+        <w:tc>
+          <w:tcPr>
+            <w:tcW w:w="1728" w:type="dxa"/>
+          </w:tcPr>
+          <w:p>
+            <w:r>
+              <w:t>Done</w:t>
+            </w:r>
+          </w:p>
+        </w:tc>
+      </w:tr>
+      <w:tr>
+        <w:tc>
+          <w:tcPr>
+            <w:tcW w:w="1728" w:type="dxa"/>
+          </w:tcPr>
+          <w:p>
+            <w:r>
+              <w:t>PB-006</w:t>
+            </w:r>
+          </w:p>
+        </w:tc>
+        <w:tc>
+          <w:tcPr>
+            <w:tcW w:w="1728" w:type="dxa"/>
+          </w:tcPr>
+          <w:p>
+            <w:r>
+              <w:t>Prevent Invalid Workflow Transitions</w:t>
+            </w:r>
+          </w:p>
+        </w:tc>
+        <w:tc>
+          <w:tcPr>
+            <w:tcW w:w="1728" w:type="dxa"/>
+          </w:tcPr>
+          <w:p>
+            <w:r>
+              <w:t>Must</w:t>
+            </w:r>
+          </w:p>
+        </w:tc>
+        <w:tc>
+          <w:tcPr>
+            <w:tcW w:w="1728" w:type="dxa"/>
+          </w:tcPr>
+          <w:p>
+            <w:r>
+              <w:t>5</w:t>
+            </w:r>
+          </w:p>
+        </w:tc>
+        <w:tc>
+          <w:tcPr>
+            <w:tcW w:w="1728" w:type="dxa"/>
+          </w:tcPr>
+          <w:p>
+            <w:r>
+              <w:t>Done</w:t>
+            </w:r>
+          </w:p>
+        </w:tc>
+      </w:tr>
+      <w:tr>
+        <w:tc>
+          <w:tcPr>
+            <w:tcW w:w="1728" w:type="dxa"/>
+          </w:tcPr>
+          <w:p>
+            <w:r>
+              <w:t>PB-007</w:t>
+            </w:r>
+          </w:p>
+        </w:tc>
+        <w:tc>
+          <w:tcPr>
+            <w:tcW w:w="1728" w:type="dxa"/>
+          </w:tcPr>
+          <w:p>
+            <w:r>
+              <w:t>QA Approval</w:t>
+            </w:r>
+          </w:p>
+        </w:tc>
+        <w:tc>
+          <w:tcPr>
+            <w:tcW w:w="1728" w:type="dxa"/>
+          </w:tcPr>
+          <w:p>
+            <w:r>
+              <w:t>Must</w:t>
+            </w:r>
+          </w:p>
+        </w:tc>
+        <w:tc>
+          <w:tcPr>
+            <w:tcW w:w="1728" w:type="dxa"/>
+          </w:tcPr>
+          <w:p>
+            <w:r>
+              <w:t>5</w:t>
+            </w:r>
+          </w:p>
+        </w:tc>
+        <w:tc>
+          <w:tcPr>
+            <w:tcW w:w="1728" w:type="dxa"/>
+          </w:tcPr>
+          <w:p>
+            <w:r>
+              <w:t>Done</w:t>
+            </w:r>
+          </w:p>
+        </w:tc>
+      </w:tr>
+      <w:tr>
+        <w:tc>
+          <w:tcPr>
+            <w:tcW w:w="1728" w:type="dxa"/>
+          </w:tcPr>
+          <w:p>
+            <w:r>
+              <w:t>PB-013</w:t>
+            </w:r>
+          </w:p>
+        </w:tc>
+        <w:tc>
+          <w:tcPr>
+            <w:tcW w:w="1728" w:type="dxa"/>
+          </w:tcPr>
+          <w:p>
+            <w:r>
+              <w:t>Supervisor Approval (Initial)</w:t>
+            </w:r>
+          </w:p>
+        </w:tc>
+        <w:tc>
+          <w:tcPr>
+            <w:tcW w:w="1728" w:type="dxa"/>
+          </w:tcPr>
+          <w:p>
+            <w:r>
+              <w:t>Must</w:t>
+            </w:r>
+          </w:p>
+        </w:tc>
+        <w:tc>
+          <w:tcPr>
+            <w:tcW w:w="1728" w:type="dxa"/>
+          </w:tcPr>
+          <w:p>
+            <w:r>
+              <w:t>5</w:t>
+            </w:r>
+          </w:p>
+        </w:tc>
+        <w:tc>
+          <w:tcPr>
+            <w:tcW w:w="1728" w:type="dxa"/>
+          </w:tcPr>
+          <w:p>
+            <w:r>
+              <w:t>Done</w:t>
+            </w:r>
+          </w:p>
+        </w:tc>
+      </w:tr>
+    </w:tbl>
+    <w:p>
+      <w:pPr>
+        <w:pStyle w:val="Heading2"/>
+      </w:pPr>
+      <w:r>
+        <w:t>Development Tasks</w:t>
+      </w:r>
+    </w:p>
+    <w:p>
+      <w:pPr>
+        <w:pStyle w:val="ListBullet"/>
+      </w:pPr>
+      <w:r>
+        <w:t>Create workflow engine</w:t>
+      </w:r>
+    </w:p>
+    <w:p>
+      <w:pPr>
+        <w:pStyle w:val="ListBullet"/>
+      </w:pPr>
+      <w:r>
+        <w:t>Validate stage transitions</w:t>
+      </w:r>
+    </w:p>
+    <w:p>
+      <w:pPr>
+        <w:pStyle w:val="ListBullet"/>
+      </w:pPr>
+      <w:r>
+        <w:t>Implement QA approvals</w:t>
+      </w:r>
+    </w:p>
+    <w:p>
+      <w:pPr>
+        <w:pStyle w:val="ListBullet"/>
+      </w:pPr>
+      <w:r>
+        <w:t>Implement supervisor approvals</w:t>
+      </w:r>
+    </w:p>
+    <w:p>
+      <w:pPr>
+        <w:pStyle w:val="Heading2"/>
+      </w:pPr>
+      <w:r>
+        <w:t>GitHub Evidence</w:t>
+      </w:r>
+    </w:p>
+    <w:p>
+      <w:pPr>
+        <w:pStyle w:val="ListBullet"/>
+      </w:pPr>
+      <w:r>
+        <w:t>30 Jun 2026 – Implement lifecycle workflow, movement tracking and QA approval</w:t>
+      </w:r>
+    </w:p>
+    <w:p>
+      <w:pPr>
+        <w:pStyle w:val="ListBullet"/>
+      </w:pPr>
+      <w:r>
+        <w:t>1 Jul 2026 – Implement production approval workflow with operator retry</w:t>
+      </w:r>
+    </w:p>
+    <w:p>
+      <w:pPr>
+        <w:pStyle w:val="ListBullet"/>
+      </w:pPr>
+      <w:r>
+        <w:t>1 Jul 2026 – Implement supervisor approval workflow for production lifecycle</w:t>
+      </w:r>
+    </w:p>
+    <w:p>
+      <w:pPr>
+        <w:pStyle w:val="Heading2"/>
+      </w:pPr>
+      <w:r>
+        <w:t>Definition of Done</w:t>
+      </w:r>
+    </w:p>
+    <w:p>
+      <w:pPr>
+        <w:pStyle w:val="ListBullet"/>
+      </w:pPr>
+      <w:r>
+        <w:t>Feature implemented</w:t>
+      </w:r>
+    </w:p>
+    <w:p>
+      <w:pPr>
+        <w:pStyle w:val="ListBullet"/>
+      </w:pPr>
+      <w:r>
+        <w:t>Business rules satisfied</w:t>
+      </w:r>
+    </w:p>
+    <w:p>
+      <w:pPr>
+        <w:pStyle w:val="ListBullet"/>
+      </w:pPr>
+      <w:r>
+        <w:t>Tested using Postman and database verification</w:t>
+      </w:r>
+    </w:p>
+    <w:p>
+      <w:pPr>
+        <w:pStyle w:val="ListBullet"/>
+      </w:pPr>
+      <w:r>
+        <w:t>Committed to Git</w:t>
+      </w:r>
+    </w:p>
+    <w:p>
+      <w:pPr>
+        <w:pStyle w:val="ListBullet"/>
+      </w:pPr>
+      <w:r>
+        <w:t>Integrated successfully</w:t>
+      </w:r>
+    </w:p>
+    <w:p>
+      <w:pPr>
+        <w:pStyle w:val="Heading2"/>
+      </w:pPr>
+      <w:r>
+        <w:t>Sprint Review</w:t>
+      </w:r>
+    </w:p>
+    <w:p>
+      <w:pPr>
+        <w:pStyle w:val="ListBullet"/>
+      </w:pPr>
+      <w:r>
+        <w:t>Workflow engine completed</w:t>
+      </w:r>
+    </w:p>
+    <w:p>
+      <w:pPr>
+        <w:pStyle w:val="ListBullet"/>
+      </w:pPr>
+      <w:r>
+        <w:t>Movement tracking operational</w:t>
+      </w:r>
+    </w:p>
+    <w:p>
+      <w:pPr>
+        <w:pStyle w:val="ListBullet"/>
+      </w:pPr>
+      <w:r>
+        <w:t>Approval workflows implemented</w:t>
+      </w:r>
+    </w:p>
+    <w:p>
+      <w:pPr>
+        <w:pStyle w:val="Heading2"/>
+      </w:pPr>
+      <w:r>
+        <w:t>What Went Well</w:t>
+      </w:r>
+    </w:p>
+    <w:p>
+      <w:pPr>
+        <w:pStyle w:val="ListBullet"/>
+      </w:pPr>
+      <w:r>
+        <w:t xml:space="preserve">Business rules </w:t>
+      </w:r>
+      <w:proofErr w:type="spellStart"/>
+      <w:r>
+        <w:t>centralised</w:t>
+      </w:r>
+      <w:proofErr w:type="spellEnd"/>
+    </w:p>
+    <w:p>
+      <w:pPr>
+        <w:pStyle w:val="ListBullet"/>
+      </w:pPr>
+      <w:r>
+        <w:t>Improved traceability</w:t>
+      </w:r>
+    </w:p>
+    <w:p>
+      <w:pPr>
+        <w:pStyle w:val="Heading2"/>
+      </w:pPr>
+      <w:r>
+        <w:lastRenderedPageBreak/>
+        <w:t>Challenges</w:t>
+      </w:r>
+    </w:p>
+    <w:p>
+      <w:pPr>
+        <w:pStyle w:val="ListBullet"/>
+      </w:pPr>
+      <w:proofErr w:type="gramStart"/>
+      <w:r>
+        <w:t>Approval</w:t>
+      </w:r>
+      <w:proofErr w:type="gramEnd"/>
+      <w:r>
+        <w:t xml:space="preserve"> logic complexity</w:t>
+      </w:r>
+    </w:p>
+    <w:p>
+      <w:pPr>
+        <w:pStyle w:val="ListBullet"/>
+      </w:pPr>
+      <w:r>
+        <w:t>Workflow validation</w:t>
+      </w:r>
+    </w:p>
+    <w:p>
+      <w:pPr>
+        <w:pStyle w:val="Heading2"/>
+      </w:pPr>
+      <w:r>
+        <w:t>Focus for Next Sprint</w:t>
+      </w:r>
+    </w:p>
+    <w:p>
+      <w:r>
+        <w:t>Complete production lifecycle.</w:t>
+      </w:r>
+    </w:p>
+    <w:p>
+      <w:r>
+        <w:br w:type="page"/>
+      </w:r>
+    </w:p>
+    <w:p>
+      <w:pPr>
+        <w:pStyle w:val="Heading1"/>
+      </w:pPr>
+      <w:r>
+        <w:lastRenderedPageBreak/>
+        <w:t>Sprint 3</w:t>
+      </w:r>
+    </w:p>
+    <w:p>
+      <w:r>
+        <w:rPr>
+          <w:b/>
+        </w:rPr>
+        <w:t xml:space="preserve">Sprint Goal: </w:t>
+      </w:r>
+      <w:r>
+        <w:t xml:space="preserve">Complete the production lifecycle and refine workflow </w:t>
+      </w:r>
+      <w:proofErr w:type="spellStart"/>
+      <w:r>
+        <w:t>behaviour</w:t>
+      </w:r>
+      <w:proofErr w:type="spellEnd"/>
+      <w:r>
+        <w:t>.</w:t>
+      </w:r>
+    </w:p>
+    <w:p>
+      <w:pPr>
+        <w:pStyle w:val="Heading2"/>
+      </w:pPr>
+      <w:r>
+        <w:t>Sprint Backlog</w:t>
+      </w:r>
+    </w:p>
+    <w:tbl>
+      <w:tblPr>
+        <w:tblStyle w:val="TableGrid"/>
+        <w:tblW w:w="0" w:type="auto"/>
+        <w:tblLook w:val="04A0" w:firstRow="1" w:lastRow="0" w:firstColumn="1" w:lastColumn="0" w:noHBand="0" w:noVBand="1"/>
+      </w:tblPr>
+      <w:tblGrid>
+        <w:gridCol w:w="1725"/>
+        <w:gridCol w:w="1727"/>
+        <w:gridCol w:w="1726"/>
+        <w:gridCol w:w="1726"/>
+        <w:gridCol w:w="1726"/>
+      </w:tblGrid>
+      <w:tr>
+        <w:tc>
+          <w:tcPr>
+            <w:tcW w:w="1728" w:type="dxa"/>
+          </w:tcPr>
+          <w:p>
+            <w:r>
+              <w:t>ID</w:t>
+            </w:r>
+          </w:p>
+        </w:tc>
+        <w:tc>
+          <w:tcPr>
+            <w:tcW w:w="1728" w:type="dxa"/>
+          </w:tcPr>
+          <w:p>
+            <w:r>
+              <w:t>User Story</w:t>
+            </w:r>
+          </w:p>
+        </w:tc>
+        <w:tc>
+          <w:tcPr>
+            <w:tcW w:w="1728" w:type="dxa"/>
+          </w:tcPr>
+          <w:p>
+            <w:r>
+              <w:t>Priority</w:t>
+            </w:r>
+          </w:p>
+        </w:tc>
+        <w:tc>
+          <w:tcPr>
+            <w:tcW w:w="1728" w:type="dxa"/>
+          </w:tcPr>
+          <w:p>
+            <w:r>
+              <w:t>Story Points</w:t>
+            </w:r>
+          </w:p>
+        </w:tc>
+        <w:tc>
+          <w:tcPr>
+            <w:tcW w:w="1728" w:type="dxa"/>
+          </w:tcPr>
+          <w:p>
+            <w:r>
+              <w:t>Status</w:t>
+            </w:r>
+          </w:p>
+        </w:tc>
+      </w:tr>
+      <w:tr>
+        <w:tc>
+          <w:tcPr>
+            <w:tcW w:w="1728" w:type="dxa"/>
+          </w:tcPr>
+          <w:p>
+            <w:r>
+              <w:t>PB-008</w:t>
+            </w:r>
+          </w:p>
+        </w:tc>
+        <w:tc>
+          <w:tcPr>
+            <w:tcW w:w="1728" w:type="dxa"/>
+          </w:tcPr>
+          <w:p>
+            <w:r>
+              <w:t>Production Lifecycle</w:t>
+            </w:r>
+          </w:p>
+        </w:tc>
+        <w:tc>
+          <w:tcPr>
+            <w:tcW w:w="1728" w:type="dxa"/>
+          </w:tcPr>
+          <w:p>
+            <w:r>
+              <w:t>Must</w:t>
+            </w:r>
+          </w:p>
+        </w:tc>
+        <w:tc>
+          <w:tcPr>
+            <w:tcW w:w="1728" w:type="dxa"/>
+          </w:tcPr>
+          <w:p>
+            <w:r>
+              <w:t>8</w:t>
+            </w:r>
+          </w:p>
+        </w:tc>
+        <w:tc>
+          <w:tcPr>
+            <w:tcW w:w="1728" w:type="dxa"/>
+          </w:tcPr>
+          <w:p>
+            <w:r>
+              <w:t>Done</w:t>
+            </w:r>
+          </w:p>
+        </w:tc>
+      </w:tr>
+      <w:tr>
+        <w:tc>
+          <w:tcPr>
+            <w:tcW w:w="1728" w:type="dxa"/>
+          </w:tcPr>
+          <w:p>
+            <w:r>
+              <w:t>PB-009</w:t>
+            </w:r>
+          </w:p>
+        </w:tc>
+        <w:tc>
+          <w:tcPr>
+            <w:tcW w:w="1728" w:type="dxa"/>
+          </w:tcPr>
+          <w:p>
+            <w:r>
+              <w:t>Production Use Tracking</w:t>
+            </w:r>
+          </w:p>
+        </w:tc>
+        <w:tc>
+          <w:tcPr>
+            <w:tcW w:w="1728" w:type="dxa"/>
+          </w:tcPr>
+          <w:p>
+            <w:r>
+              <w:t>Must</w:t>
+            </w:r>
+          </w:p>
+        </w:tc>
+        <w:tc>
+          <w:tcPr>
+            <w:tcW w:w="1728" w:type="dxa"/>
+          </w:tcPr>
+          <w:p>
+            <w:r>
+              <w:t>5</w:t>
+            </w:r>
+          </w:p>
+        </w:tc>
+        <w:tc>
+          <w:tcPr>
+            <w:tcW w:w="1728" w:type="dxa"/>
+          </w:tcPr>
+          <w:p>
+            <w:r>
+              <w:t>Done</w:t>
+            </w:r>
+          </w:p>
+        </w:tc>
+      </w:tr>
+      <w:tr>
+        <w:tc>
+          <w:tcPr>
+            <w:tcW w:w="1728" w:type="dxa"/>
+          </w:tcPr>
+          <w:p>
+            <w:r>
+              <w:t>PB-010</w:t>
+            </w:r>
+          </w:p>
+        </w:tc>
+        <w:tc>
+          <w:tcPr>
+            <w:tcW w:w="1728" w:type="dxa"/>
+          </w:tcPr>
+          <w:p>
+            <w:r>
+              <w:t>Lifecycle Validation</w:t>
+            </w:r>
+          </w:p>
+        </w:tc>
+        <w:tc>
+          <w:tcPr>
+            <w:tcW w:w="1728" w:type="dxa"/>
+          </w:tcPr>
+          <w:p>
+            <w:r>
+              <w:t>Must</w:t>
+            </w:r>
+          </w:p>
+        </w:tc>
+        <w:tc>
+          <w:tcPr>
+            <w:tcW w:w="1728" w:type="dxa"/>
+          </w:tcPr>
+          <w:p>
+            <w:r>
+              <w:t>5</w:t>
+            </w:r>
+          </w:p>
+        </w:tc>
+        <w:tc>
+          <w:tcPr>
+            <w:tcW w:w="1728" w:type="dxa"/>
+          </w:tcPr>
+          <w:p>
+            <w:r>
+              <w:t>Done</w:t>
+            </w:r>
+          </w:p>
+        </w:tc>
+      </w:tr>
+      <w:tr>
+        <w:tc>
+          <w:tcPr>
+            <w:tcW w:w="1728" w:type="dxa"/>
+          </w:tcPr>
+          <w:p>
+            <w:r>
+              <w:t>PB-011</w:t>
+            </w:r>
+          </w:p>
+        </w:tc>
+        <w:tc>
+          <w:tcPr>
+            <w:tcW w:w="1728" w:type="dxa"/>
+          </w:tcPr>
+          <w:p>
+            <w:r>
+              <w:t>Workflow Refinement</w:t>
+            </w:r>
+          </w:p>
+        </w:tc>
+        <w:tc>
+          <w:tcPr>
+            <w:tcW w:w="1728" w:type="dxa"/>
+          </w:tcPr>
+          <w:p>
+            <w:r>
+              <w:t>Should</w:t>
+            </w:r>
+          </w:p>
+        </w:tc>
+        <w:tc>
+          <w:tcPr>
+            <w:tcW w:w="1728" w:type="dxa"/>
+          </w:tcPr>
+          <w:p>
+            <w:r>
+              <w:t>3</w:t>
+            </w:r>
+          </w:p>
+        </w:tc>
+        <w:tc>
+          <w:tcPr>
+            <w:tcW w:w="1728" w:type="dxa"/>
+          </w:tcPr>
+          <w:p>
+            <w:r>
+              <w:t>Done</w:t>
+            </w:r>
+          </w:p>
+        </w:tc>
+      </w:tr>
+    </w:tbl>
+    <w:p>
+      <w:pPr>
+        <w:pStyle w:val="Heading2"/>
+      </w:pPr>
+      <w:r>
+        <w:t>Development Tasks</w:t>
+      </w:r>
+    </w:p>
+    <w:p>
+      <w:pPr>
+        <w:pStyle w:val="ListBullet"/>
+      </w:pPr>
+      <w:r>
+        <w:t>Implement lifecycle tracking</w:t>
+      </w:r>
+    </w:p>
+    <w:p>
+      <w:pPr>
+        <w:pStyle w:val="ListBullet"/>
+      </w:pPr>
+      <w:r>
+        <w:t>Track production use</w:t>
+      </w:r>
+    </w:p>
+    <w:p>
+      <w:pPr>
+        <w:pStyle w:val="ListBullet"/>
+      </w:pPr>
+      <w:r>
+        <w:t>Refine workflow</w:t>
+      </w:r>
+    </w:p>
+    <w:p>
+      <w:pPr>
+        <w:pStyle w:val="ListBullet"/>
+      </w:pPr>
+      <w:r>
+        <w:t>Fix approval logic</w:t>
+      </w:r>
+    </w:p>
+    <w:p>
+      <w:pPr>
+        <w:pStyle w:val="Heading2"/>
+      </w:pPr>
+      <w:r>
+        <w:t>GitHub Evidence</w:t>
+      </w:r>
+    </w:p>
+    <w:p>
+      <w:pPr>
+        <w:pStyle w:val="ListBullet"/>
+      </w:pPr>
+      <w:r>
+        <w:t>2 Jul 2026 – Complete first container lifecycle with QA approval</w:t>
+      </w:r>
+    </w:p>
+    <w:p>
+      <w:pPr>
+        <w:pStyle w:val="ListBullet"/>
+      </w:pPr>
+      <w:r>
+        <w:t>2 Jul 2026 – Complete initial production approval workflow</w:t>
+      </w:r>
+    </w:p>
+    <w:p>
+      <w:pPr>
+        <w:pStyle w:val="ListBullet"/>
+      </w:pPr>
+      <w:r>
+        <w:t>3 Jul 2026 – Fixed container workflow, approval logic, lifecycle updates, and cleaned service files</w:t>
+      </w:r>
+    </w:p>
+    <w:p>
+      <w:pPr>
+        <w:pStyle w:val="Heading2"/>
+      </w:pPr>
+      <w:r>
+        <w:t>Definition of Done</w:t>
+      </w:r>
+    </w:p>
+    <w:p>
+      <w:pPr>
+        <w:pStyle w:val="ListBullet"/>
+      </w:pPr>
+      <w:r>
+        <w:t>Feature implemented</w:t>
+      </w:r>
+    </w:p>
+    <w:p>
+      <w:pPr>
+        <w:pStyle w:val="ListBullet"/>
+      </w:pPr>
+      <w:r>
+        <w:t>Business rules satisfied</w:t>
+      </w:r>
+    </w:p>
+    <w:p>
+      <w:pPr>
+        <w:pStyle w:val="ListBullet"/>
+      </w:pPr>
+      <w:r>
+        <w:t>Tested using Postman and database verification</w:t>
+      </w:r>
+    </w:p>
+    <w:p>
+      <w:pPr>
+        <w:pStyle w:val="ListBullet"/>
+      </w:pPr>
+      <w:r>
+        <w:t>Committed to Git</w:t>
+      </w:r>
+    </w:p>
+    <w:p>
+      <w:pPr>
+        <w:pStyle w:val="ListBullet"/>
+      </w:pPr>
+      <w:r>
+        <w:t>Integrated successfully</w:t>
+      </w:r>
+    </w:p>
+    <w:p>
+      <w:pPr>
+        <w:pStyle w:val="Heading2"/>
+      </w:pPr>
+      <w:r>
+        <w:t>Sprint Review</w:t>
+      </w:r>
+    </w:p>
+    <w:p>
+      <w:pPr>
+        <w:pStyle w:val="ListBullet"/>
+      </w:pPr>
+      <w:proofErr w:type="gramStart"/>
+      <w:r>
+        <w:t>Production</w:t>
+      </w:r>
+      <w:proofErr w:type="gramEnd"/>
+      <w:r>
+        <w:t xml:space="preserve"> lifecycle completed</w:t>
+      </w:r>
+    </w:p>
+    <w:p>
+      <w:pPr>
+        <w:pStyle w:val="ListBullet"/>
+      </w:pPr>
+      <w:r>
+        <w:t>Workflow refined</w:t>
+      </w:r>
+    </w:p>
+    <w:p>
+      <w:pPr>
+        <w:pStyle w:val="ListBullet"/>
+      </w:pPr>
+      <w:r>
+        <w:t>Approval logic corrected</w:t>
+      </w:r>
+    </w:p>
+    <w:p>
+      <w:pPr>
+        <w:pStyle w:val="Heading2"/>
+      </w:pPr>
+      <w:r>
+        <w:t>What Went Well</w:t>
+      </w:r>
+    </w:p>
+    <w:p>
+      <w:pPr>
+        <w:pStyle w:val="ListBullet"/>
+      </w:pPr>
+      <w:r>
+        <w:t xml:space="preserve">Lifecycle </w:t>
+      </w:r>
+      <w:proofErr w:type="spellStart"/>
+      <w:r>
+        <w:t>behaviour</w:t>
+      </w:r>
+      <w:proofErr w:type="spellEnd"/>
+      <w:r>
+        <w:t xml:space="preserve"> </w:t>
+      </w:r>
+      <w:proofErr w:type="spellStart"/>
+      <w:r>
+        <w:t>stabilised</w:t>
+      </w:r>
+      <w:proofErr w:type="spellEnd"/>
+    </w:p>
+    <w:p>
+      <w:pPr>
+        <w:pStyle w:val="ListBullet"/>
+      </w:pPr>
+      <w:r>
+        <w:t>Cleaner service layer</w:t>
+      </w:r>
+    </w:p>
+    <w:p>
+      <w:pPr>
+        <w:pStyle w:val="Heading2"/>
+      </w:pPr>
+      <w:r>
+        <w:t>Challenges</w:t>
+      </w:r>
+    </w:p>
+    <w:p>
+      <w:pPr>
+        <w:pStyle w:val="ListBullet"/>
+      </w:pPr>
+      <w:r>
+        <w:t>Edge cases</w:t>
+      </w:r>
+    </w:p>
+    <w:p>
+      <w:pPr>
+        <w:pStyle w:val="ListBullet"/>
+      </w:pPr>
+      <w:r>
+        <w:lastRenderedPageBreak/>
+        <w:t>Lifecycle consistency</w:t>
+      </w:r>
+    </w:p>
+    <w:p>
+      <w:pPr>
+        <w:pStyle w:val="Heading2"/>
+      </w:pPr>
+      <w:r>
+        <w:t>Focus for Next Sprint</w:t>
+      </w:r>
+    </w:p>
+    <w:p>
+      <w:r>
+        <w:t>Implement expiry, observations and simulation.</w:t>
+      </w:r>
+    </w:p>
+    <w:p>
+      <w:r>
+        <w:br w:type="page"/>
+      </w:r>
+    </w:p>
+    <w:p>
+      <w:pPr>
+        <w:pStyle w:val="Heading1"/>
+      </w:pPr>
+      <w:r>
+        <w:lastRenderedPageBreak/>
+        <w:t>Sprint 4</w:t>
+      </w:r>
+    </w:p>
+    <w:p>
+      <w:r>
+        <w:rPr>
+          <w:b/>
+        </w:rPr>
+        <w:t xml:space="preserve">Sprint Goal: </w:t>
+      </w:r>
+      <w:r>
+        <w:t>Complete lifecycle expiry, observation management, audit trail and automated simulation.</w:t>
+      </w:r>
+    </w:p>
+    <w:p>
+      <w:pPr>
+        <w:pStyle w:val="Heading2"/>
+      </w:pPr>
+      <w:r>
+        <w:t>Sprint Backlog</w:t>
+      </w:r>
+    </w:p>
+    <w:tbl>
+      <w:tblPr>
+        <w:tblStyle w:val="TableGrid"/>
+        <w:tblW w:w="0" w:type="auto"/>
+        <w:tblLook w:val="04A0" w:firstRow="1" w:lastRow="0" w:firstColumn="1" w:lastColumn="0" w:noHBand="0" w:noVBand="1"/>
+      </w:tblPr>
+      <w:tblGrid>
+        <w:gridCol w:w="1725"/>
+        <w:gridCol w:w="1727"/>
+        <w:gridCol w:w="1726"/>
+        <w:gridCol w:w="1726"/>
+        <w:gridCol w:w="1726"/>
+      </w:tblGrid>
+      <w:tr>
+        <w:tc>
+          <w:tcPr>
+            <w:tcW w:w="1728" w:type="dxa"/>
+          </w:tcPr>
+          <w:p>
+            <w:r>
+              <w:t>ID</w:t>
+            </w:r>
+          </w:p>
+        </w:tc>
+        <w:tc>
+          <w:tcPr>
+            <w:tcW w:w="1728" w:type="dxa"/>
+          </w:tcPr>
+          <w:p>
+            <w:r>
+              <w:t>User Story</w:t>
+            </w:r>
+          </w:p>
+        </w:tc>
+        <w:tc>
+          <w:tcPr>
+            <w:tcW w:w="1728" w:type="dxa"/>
+          </w:tcPr>
+          <w:p>
+            <w:r>
+              <w:t>Priority</w:t>
+            </w:r>
+          </w:p>
+        </w:tc>
+        <w:tc>
+          <w:tcPr>
+            <w:tcW w:w="1728" w:type="dxa"/>
+          </w:tcPr>
+          <w:p>
+            <w:r>
+              <w:t>Story Points</w:t>
+            </w:r>
+          </w:p>
+        </w:tc>
+        <w:tc>
+          <w:tcPr>
+            <w:tcW w:w="1728" w:type="dxa"/>
+          </w:tcPr>
+          <w:p>
+            <w:r>
+              <w:t>Status</w:t>
+            </w:r>
+          </w:p>
+        </w:tc>
+      </w:tr>
+      <w:tr>
+        <w:tc>
+          <w:tcPr>
+            <w:tcW w:w="1728" w:type="dxa"/>
+          </w:tcPr>
+          <w:p>
+            <w:r>
+              <w:t>PB-012</w:t>
+            </w:r>
+          </w:p>
+        </w:tc>
+        <w:tc>
+          <w:tcPr>
+            <w:tcW w:w="1728" w:type="dxa"/>
+          </w:tcPr>
+          <w:p>
+            <w:r>
+              <w:t>14-Use Expiry</w:t>
+            </w:r>
+          </w:p>
+        </w:tc>
+        <w:tc>
+          <w:tcPr>
+            <w:tcW w:w="1728" w:type="dxa"/>
+          </w:tcPr>
+          <w:p>
+            <w:r>
+              <w:t>Must</w:t>
+            </w:r>
+          </w:p>
+        </w:tc>
+        <w:tc>
+          <w:tcPr>
+            <w:tcW w:w="1728" w:type="dxa"/>
+          </w:tcPr>
+          <w:p>
+            <w:r>
+              <w:t>5</w:t>
+            </w:r>
+          </w:p>
+        </w:tc>
+        <w:tc>
+          <w:tcPr>
+            <w:tcW w:w="1728" w:type="dxa"/>
+          </w:tcPr>
+          <w:p>
+            <w:r>
+              <w:t>Done</w:t>
+            </w:r>
+          </w:p>
+        </w:tc>
+      </w:tr>
+      <w:tr>
+        <w:tc>
+          <w:tcPr>
+            <w:tcW w:w="1728" w:type="dxa"/>
+          </w:tcPr>
+          <w:p>
+            <w:r>
+              <w:t>PB-013</w:t>
+            </w:r>
+          </w:p>
+        </w:tc>
+        <w:tc>
+          <w:tcPr>
+            <w:tcW w:w="1728" w:type="dxa"/>
+          </w:tcPr>
+          <w:p>
+            <w:r>
+              <w:t>30-Day Expiry</w:t>
+            </w:r>
+          </w:p>
+        </w:tc>
+        <w:tc>
+          <w:tcPr>
+            <w:tcW w:w="1728" w:type="dxa"/>
+          </w:tcPr>
+          <w:p>
+            <w:r>
+              <w:t>Must</w:t>
+            </w:r>
+          </w:p>
+        </w:tc>
+        <w:tc>
+          <w:tcPr>
+            <w:tcW w:w="1728" w:type="dxa"/>
+          </w:tcPr>
+          <w:p>
+            <w:r>
+              <w:t>5</w:t>
+            </w:r>
+          </w:p>
+        </w:tc>
+        <w:tc>
+          <w:tcPr>
+            <w:tcW w:w="1728" w:type="dxa"/>
+          </w:tcPr>
+          <w:p>
+            <w:r>
+              <w:t>Done</w:t>
+            </w:r>
+          </w:p>
+        </w:tc>
+      </w:tr>
+      <w:tr>
+        <w:tc>
+          <w:tcPr>
+            <w:tcW w:w="1728" w:type="dxa"/>
+          </w:tcPr>
+          <w:p>
+            <w:r>
+              <w:t>PB-014</w:t>
+            </w:r>
+          </w:p>
+        </w:tc>
+        <w:tc>
+          <w:tcPr>
+            <w:tcW w:w="1728" w:type="dxa"/>
+          </w:tcPr>
+          <w:p>
+            <w:r>
+              <w:t>Observation Management</w:t>
+            </w:r>
+          </w:p>
+        </w:tc>
+        <w:tc>
+          <w:tcPr>
+            <w:tcW w:w="1728" w:type="dxa"/>
+          </w:tcPr>
+          <w:p>
+            <w:r>
+              <w:t>Must</w:t>
+            </w:r>
+          </w:p>
+        </w:tc>
+        <w:tc>
+          <w:tcPr>
+            <w:tcW w:w="1728" w:type="dxa"/>
+          </w:tcPr>
+          <w:p>
+            <w:r>
+              <w:t>5</w:t>
+            </w:r>
+          </w:p>
+        </w:tc>
+        <w:tc>
+          <w:tcPr>
+            <w:tcW w:w="1728" w:type="dxa"/>
+          </w:tcPr>
+          <w:p>
+            <w:r>
+              <w:t>Done</w:t>
+            </w:r>
+          </w:p>
+        </w:tc>
+      </w:tr>
+      <w:tr>
+        <w:tc>
+          <w:tcPr>
+            <w:tcW w:w="1728" w:type="dxa"/>
+          </w:tcPr>
+          <w:p>
+            <w:r>
+              <w:t>PB-015</w:t>
+            </w:r>
+          </w:p>
+        </w:tc>
+        <w:tc>
+          <w:tcPr>
+            <w:tcW w:w="1728" w:type="dxa"/>
+          </w:tcPr>
+          <w:p>
+            <w:r>
+              <w:t>Lifecycle Reset</w:t>
+            </w:r>
+          </w:p>
+        </w:tc>
+        <w:tc>
+          <w:tcPr>
+            <w:tcW w:w="1728" w:type="dxa"/>
+          </w:tcPr>
+          <w:p>
+            <w:r>
+              <w:t>Must</w:t>
+            </w:r>
+          </w:p>
+        </w:tc>
+        <w:tc>
+          <w:tcPr>
+            <w:tcW w:w="1728" w:type="dxa"/>
+          </w:tcPr>
+          <w:p>
+            <w:r>
+              <w:t>5</w:t>
+            </w:r>
+          </w:p>
+        </w:tc>
+        <w:tc>
+          <w:tcPr>
+            <w:tcW w:w="1728" w:type="dxa"/>
+          </w:tcPr>
+          <w:p>
+            <w:r>
+              <w:t>Done</w:t>
+            </w:r>
+          </w:p>
+        </w:tc>
+      </w:tr>
+      <w:tr>
+        <w:tc>
+          <w:tcPr>
+            <w:tcW w:w="1728" w:type="dxa"/>
+          </w:tcPr>
+          <w:p>
+            <w:r>
+              <w:t>PB-016</w:t>
+            </w:r>
+          </w:p>
+        </w:tc>
+        <w:tc>
+          <w:tcPr>
+            <w:tcW w:w="1728" w:type="dxa"/>
+          </w:tcPr>
+          <w:p>
+            <w:r>
+              <w:t>Audit Trail</w:t>
+            </w:r>
+          </w:p>
+        </w:tc>
+        <w:tc>
+          <w:tcPr>
+            <w:tcW w:w="1728" w:type="dxa"/>
+          </w:tcPr>
+          <w:p>
+            <w:r>
+              <w:t>Should</w:t>
+            </w:r>
+          </w:p>
+        </w:tc>
+        <w:tc>
+          <w:tcPr>
+            <w:tcW w:w="1728" w:type="dxa"/>
+          </w:tcPr>
+          <w:p>
+            <w:r>
+              <w:t>3</w:t>
+            </w:r>
+          </w:p>
+        </w:tc>
+        <w:tc>
+          <w:tcPr>
+            <w:tcW w:w="1728" w:type="dxa"/>
+          </w:tcPr>
+          <w:p>
+            <w:r>
+              <w:t>Done</w:t>
+            </w:r>
+          </w:p>
+        </w:tc>
+      </w:tr>
+      <w:tr>
+        <w:tc>
+          <w:tcPr>
+            <w:tcW w:w="1728" w:type="dxa"/>
+          </w:tcPr>
+          <w:p>
+            <w:r>
+              <w:t>PB-017</w:t>
+            </w:r>
+          </w:p>
+        </w:tc>
+        <w:tc>
+          <w:tcPr>
+            <w:tcW w:w="1728" w:type="dxa"/>
+          </w:tcPr>
+          <w:p>
+            <w:r>
+              <w:t>Automated Container Simulation</w:t>
+            </w:r>
+          </w:p>
+        </w:tc>
+        <w:tc>
+          <w:tcPr>
+            <w:tcW w:w="1728" w:type="dxa"/>
+          </w:tcPr>
+          <w:p>
+            <w:r>
+              <w:t>Should</w:t>
+            </w:r>
+          </w:p>
+        </w:tc>
+        <w:tc>
+          <w:tcPr>
+            <w:tcW w:w="1728" w:type="dxa"/>
+          </w:tcPr>
+          <w:p>
+            <w:r>
+              <w:t>8</w:t>
+            </w:r>
+          </w:p>
+        </w:tc>
+        <w:tc>
+          <w:tcPr>
+            <w:tcW w:w="1728" w:type="dxa"/>
+          </w:tcPr>
+          <w:p>
+            <w:r>
+              <w:t>Done</w:t>
+            </w:r>
+          </w:p>
+        </w:tc>
+      </w:tr>
+    </w:tbl>
+    <w:p>
+      <w:pPr>
+        <w:pStyle w:val="Heading2"/>
+      </w:pPr>
+      <w:r>
+        <w:t>Development Tasks</w:t>
+      </w:r>
+    </w:p>
+    <w:p>
+      <w:pPr>
+        <w:pStyle w:val="ListBullet"/>
+      </w:pPr>
+      <w:r>
+        <w:t>Implement expiry rules</w:t>
+      </w:r>
+    </w:p>
+    <w:p>
+      <w:pPr>
+        <w:pStyle w:val="ListBullet"/>
+      </w:pPr>
+      <w:r>
+        <w:t>Observation management</w:t>
+      </w:r>
+    </w:p>
+    <w:p>
+      <w:pPr>
+        <w:pStyle w:val="ListBullet"/>
+      </w:pPr>
+      <w:r>
+        <w:t>Lifecycle reset</w:t>
+      </w:r>
+    </w:p>
+    <w:p>
+      <w:pPr>
+        <w:pStyle w:val="ListBullet"/>
+      </w:pPr>
+      <w:r>
+        <w:t>Audit logging</w:t>
+      </w:r>
+    </w:p>
+    <w:p>
+      <w:pPr>
+        <w:pStyle w:val="ListBullet"/>
+      </w:pPr>
+      <w:r>
+        <w:t>Simulation</w:t>
+      </w:r>
+    </w:p>
+    <w:p>
+      <w:pPr>
+        <w:pStyle w:val="Heading2"/>
+      </w:pPr>
+      <w:r>
+        <w:t>GitHub Evidence</w:t>
+      </w:r>
+    </w:p>
+    <w:p>
+      <w:pPr>
+        <w:pStyle w:val="ListBullet"/>
+      </w:pPr>
+      <w:r>
+        <w:t>4 Jul 2026 – Complete production lifecycle with expiry, approvals and reset</w:t>
+      </w:r>
+    </w:p>
+    <w:p>
+      <w:pPr>
+        <w:pStyle w:val="ListBullet"/>
+      </w:pPr>
+      <w:r>
+        <w:t>4 Jul 2026 – Complete container lifecycle workflow with approvals and expiry reset</w:t>
+      </w:r>
+    </w:p>
+    <w:p>
+      <w:pPr>
+        <w:pStyle w:val="ListBullet"/>
+      </w:pPr>
+      <w:r>
+        <w:t>5 Jul 2026 – Backend Workflow Complete</w:t>
+      </w:r>
+    </w:p>
+    <w:p>
+      <w:pPr>
+        <w:pStyle w:val="ListBullet"/>
+      </w:pPr>
+      <w:r>
+        <w:t>6 Jul 2026 – Complete automated container lifecycle simulation</w:t>
+      </w:r>
+    </w:p>
+    <w:p>
+      <w:pPr>
+        <w:pStyle w:val="ListBullet"/>
+      </w:pPr>
+      <w:r>
+        <w:t>7 Jul 2026 – Complete backend workflow engine and simulation</w:t>
+      </w:r>
+    </w:p>
+    <w:p>
+      <w:pPr>
+        <w:pStyle w:val="Heading2"/>
+      </w:pPr>
+      <w:r>
+        <w:t>Definition of Done</w:t>
+      </w:r>
+    </w:p>
+    <w:p>
+      <w:pPr>
+        <w:pStyle w:val="ListBullet"/>
+      </w:pPr>
+      <w:r>
+        <w:t>Feature implemented</w:t>
+      </w:r>
+    </w:p>
+    <w:p>
+      <w:pPr>
+        <w:pStyle w:val="ListBullet"/>
+      </w:pPr>
+      <w:r>
+        <w:t>Business rules satisfied</w:t>
+      </w:r>
+    </w:p>
+    <w:p>
+      <w:pPr>
+        <w:pStyle w:val="ListBullet"/>
+      </w:pPr>
+      <w:r>
+        <w:t>Tested using Postman and database verification</w:t>
+      </w:r>
+    </w:p>
+    <w:p>
+      <w:pPr>
+        <w:pStyle w:val="ListBullet"/>
+      </w:pPr>
+      <w:r>
+        <w:t>Committed to Git</w:t>
+      </w:r>
+    </w:p>
+    <w:p>
+      <w:pPr>
+        <w:pStyle w:val="ListBullet"/>
+      </w:pPr>
+      <w:r>
+        <w:t>Integrated successfully</w:t>
+      </w:r>
+    </w:p>
+    <w:p>
+      <w:pPr>
+        <w:pStyle w:val="Heading2"/>
+      </w:pPr>
+      <w:r>
+        <w:t>Sprint Review</w:t>
+      </w:r>
+    </w:p>
+    <w:p>
+      <w:pPr>
+        <w:pStyle w:val="ListBullet"/>
+      </w:pPr>
+      <w:r>
+        <w:t>Backend workflow completed</w:t>
+      </w:r>
+    </w:p>
+    <w:p>
+      <w:pPr>
+        <w:pStyle w:val="ListBullet"/>
+      </w:pPr>
+      <w:r>
+        <w:t>Simulation operational</w:t>
+      </w:r>
+    </w:p>
+    <w:p>
+      <w:pPr>
+        <w:pStyle w:val="ListBullet"/>
+      </w:pPr>
+      <w:r>
+        <w:t>Business rules validated</w:t>
+      </w:r>
+    </w:p>
+    <w:p>
+      <w:pPr>
+        <w:pStyle w:val="Heading2"/>
+      </w:pPr>
+      <w:r>
+        <w:t>What Went Well</w:t>
+      </w:r>
+    </w:p>
+    <w:p>
+      <w:pPr>
+        <w:pStyle w:val="ListBullet"/>
+      </w:pPr>
+      <w:r>
+        <w:t xml:space="preserve">Backend </w:t>
+      </w:r>
+      <w:proofErr w:type="gramStart"/>
+      <w:r>
+        <w:t>feature</w:t>
+      </w:r>
+      <w:proofErr w:type="gramEnd"/>
+      <w:r>
+        <w:t xml:space="preserve"> complete</w:t>
+      </w:r>
+    </w:p>
+    <w:p>
+      <w:pPr>
+        <w:pStyle w:val="ListBullet"/>
+      </w:pPr>
+      <w:r>
+        <w:lastRenderedPageBreak/>
+        <w:t>Simulation validated workflow</w:t>
+      </w:r>
+    </w:p>
+    <w:p>
+      <w:pPr>
+        <w:pStyle w:val="Heading2"/>
+      </w:pPr>
+      <w:r>
+        <w:t>Challenges</w:t>
+      </w:r>
+    </w:p>
+    <w:p>
+      <w:pPr>
+        <w:pStyle w:val="ListBullet"/>
+      </w:pPr>
+      <w:proofErr w:type="spellStart"/>
+      <w:r>
+        <w:t>Synchronising</w:t>
+      </w:r>
+      <w:proofErr w:type="spellEnd"/>
+      <w:r>
+        <w:t xml:space="preserve"> expiry/reset logic</w:t>
+      </w:r>
+    </w:p>
+    <w:p>
+      <w:pPr>
+        <w:pStyle w:val="ListBullet"/>
+      </w:pPr>
+      <w:r>
+        <w:t>Complex business rules</w:t>
+      </w:r>
+    </w:p>
+    <w:p>
+      <w:pPr>
+        <w:pStyle w:val="Heading2"/>
+      </w:pPr>
+      <w:r>
+        <w:t>Focus for Next Sprint</w:t>
+      </w:r>
+    </w:p>
+    <w:p>
+      <w:r>
+        <w:t>Begin frontend, testing and documentation.</w:t>
+      </w:r>
+    </w:p>
+    <w:p>
+      <w:r>
+        <w:br w:type="page"/>
+      </w:r>
+    </w:p>
+    <w:p>
+      <w:pPr>
+        <w:rPr>
+          <w:b/>
+          <w:bCs/>
+          <w:color w:val="548DD4" w:themeColor="text2" w:themeTint="99"/>
+          <w:sz w:val="28"/>
+          <w:szCs w:val="28"/>
+        </w:rPr>
+      </w:pPr>
+      <w:r>
+        <w:rPr>
+          <w:b/>
+          <w:bCs/>
+          <w:color w:val="548DD4" w:themeColor="text2" w:themeTint="99"/>
+          <w:sz w:val="28"/>
+          <w:szCs w:val="28"/>
+        </w:rPr>
+        <w:lastRenderedPageBreak/>
+        <w:t>Sprint 5</w:t>
+      </w:r>
+    </w:p>
+    <w:p>
+      <w:pPr>
+        <w:rPr>
+          <w:color w:val="000000" w:themeColor="text1"/>
+          <w:sz w:val="28"/>
+          <w:szCs w:val="28"/>
+        </w:rPr>
+      </w:pPr>
+      <w:r>
+        <w:rPr>
+          <w:color w:val="000000" w:themeColor="text1"/>
+          <w:sz w:val="28"/>
+          <w:szCs w:val="28"/>
+        </w:rPr>
+        <w:t>Sprint Goal</w:t>
+      </w:r>
+    </w:p>
+    <w:p>
+      <w:pPr>
+        <w:rPr>
+          <w:color w:val="000000" w:themeColor="text1"/>
+          <w:sz w:val="28"/>
+          <w:szCs w:val="28"/>
+        </w:rPr>
+      </w:pPr>
+      <w:proofErr w:type="spellStart"/>
+      <w:r>
+        <w:rPr>
+          <w:color w:val="000000" w:themeColor="text1"/>
+          <w:sz w:val="28"/>
+          <w:szCs w:val="28"/>
+        </w:rPr>
+        <w:t>Stabalise</w:t>
+      </w:r>
+      <w:proofErr w:type="spellEnd"/>
+      <w:r>
+        <w:rPr>
+          <w:color w:val="000000" w:themeColor="text1"/>
+          <w:sz w:val="28"/>
+          <w:szCs w:val="28"/>
+        </w:rPr>
+        <w:t xml:space="preserve"> the backend application through bug fixing and comprehensive integration testing to ensure all business rules operate correctly before project completion.</w:t>
+      </w:r>
+    </w:p>
+    <w:tbl>
+      <w:tblPr>
+        <w:tblStyle w:val="TableGrid"/>
+        <w:tblW w:w="0" w:type="auto"/>
+        <w:tblLook w:val="04A0" w:firstRow="1" w:lastRow="0" w:firstColumn="1" w:lastColumn="0" w:noHBand="0" w:noVBand="1"/>
+      </w:tblPr>
+      <w:tblGrid>
+        <w:gridCol w:w="1658"/>
+        <w:gridCol w:w="2005"/>
+        <w:gridCol w:w="1875"/>
+        <w:gridCol w:w="1546"/>
+        <w:gridCol w:w="1546"/>
+      </w:tblGrid>
+      <w:tr>
+        <w:tc>
+          <w:tcPr>
+            <w:tcW w:w="1658" w:type="dxa"/>
+          </w:tcPr>
+          <w:p>
+            <w:pPr>
+              <w:rPr>
+                <w:color w:val="000000" w:themeColor="text1"/>
+                <w:sz w:val="24"/>
+                <w:szCs w:val="24"/>
+              </w:rPr>
+            </w:pPr>
+            <w:r>
+              <w:rPr>
+                <w:color w:val="000000" w:themeColor="text1"/>
+                <w:sz w:val="24"/>
+                <w:szCs w:val="24"/>
+              </w:rPr>
+              <w:t>ID</w:t>
+            </w:r>
+          </w:p>
+        </w:tc>
+        <w:tc>
+          <w:tcPr>
+            <w:tcW w:w="2005" w:type="dxa"/>
+          </w:tcPr>
+          <w:p>
+            <w:pPr>
+              <w:rPr>
+                <w:color w:val="000000" w:themeColor="text1"/>
+                <w:sz w:val="24"/>
+                <w:szCs w:val="24"/>
+              </w:rPr>
+            </w:pPr>
+            <w:r>
+              <w:rPr>
+                <w:color w:val="000000" w:themeColor="text1"/>
+                <w:sz w:val="24"/>
+                <w:szCs w:val="24"/>
+              </w:rPr>
+              <w:t>User Story</w:t>
+            </w:r>
+          </w:p>
+        </w:tc>
+        <w:tc>
+          <w:tcPr>
+            <w:tcW w:w="1875" w:type="dxa"/>
+          </w:tcPr>
+          <w:p>
+            <w:pPr>
+              <w:rPr>
+                <w:color w:val="000000" w:themeColor="text1"/>
+                <w:sz w:val="28"/>
+                <w:szCs w:val="28"/>
+              </w:rPr>
+            </w:pPr>
+            <w:r>
+              <w:rPr>
+                <w:color w:val="000000" w:themeColor="text1"/>
+                <w:sz w:val="28"/>
+                <w:szCs w:val="28"/>
+              </w:rPr>
+              <w:t>Priority</w:t>
+            </w:r>
+          </w:p>
+        </w:tc>
+        <w:tc>
+          <w:tcPr>
+            <w:tcW w:w="1546" w:type="dxa"/>
+          </w:tcPr>
+          <w:p>
+            <w:pPr>
+              <w:rPr>
+                <w:color w:val="000000" w:themeColor="text1"/>
+                <w:sz w:val="28"/>
+                <w:szCs w:val="28"/>
+              </w:rPr>
+            </w:pPr>
+            <w:r>
+              <w:rPr>
+                <w:color w:val="000000" w:themeColor="text1"/>
+                <w:sz w:val="28"/>
+                <w:szCs w:val="28"/>
+              </w:rPr>
+              <w:t>Story point</w:t>
+            </w:r>
+          </w:p>
+        </w:tc>
+        <w:tc>
+          <w:tcPr>
+            <w:tcW w:w="1546" w:type="dxa"/>
+          </w:tcPr>
+          <w:p>
+            <w:pPr>
+              <w:rPr>
+                <w:color w:val="000000" w:themeColor="text1"/>
+                <w:sz w:val="28"/>
+                <w:szCs w:val="28"/>
+              </w:rPr>
+            </w:pPr>
+            <w:r>
+              <w:rPr>
+                <w:color w:val="000000" w:themeColor="text1"/>
+                <w:sz w:val="28"/>
+                <w:szCs w:val="28"/>
+              </w:rPr>
+              <w:t>Status</w:t>
+            </w:r>
+          </w:p>
+        </w:tc>
+      </w:tr>
+      <w:tr>
+        <w:tc>
+          <w:tcPr>
+            <w:tcW w:w="1658" w:type="dxa"/>
+          </w:tcPr>
+          <w:p>
+            <w:pPr>
+              <w:rPr>
+                <w:color w:val="000000" w:themeColor="text1"/>
+                <w:sz w:val="28"/>
+                <w:szCs w:val="28"/>
+              </w:rPr>
+            </w:pPr>
+            <w:r>
+              <w:rPr>
+                <w:color w:val="000000" w:themeColor="text1"/>
+                <w:sz w:val="24"/>
+                <w:szCs w:val="24"/>
+              </w:rPr>
+              <w:t>PB-18</w:t>
+            </w:r>
+          </w:p>
+        </w:tc>
+        <w:tc>
+          <w:tcPr>
+            <w:tcW w:w="2005" w:type="dxa"/>
+          </w:tcPr>
+          <w:p>
+            <w:pPr>
+              <w:rPr>
+                <w:color w:val="000000" w:themeColor="text1"/>
+                <w:sz w:val="28"/>
+                <w:szCs w:val="28"/>
+              </w:rPr>
+            </w:pPr>
+            <w:r>
+              <w:rPr>
+                <w:color w:val="000000" w:themeColor="text1"/>
+                <w:sz w:val="24"/>
+                <w:szCs w:val="24"/>
+              </w:rPr>
+              <w:t>Bug Fixing</w:t>
+            </w:r>
+            <w:r>
+              <w:rPr>
+                <w:color w:val="000000" w:themeColor="text1"/>
+                <w:sz w:val="24"/>
+                <w:szCs w:val="24"/>
+              </w:rPr>
+              <w:t xml:space="preserve"> and </w:t>
+            </w:r>
+            <w:r>
+              <w:rPr>
+                <w:color w:val="000000" w:themeColor="text1"/>
+                <w:sz w:val="24"/>
+                <w:szCs w:val="24"/>
+              </w:rPr>
+              <w:t>S</w:t>
+            </w:r>
+            <w:r>
+              <w:rPr>
+                <w:color w:val="000000" w:themeColor="text1"/>
+                <w:sz w:val="24"/>
+                <w:szCs w:val="24"/>
+              </w:rPr>
+              <w:t xml:space="preserve">ystem </w:t>
+            </w:r>
+            <w:proofErr w:type="spellStart"/>
+            <w:r>
+              <w:rPr>
+                <w:color w:val="000000" w:themeColor="text1"/>
+                <w:sz w:val="24"/>
+                <w:szCs w:val="24"/>
+              </w:rPr>
+              <w:t>S</w:t>
+            </w:r>
+            <w:r>
+              <w:rPr>
+                <w:color w:val="000000" w:themeColor="text1"/>
+                <w:sz w:val="24"/>
+                <w:szCs w:val="24"/>
+              </w:rPr>
+              <w:t>tabilisatation</w:t>
+            </w:r>
+            <w:proofErr w:type="spellEnd"/>
+          </w:p>
+        </w:tc>
+        <w:tc>
+          <w:tcPr>
+            <w:tcW w:w="1875" w:type="dxa"/>
+          </w:tcPr>
+          <w:p>
+            <w:pPr>
+              <w:rPr>
+                <w:color w:val="000000" w:themeColor="text1"/>
+                <w:sz w:val="28"/>
+                <w:szCs w:val="28"/>
+              </w:rPr>
+            </w:pPr>
+            <w:r>
+              <w:rPr>
+                <w:color w:val="000000" w:themeColor="text1"/>
+                <w:sz w:val="28"/>
+                <w:szCs w:val="28"/>
+              </w:rPr>
+              <w:t>Must</w:t>
+            </w:r>
+          </w:p>
+        </w:tc>
+        <w:tc>
+          <w:tcPr>
+            <w:tcW w:w="1546" w:type="dxa"/>
+          </w:tcPr>
+          <w:p>
+            <w:pPr>
+              <w:rPr>
+                <w:color w:val="000000" w:themeColor="text1"/>
+                <w:sz w:val="28"/>
+                <w:szCs w:val="28"/>
+              </w:rPr>
+            </w:pPr>
+            <w:r>
+              <w:rPr>
+                <w:color w:val="000000" w:themeColor="text1"/>
+                <w:sz w:val="28"/>
+                <w:szCs w:val="28"/>
+              </w:rPr>
+              <w:t>3</w:t>
+            </w:r>
+          </w:p>
+        </w:tc>
+        <w:tc>
+          <w:tcPr>
+            <w:tcW w:w="1546" w:type="dxa"/>
+          </w:tcPr>
+          <w:p>
+            <w:pPr>
+              <w:rPr>
+                <w:color w:val="000000" w:themeColor="text1"/>
+                <w:sz w:val="28"/>
+                <w:szCs w:val="28"/>
+              </w:rPr>
+            </w:pPr>
+            <w:r>
+              <w:rPr>
+                <w:color w:val="000000" w:themeColor="text1"/>
+                <w:sz w:val="28"/>
+                <w:szCs w:val="28"/>
+              </w:rPr>
+              <w:t>Done</w:t>
+            </w:r>
+          </w:p>
+        </w:tc>
+      </w:tr>
+      <w:tr>
+        <w:tc>
+          <w:tcPr>
+            <w:tcW w:w="1658" w:type="dxa"/>
+          </w:tcPr>
+          <w:p>
+            <w:pPr>
+              <w:rPr>
+                <w:color w:val="000000" w:themeColor="text1"/>
+                <w:sz w:val="28"/>
+                <w:szCs w:val="28"/>
+              </w:rPr>
+            </w:pPr>
+            <w:r>
+              <w:rPr>
+                <w:color w:val="000000" w:themeColor="text1"/>
+                <w:sz w:val="28"/>
+                <w:szCs w:val="28"/>
+              </w:rPr>
+              <w:t>PB-19</w:t>
+            </w:r>
+          </w:p>
+        </w:tc>
+        <w:tc>
+          <w:tcPr>
+            <w:tcW w:w="2005" w:type="dxa"/>
+          </w:tcPr>
+          <w:p>
+            <w:pPr>
+              <w:rPr>
+                <w:color w:val="000000" w:themeColor="text1"/>
+                <w:sz w:val="28"/>
+                <w:szCs w:val="28"/>
+              </w:rPr>
+            </w:pPr>
+            <w:proofErr w:type="gramStart"/>
+            <w:r>
+              <w:rPr>
+                <w:color w:val="000000" w:themeColor="text1"/>
+                <w:sz w:val="28"/>
+                <w:szCs w:val="28"/>
+              </w:rPr>
+              <w:t>Integration  Testing</w:t>
+            </w:r>
+            <w:proofErr w:type="gramEnd"/>
+          </w:p>
+        </w:tc>
+        <w:tc>
+          <w:tcPr>
+            <w:tcW w:w="1875" w:type="dxa"/>
+          </w:tcPr>
+          <w:p>
+            <w:pPr>
+              <w:rPr>
+                <w:color w:val="000000" w:themeColor="text1"/>
+                <w:sz w:val="28"/>
+                <w:szCs w:val="28"/>
+              </w:rPr>
+            </w:pPr>
+            <w:r>
+              <w:rPr>
+                <w:color w:val="000000" w:themeColor="text1"/>
+                <w:sz w:val="28"/>
+                <w:szCs w:val="28"/>
+              </w:rPr>
+              <w:t>Must</w:t>
+            </w:r>
+          </w:p>
+        </w:tc>
+        <w:tc>
+          <w:tcPr>
+            <w:tcW w:w="1546" w:type="dxa"/>
+          </w:tcPr>
+          <w:p>
+            <w:pPr>
+              <w:rPr>
+                <w:color w:val="000000" w:themeColor="text1"/>
+                <w:sz w:val="28"/>
+                <w:szCs w:val="28"/>
+              </w:rPr>
+            </w:pPr>
+            <w:r>
+              <w:rPr>
+                <w:color w:val="000000" w:themeColor="text1"/>
+                <w:sz w:val="28"/>
+                <w:szCs w:val="28"/>
+              </w:rPr>
+              <w:t>3</w:t>
+            </w:r>
+          </w:p>
+        </w:tc>
+        <w:tc>
+          <w:tcPr>
+            <w:tcW w:w="1546" w:type="dxa"/>
+          </w:tcPr>
+          <w:p>
+            <w:pPr>
+              <w:rPr>
+                <w:color w:val="000000" w:themeColor="text1"/>
+                <w:sz w:val="28"/>
+                <w:szCs w:val="28"/>
+              </w:rPr>
+            </w:pPr>
+            <w:r>
+              <w:rPr>
+                <w:color w:val="000000" w:themeColor="text1"/>
+                <w:sz w:val="28"/>
+                <w:szCs w:val="28"/>
+              </w:rPr>
+              <w:t>Done</w:t>
+            </w:r>
+          </w:p>
+        </w:tc>
+      </w:tr>
+    </w:tbl>
+    <w:p>
+      <w:pPr>
+        <w:rPr>
+          <w:color w:val="000000" w:themeColor="text1"/>
+          <w:sz w:val="28"/>
+          <w:szCs w:val="28"/>
+        </w:rPr>
+      </w:pPr>
+    </w:p>
+    <w:p>
+      <w:pPr>
+        <w:rPr>
+          <w:color w:val="000000" w:themeColor="text1"/>
+          <w:sz w:val="28"/>
+          <w:szCs w:val="28"/>
+        </w:rPr>
+      </w:pPr>
+      <w:r>
+        <w:rPr>
+          <w:color w:val="000000" w:themeColor="text1"/>
+          <w:sz w:val="28"/>
+          <w:szCs w:val="28"/>
+        </w:rPr>
+        <w:t>Development Tasks:</w:t>
+      </w:r>
+    </w:p>
+    <w:p>
+      <w:pPr>
+        <w:pStyle w:val="ListParagraph"/>
+        <w:numPr>
+          <w:ilvl w:val="0"/>
+          <w:numId w:val="10"/>
+        </w:numPr>
+        <w:rPr>
+          <w:color w:val="000000" w:themeColor="text1"/>
+          <w:sz w:val="28"/>
+          <w:szCs w:val="28"/>
+        </w:rPr>
+      </w:pPr>
+      <w:r>
+        <w:rPr>
+          <w:color w:val="000000" w:themeColor="text1"/>
+          <w:sz w:val="28"/>
+          <w:szCs w:val="28"/>
+        </w:rPr>
+        <w:t>Resolve lifecycle workflow issues</w:t>
+      </w:r>
+    </w:p>
+    <w:p>
+      <w:pPr>
+        <w:pStyle w:val="ListParagraph"/>
+        <w:numPr>
+          <w:ilvl w:val="0"/>
+          <w:numId w:val="10"/>
+        </w:numPr>
+        <w:rPr>
+          <w:color w:val="000000" w:themeColor="text1"/>
+          <w:sz w:val="28"/>
+          <w:szCs w:val="28"/>
+        </w:rPr>
+      </w:pPr>
+      <w:r>
+        <w:rPr>
+          <w:color w:val="000000" w:themeColor="text1"/>
+          <w:sz w:val="28"/>
+          <w:szCs w:val="28"/>
+        </w:rPr>
+        <w:t>Refine approval workflow logic</w:t>
+      </w:r>
+    </w:p>
+    <w:p>
+      <w:pPr>
+        <w:pStyle w:val="ListParagraph"/>
+        <w:numPr>
+          <w:ilvl w:val="0"/>
+          <w:numId w:val="10"/>
+        </w:numPr>
+        <w:rPr>
+          <w:color w:val="000000" w:themeColor="text1"/>
+          <w:sz w:val="28"/>
+          <w:szCs w:val="28"/>
+        </w:rPr>
+      </w:pPr>
+      <w:r>
+        <w:rPr>
+          <w:color w:val="000000" w:themeColor="text1"/>
+          <w:sz w:val="28"/>
+          <w:szCs w:val="28"/>
+        </w:rPr>
+        <w:t>Correct production use tracking</w:t>
+      </w:r>
+    </w:p>
+    <w:p>
+      <w:pPr>
+        <w:pStyle w:val="ListParagraph"/>
+        <w:numPr>
+          <w:ilvl w:val="0"/>
+          <w:numId w:val="10"/>
+        </w:numPr>
+        <w:rPr>
+          <w:color w:val="000000" w:themeColor="text1"/>
+          <w:sz w:val="28"/>
+          <w:szCs w:val="28"/>
+        </w:rPr>
+      </w:pPr>
+      <w:r>
+        <w:rPr>
+          <w:color w:val="000000" w:themeColor="text1"/>
+          <w:sz w:val="28"/>
+          <w:szCs w:val="28"/>
+        </w:rPr>
+        <w:t>Refactor helper functions</w:t>
+      </w:r>
+    </w:p>
+    <w:p>
+      <w:pPr>
+        <w:pStyle w:val="ListParagraph"/>
+        <w:numPr>
+          <w:ilvl w:val="0"/>
+          <w:numId w:val="10"/>
+        </w:numPr>
+        <w:rPr>
+          <w:color w:val="000000" w:themeColor="text1"/>
+          <w:sz w:val="28"/>
+          <w:szCs w:val="28"/>
+        </w:rPr>
+      </w:pPr>
+      <w:r>
+        <w:rPr>
+          <w:color w:val="000000" w:themeColor="text1"/>
+          <w:sz w:val="28"/>
+          <w:szCs w:val="28"/>
+        </w:rPr>
+        <w:t>Develop integration test suites</w:t>
+      </w:r>
+    </w:p>
+    <w:p>
+      <w:pPr>
+        <w:pStyle w:val="ListParagraph"/>
+        <w:numPr>
+          <w:ilvl w:val="0"/>
+          <w:numId w:val="10"/>
+        </w:numPr>
+        <w:rPr>
+          <w:color w:val="000000" w:themeColor="text1"/>
+          <w:sz w:val="28"/>
+          <w:szCs w:val="28"/>
+        </w:rPr>
+      </w:pPr>
+      <w:r>
+        <w:rPr>
+          <w:color w:val="000000" w:themeColor="text1"/>
+          <w:sz w:val="28"/>
+          <w:szCs w:val="28"/>
+        </w:rPr>
+        <w:t>Verify business through automated testing</w:t>
+      </w:r>
+    </w:p>
+    <w:p>
+      <w:pPr>
+        <w:pStyle w:val="ListParagraph"/>
+        <w:numPr>
+          <w:ilvl w:val="0"/>
+          <w:numId w:val="10"/>
+        </w:numPr>
+        <w:rPr>
+          <w:color w:val="000000" w:themeColor="text1"/>
+          <w:sz w:val="28"/>
+          <w:szCs w:val="28"/>
+        </w:rPr>
+      </w:pPr>
+      <w:r>
+        <w:rPr>
+          <w:color w:val="000000" w:themeColor="text1"/>
+          <w:sz w:val="28"/>
+          <w:szCs w:val="28"/>
+        </w:rPr>
+        <w:t>Perform regression test</w:t>
+      </w:r>
+    </w:p>
+    <w:p>
+      <w:pPr>
+        <w:rPr>
+          <w:color w:val="000000" w:themeColor="text1"/>
+          <w:sz w:val="28"/>
+          <w:szCs w:val="28"/>
+        </w:rPr>
+      </w:pPr>
+      <w:r>
+        <w:rPr>
+          <w:color w:val="000000" w:themeColor="text1"/>
+          <w:sz w:val="28"/>
+          <w:szCs w:val="28"/>
+        </w:rPr>
+        <w:t>Definition of Done</w:t>
+      </w:r>
+    </w:p>
+    <w:p>
+      <w:pPr>
+        <w:pStyle w:val="ListParagraph"/>
+        <w:numPr>
+          <w:ilvl w:val="0"/>
+          <w:numId w:val="11"/>
+        </w:numPr>
+        <w:rPr>
+          <w:color w:val="000000" w:themeColor="text1"/>
+          <w:sz w:val="28"/>
+          <w:szCs w:val="28"/>
+        </w:rPr>
+      </w:pPr>
+      <w:r>
+        <w:rPr>
+          <w:color w:val="000000" w:themeColor="text1"/>
+          <w:sz w:val="28"/>
+          <w:szCs w:val="28"/>
+        </w:rPr>
+        <w:t>Business rules validated</w:t>
+      </w:r>
+    </w:p>
+    <w:p>
+      <w:pPr>
+        <w:pStyle w:val="ListParagraph"/>
+        <w:numPr>
+          <w:ilvl w:val="0"/>
+          <w:numId w:val="11"/>
+        </w:numPr>
+        <w:rPr>
+          <w:color w:val="000000" w:themeColor="text1"/>
+          <w:sz w:val="28"/>
+          <w:szCs w:val="28"/>
+        </w:rPr>
+      </w:pPr>
+      <w:r>
+        <w:rPr>
+          <w:color w:val="000000" w:themeColor="text1"/>
+          <w:sz w:val="28"/>
+          <w:szCs w:val="28"/>
+        </w:rPr>
+        <w:t>Workflow verified</w:t>
+      </w:r>
+    </w:p>
+    <w:p>
+      <w:pPr>
+        <w:pStyle w:val="ListParagraph"/>
+        <w:numPr>
+          <w:ilvl w:val="0"/>
+          <w:numId w:val="11"/>
+        </w:numPr>
+        <w:rPr>
+          <w:color w:val="000000" w:themeColor="text1"/>
+          <w:sz w:val="28"/>
+          <w:szCs w:val="28"/>
+        </w:rPr>
+      </w:pPr>
+      <w:r>
+        <w:rPr>
+          <w:color w:val="000000" w:themeColor="text1"/>
+          <w:sz w:val="28"/>
+          <w:szCs w:val="28"/>
+        </w:rPr>
+        <w:t>Integration test completed</w:t>
+      </w:r>
+    </w:p>
+    <w:p>
+      <w:pPr>
+        <w:pStyle w:val="ListParagraph"/>
+        <w:numPr>
+          <w:ilvl w:val="0"/>
+          <w:numId w:val="11"/>
+        </w:numPr>
+        <w:rPr>
+          <w:color w:val="000000" w:themeColor="text1"/>
+          <w:sz w:val="28"/>
+          <w:szCs w:val="28"/>
+        </w:rPr>
+      </w:pPr>
+      <w:r>
+        <w:rPr>
+          <w:color w:val="000000" w:themeColor="text1"/>
+          <w:sz w:val="28"/>
+          <w:szCs w:val="28"/>
+        </w:rPr>
+        <w:t>All tests passing</w:t>
+      </w:r>
+    </w:p>
+    <w:p>
+      <w:pPr>
+        <w:pStyle w:val="ListParagraph"/>
+        <w:numPr>
+          <w:ilvl w:val="0"/>
+          <w:numId w:val="11"/>
+        </w:numPr>
+        <w:rPr>
+          <w:color w:val="000000" w:themeColor="text1"/>
+          <w:sz w:val="28"/>
+          <w:szCs w:val="28"/>
+        </w:rPr>
+      </w:pPr>
+      <w:r>
+        <w:rPr>
+          <w:color w:val="000000" w:themeColor="text1"/>
+          <w:sz w:val="28"/>
+          <w:szCs w:val="28"/>
+        </w:rPr>
+        <w:t>Changed committed to Git</w:t>
+      </w:r>
+    </w:p>
+    <w:p>
+      <w:pPr>
+        <w:pStyle w:val="ListParagraph"/>
+        <w:numPr>
+          <w:ilvl w:val="0"/>
+          <w:numId w:val="11"/>
+        </w:numPr>
+        <w:rPr>
+          <w:color w:val="000000" w:themeColor="text1"/>
+          <w:sz w:val="28"/>
+          <w:szCs w:val="28"/>
+        </w:rPr>
+      </w:pPr>
+      <w:r>
+        <w:rPr>
+          <w:color w:val="000000" w:themeColor="text1"/>
+          <w:sz w:val="28"/>
+          <w:szCs w:val="28"/>
+        </w:rPr>
+        <w:t>Backend ready for final documentation</w:t>
+      </w:r>
+    </w:p>
+    <w:p>
+      <w:pPr>
+        <w:rPr>
+          <w:color w:val="000000" w:themeColor="text1"/>
+          <w:sz w:val="28"/>
+          <w:szCs w:val="28"/>
+        </w:rPr>
+      </w:pPr>
+    </w:p>
+    <w:p>
+      <w:pPr>
+        <w:rPr>
+          <w:color w:val="000000" w:themeColor="text1"/>
+          <w:sz w:val="28"/>
+          <w:szCs w:val="28"/>
+        </w:rPr>
+      </w:pPr>
+    </w:p>
+    <w:p>
+      <w:pPr>
+        <w:rPr>
+          <w:color w:val="000000" w:themeColor="text1"/>
+          <w:sz w:val="28"/>
+          <w:szCs w:val="28"/>
+        </w:rPr>
+      </w:pPr>
+      <w:r>
+        <w:rPr>
+          <w:color w:val="000000" w:themeColor="text1"/>
+          <w:sz w:val="28"/>
+          <w:szCs w:val="28"/>
+        </w:rPr>
+        <w:lastRenderedPageBreak/>
+        <w:t>Sprint Review</w:t>
+      </w:r>
+    </w:p>
+    <w:p>
+      <w:pPr>
+        <w:pStyle w:val="ListParagraph"/>
+        <w:numPr>
+          <w:ilvl w:val="0"/>
+          <w:numId w:val="12"/>
+        </w:numPr>
+        <w:rPr>
+          <w:color w:val="000000" w:themeColor="text1"/>
+          <w:sz w:val="28"/>
+          <w:szCs w:val="28"/>
+        </w:rPr>
+      </w:pPr>
+      <w:r>
+        <w:rPr>
+          <w:color w:val="000000" w:themeColor="text1"/>
+          <w:sz w:val="28"/>
+          <w:szCs w:val="28"/>
+        </w:rPr>
+        <w:t>Backend stabilized after workflow refinements</w:t>
+      </w:r>
+    </w:p>
+    <w:p>
+      <w:pPr>
+        <w:pStyle w:val="ListParagraph"/>
+        <w:numPr>
+          <w:ilvl w:val="0"/>
+          <w:numId w:val="12"/>
+        </w:numPr>
+        <w:rPr>
+          <w:color w:val="000000" w:themeColor="text1"/>
+          <w:sz w:val="28"/>
+          <w:szCs w:val="28"/>
+        </w:rPr>
+      </w:pPr>
+      <w:r>
+        <w:rPr>
+          <w:color w:val="000000" w:themeColor="text1"/>
+          <w:sz w:val="28"/>
+          <w:szCs w:val="28"/>
+        </w:rPr>
+        <w:t xml:space="preserve">Integration tests completed </w:t>
+      </w:r>
+    </w:p>
+    <w:p>
+      <w:pPr>
+        <w:pStyle w:val="ListParagraph"/>
+        <w:numPr>
+          <w:ilvl w:val="0"/>
+          <w:numId w:val="12"/>
+        </w:numPr>
+        <w:rPr>
+          <w:color w:val="000000" w:themeColor="text1"/>
+          <w:sz w:val="28"/>
+          <w:szCs w:val="28"/>
+        </w:rPr>
+      </w:pPr>
+      <w:r>
+        <w:rPr>
+          <w:color w:val="000000" w:themeColor="text1"/>
+          <w:sz w:val="28"/>
+          <w:szCs w:val="28"/>
+        </w:rPr>
+        <w:t>Twenty-one automated integration tests passed across eight test suites</w:t>
+      </w:r>
+    </w:p>
+    <w:p>
+      <w:pPr>
+        <w:pStyle w:val="ListParagraph"/>
+        <w:numPr>
+          <w:ilvl w:val="0"/>
+          <w:numId w:val="12"/>
+        </w:numPr>
+        <w:rPr>
+          <w:color w:val="000000" w:themeColor="text1"/>
+          <w:sz w:val="28"/>
+          <w:szCs w:val="28"/>
+        </w:rPr>
+      </w:pPr>
+      <w:r>
+        <w:rPr>
+          <w:color w:val="000000" w:themeColor="text1"/>
+          <w:sz w:val="28"/>
+          <w:szCs w:val="28"/>
+        </w:rPr>
+        <w:t>Core business rules verified</w:t>
+      </w:r>
+    </w:p>
+    <w:p>
+      <w:pPr>
+        <w:rPr>
+          <w:color w:val="000000" w:themeColor="text1"/>
+          <w:sz w:val="28"/>
+          <w:szCs w:val="28"/>
+        </w:rPr>
+      </w:pPr>
+      <w:r>
+        <w:rPr>
+          <w:color w:val="000000" w:themeColor="text1"/>
+          <w:sz w:val="28"/>
+          <w:szCs w:val="28"/>
+        </w:rPr>
+        <w:t>What went well</w:t>
+      </w:r>
+    </w:p>
+    <w:p>
+      <w:pPr>
+        <w:pStyle w:val="ListParagraph"/>
+        <w:numPr>
+          <w:ilvl w:val="0"/>
+          <w:numId w:val="13"/>
+        </w:numPr>
+        <w:rPr>
+          <w:color w:val="000000" w:themeColor="text1"/>
+          <w:sz w:val="28"/>
+          <w:szCs w:val="28"/>
+        </w:rPr>
+      </w:pPr>
+      <w:r>
+        <w:rPr>
+          <w:color w:val="000000" w:themeColor="text1"/>
+          <w:sz w:val="28"/>
+          <w:szCs w:val="28"/>
+        </w:rPr>
+        <w:t>Integration testing increased confidence in system reliability</w:t>
+      </w:r>
+    </w:p>
+    <w:p>
+      <w:pPr>
+        <w:pStyle w:val="ListParagraph"/>
+        <w:numPr>
+          <w:ilvl w:val="0"/>
+          <w:numId w:val="13"/>
+        </w:numPr>
+        <w:rPr>
+          <w:color w:val="000000" w:themeColor="text1"/>
+          <w:sz w:val="28"/>
+          <w:szCs w:val="28"/>
+        </w:rPr>
+      </w:pPr>
+      <w:r>
+        <w:rPr>
+          <w:color w:val="000000" w:themeColor="text1"/>
+          <w:sz w:val="28"/>
+          <w:szCs w:val="28"/>
+        </w:rPr>
+        <w:t>Refactoring improved code readability</w:t>
+      </w:r>
+    </w:p>
+    <w:p>
+      <w:pPr>
+        <w:pStyle w:val="ListParagraph"/>
+        <w:numPr>
+          <w:ilvl w:val="0"/>
+          <w:numId w:val="13"/>
+        </w:numPr>
+        <w:rPr>
+          <w:color w:val="000000" w:themeColor="text1"/>
+          <w:sz w:val="28"/>
+          <w:szCs w:val="28"/>
+        </w:rPr>
+      </w:pPr>
+      <w:r>
+        <w:rPr>
+          <w:color w:val="000000" w:themeColor="text1"/>
+          <w:sz w:val="28"/>
+          <w:szCs w:val="28"/>
+        </w:rPr>
+        <w:t>Workflow validation became more robust after bug fixes</w:t>
+      </w:r>
+    </w:p>
+    <w:p>
+      <w:pPr>
+        <w:rPr>
+          <w:color w:val="000000" w:themeColor="text1"/>
+          <w:sz w:val="28"/>
+          <w:szCs w:val="28"/>
+        </w:rPr>
+      </w:pPr>
+      <w:r>
+        <w:rPr>
+          <w:color w:val="000000" w:themeColor="text1"/>
+          <w:sz w:val="28"/>
+          <w:szCs w:val="28"/>
+        </w:rPr>
+        <w:t>Challenges</w:t>
+      </w:r>
+    </w:p>
+    <w:p>
+      <w:pPr>
+        <w:pStyle w:val="ListParagraph"/>
+        <w:numPr>
+          <w:ilvl w:val="0"/>
+          <w:numId w:val="14"/>
+        </w:numPr>
+        <w:rPr>
+          <w:color w:val="000000" w:themeColor="text1"/>
+          <w:sz w:val="28"/>
+          <w:szCs w:val="28"/>
+        </w:rPr>
+      </w:pPr>
+      <w:r>
+        <w:rPr>
+          <w:color w:val="000000" w:themeColor="text1"/>
+          <w:sz w:val="28"/>
+          <w:szCs w:val="28"/>
+        </w:rPr>
+        <w:t>Debugging complex workflows</w:t>
+      </w:r>
+    </w:p>
+    <w:p>
+      <w:pPr>
+        <w:pStyle w:val="ListParagraph"/>
+        <w:numPr>
+          <w:ilvl w:val="0"/>
+          <w:numId w:val="14"/>
+        </w:numPr>
+        <w:rPr>
+          <w:color w:val="000000" w:themeColor="text1"/>
+          <w:sz w:val="28"/>
+          <w:szCs w:val="28"/>
+        </w:rPr>
+      </w:pPr>
+      <w:r>
+        <w:rPr>
+          <w:color w:val="000000" w:themeColor="text1"/>
+          <w:sz w:val="28"/>
+          <w:szCs w:val="28"/>
+        </w:rPr>
+        <w:t>Handling lifecycle edge cases</w:t>
+      </w:r>
+    </w:p>
+    <w:p>
+      <w:pPr>
+        <w:pStyle w:val="ListParagraph"/>
+        <w:numPr>
+          <w:ilvl w:val="0"/>
+          <w:numId w:val="14"/>
+        </w:numPr>
+        <w:rPr>
+          <w:color w:val="000000" w:themeColor="text1"/>
+          <w:sz w:val="28"/>
+          <w:szCs w:val="28"/>
+        </w:rPr>
+      </w:pPr>
+      <w:r>
+        <w:rPr>
+          <w:color w:val="000000" w:themeColor="text1"/>
+          <w:sz w:val="28"/>
+          <w:szCs w:val="28"/>
+        </w:rPr>
+        <w:t>Ensuring expiry logic remained consistent after refactoring</w:t>
+      </w:r>
+    </w:p>
+    <w:p>
+      <w:pPr>
+        <w:rPr>
+          <w:color w:val="000000" w:themeColor="text1"/>
+          <w:sz w:val="28"/>
+          <w:szCs w:val="28"/>
+          <w:lang w:val="en-IE"/>
+        </w:rPr>
+      </w:pPr>
+      <w:r>
+        <w:rPr>
+          <w:b/>
+          <w:bCs/>
+          <w:color w:val="000000" w:themeColor="text1"/>
+          <w:sz w:val="28"/>
+          <w:szCs w:val="28"/>
+          <w:lang w:val="en-IE"/>
+        </w:rPr>
+        <w:t>Focus for Next Sprint</w:t>
+      </w:r>
+    </w:p>
+    <w:p>
+      <w:pPr>
+        <w:numPr>
+          <w:ilvl w:val="0"/>
+          <w:numId w:val="15"/>
+        </w:numPr>
+        <w:rPr>
+          <w:color w:val="000000" w:themeColor="text1"/>
+          <w:sz w:val="28"/>
+          <w:szCs w:val="28"/>
+          <w:lang w:val="en-IE"/>
+        </w:rPr>
+      </w:pPr>
+      <w:r>
+        <w:rPr>
+          <w:color w:val="000000" w:themeColor="text1"/>
+          <w:sz w:val="28"/>
+          <w:szCs w:val="28"/>
+          <w:lang w:val="en-IE"/>
+        </w:rPr>
+        <w:t xml:space="preserve">Develop the React frontend. </w:t>
+      </w:r>
+    </w:p>
+    <w:p>
+      <w:pPr>
+        <w:numPr>
+          <w:ilvl w:val="0"/>
+          <w:numId w:val="15"/>
+        </w:numPr>
+        <w:rPr>
+          <w:color w:val="000000" w:themeColor="text1"/>
+          <w:sz w:val="28"/>
+          <w:szCs w:val="28"/>
+          <w:lang w:val="en-IE"/>
+        </w:rPr>
+      </w:pPr>
+      <w:r>
+        <w:rPr>
+          <w:color w:val="000000" w:themeColor="text1"/>
+          <w:sz w:val="28"/>
+          <w:szCs w:val="28"/>
+          <w:lang w:val="en-IE"/>
+        </w:rPr>
+        <w:t xml:space="preserve">Integrate frontend with the backend API. </w:t>
+      </w:r>
+    </w:p>
+    <w:p>
+      <w:pPr>
+        <w:numPr>
+          <w:ilvl w:val="0"/>
+          <w:numId w:val="15"/>
+        </w:numPr>
+        <w:rPr>
+          <w:color w:val="000000" w:themeColor="text1"/>
+          <w:sz w:val="28"/>
+          <w:szCs w:val="28"/>
+          <w:lang w:val="en-IE"/>
+        </w:rPr>
+      </w:pPr>
+      <w:r>
+        <w:rPr>
+          <w:color w:val="000000" w:themeColor="text1"/>
+          <w:sz w:val="28"/>
+          <w:szCs w:val="28"/>
+          <w:lang w:val="en-IE"/>
+        </w:rPr>
+        <w:t xml:space="preserve">Build dashboards and data visualisations. </w:t>
+      </w:r>
+    </w:p>
+    <w:p>
+      <w:pPr>
+        <w:numPr>
+          <w:ilvl w:val="0"/>
+          <w:numId w:val="15"/>
+        </w:numPr>
+        <w:rPr>
+          <w:color w:val="000000" w:themeColor="text1"/>
+          <w:sz w:val="28"/>
+          <w:szCs w:val="28"/>
+          <w:lang w:val="en-IE"/>
+        </w:rPr>
+      </w:pPr>
+      <w:r>
+        <w:rPr>
+          <w:color w:val="000000" w:themeColor="text1"/>
+          <w:sz w:val="28"/>
+          <w:szCs w:val="28"/>
+          <w:lang w:val="en-IE"/>
+        </w:rPr>
+        <w:t xml:space="preserve">Perform end-to-end testing. </w:t>
+      </w:r>
+    </w:p>
+    <w:p>
+      <w:pPr>
+        <w:numPr>
+          <w:ilvl w:val="0"/>
+          <w:numId w:val="15"/>
+        </w:numPr>
+        <w:rPr>
+          <w:color w:val="000000" w:themeColor="text1"/>
+          <w:sz w:val="28"/>
+          <w:szCs w:val="28"/>
+          <w:lang w:val="en-IE"/>
+        </w:rPr>
+      </w:pPr>
+      <w:r>
+        <w:rPr>
+          <w:color w:val="000000" w:themeColor="text1"/>
+          <w:sz w:val="28"/>
+          <w:szCs w:val="28"/>
+          <w:lang w:val="en-IE"/>
+        </w:rPr>
+        <w:t>Begin project documentation.</w:t>
+      </w:r>
+    </w:p>
+    <w:p>
+      <w:pPr>
+        <w:rPr>
+          <w:color w:val="000000" w:themeColor="text1"/>
+          <w:sz w:val="28"/>
+          <w:szCs w:val="28"/>
+        </w:rPr>
+      </w:pPr>
+    </w:p>
     <w:sectPr>
       <w:pgSz w:w="12240" w:h="15840"/>
       <w:pgMar w:top="1440" w:right="1800" w:bottom="1440" w:left="1800" w:header="720" w:footer="720" w:gutter="0"/>
@@ -2174,6 +5628,56 @@
     </w:sectPr>
   </w:body>
 </w:document>
+</file>
+
+<file path=word/endnotes.xml><?xml version="1.0" encoding="utf-8"?>
+<w:endnotes xmlns:wpc="http://schemas.microsoft.com/office/word/2010/wordprocessingCanvas" xmlns:cx="http://schemas.microsoft.com/office/drawing/2014/chartex" xmlns:cx1="http://schemas.microsoft.com/office/drawing/2015/9/8/chartex" xmlns:cx2="http://schemas.microsoft.com/office/drawing/2015/10/21/chartex" xmlns:cx3="http://schemas.microsoft.com/office/drawing/2016/5/9/chartex" xmlns:cx4="http://schemas.microsoft.com/office/drawing/2016/5/10/chartex" xmlns:cx5="http://schemas.microsoft.com/office/drawing/2016/5/11/chartex" xmlns:cx6="http://schemas.microsoft.com/office/drawing/2016/5/12/chartex" xmlns:cx7="http://schemas.microsoft.com/office/drawing/2016/5/13/chartex" xmlns:cx8="http://schemas.microsoft.com/office/drawing/2016/5/14/chartex" xmlns:mc="http://schemas.openxmlformats.org/markup-compatibility/2006" xmlns:aink="http://schemas.microsoft.com/office/drawing/2016/ink" xmlns:am3d="http://schemas.microsoft.com/office/drawing/2017/model3d" xmlns:o="urn:schemas-microsoft-com:office:office" xmlns:oel="http://schemas.microsoft.com/office/2019/extlst" xmlns:r="http://schemas.openxmlformats.org/officeDocument/2006/relationships" xmlns:m="http://schemas.openxmlformats.org/officeDocument/2006/math" xmlns:v="urn:schemas-microsoft-com:vml" xmlns:wp14="http://schemas.microsoft.com/office/word/2010/wordprocessingDrawing" xmlns:wp="http://schemas.openxmlformats.org/drawingml/2006/wordprocessingDrawing" xmlns:w10="urn:schemas-microsoft-com:office:word" xmlns:w="http://schemas.openxmlformats.org/wordprocessingml/2006/main" xmlns:w14="http://schemas.microsoft.com/office/word/2010/wordml" xmlns:w15="http://schemas.microsoft.com/office/word/2012/wordml" xmlns:w16cex="http://schemas.microsoft.com/office/word/2018/wordml/cex" xmlns:w16cid="http://schemas.microsoft.com/office/word/2016/wordml/cid" xmlns:w16="http://schemas.microsoft.com/office/word/2018/wordml" xmlns:w16du="http://schemas.microsoft.com/office/word/2023/wordml/word16du" xmlns:w16sdtdh="http://schemas.microsoft.com/office/word/2020/wordml/sdtdatahash" xmlns:w16sdtfl="http://schemas.microsoft.com/office/word/2024/wordml/sdtformatlock" xmlns:w16se="http://schemas.microsoft.com/office/word/2015/wordml/symex" xmlns:wpg="http://schemas.microsoft.com/office/word/2010/wordprocessingGroup" xmlns:wpi="http://schemas.microsoft.com/office/word/2010/wordprocessingInk" xmlns:wne="http://schemas.microsoft.com/office/word/2006/wordml" xmlns:wps="http://schemas.microsoft.com/office/word/2010/wordprocessingShape" mc:Ignorable="w14 w15 w16se w16cid w16 w16cex w16sdtdh w16sdtfl w16du wp14">
+  <w:endnote w:type="separator" w:id="-1">
+    <w:p>
+      <w:pPr>
+        <w:spacing w:after="0" w:line="240" w:lineRule="auto"/>
+      </w:pPr>
+      <w:r>
+        <w:separator/>
+      </w:r>
+    </w:p>
+  </w:endnote>
+  <w:endnote w:type="continuationSeparator" w:id="0">
+    <w:p>
+      <w:pPr>
+        <w:spacing w:after="0" w:line="240" w:lineRule="auto"/>
+      </w:pPr>
+      <w:r>
+        <w:continuationSeparator/>
+      </w:r>
+    </w:p>
+  </w:endnote>
+</w:endnotes>
+</file>
+
+<file path=word/footnotes.xml><?xml version="1.0" encoding="utf-8"?>
+<w:footnotes xmlns:wpc="http://schemas.microsoft.com/office/word/2010/wordprocessingCanvas" xmlns:cx="http://schemas.microsoft.com/office/drawing/2014/chartex" xmlns:cx1="http://schemas.microsoft.com/office/drawing/2015/9/8/chartex" xmlns:cx2="http://schemas.microsoft.com/office/drawing/2015/10/21/chartex" xmlns:cx3="http://schemas.microsoft.com/office/drawing/2016/5/9/chartex" xmlns:cx4="http://schemas.microsoft.com/office/drawing/2016/5/10/chartex" xmlns:cx5="http://schemas.microsoft.com/office/drawing/2016/5/11/chartex" xmlns:cx6="http://schemas.microsoft.com/office/drawing/2016/5/12/chartex" xmlns:cx7="http://schemas.microsoft.com/office/drawing/2016/5/13/chartex" xmlns:cx8="http://schemas.microsoft.com/office/drawing/2016/5/14/chartex" xmlns:mc="http://schemas.openxmlformats.org/markup-compatibility/2006" xmlns:aink="http://schemas.microsoft.com/office/drawing/2016/ink" xmlns:am3d="http://schemas.microsoft.com/office/drawing/2017/model3d" xmlns:o="urn:schemas-microsoft-com:office:office" xmlns:oel="http://schemas.microsoft.com/office/2019/extlst" xmlns:r="http://schemas.openxmlformats.org/officeDocument/2006/relationships" xmlns:m="http://schemas.openxmlformats.org/officeDocument/2006/math" xmlns:v="urn:schemas-microsoft-com:vml" xmlns:wp14="http://schemas.microsoft.com/office/word/2010/wordprocessingDrawing" xmlns:wp="http://schemas.openxmlformats.org/drawingml/2006/wordprocessingDrawing" xmlns:w10="urn:schemas-microsoft-com:office:word" xmlns:w="http://schemas.openxmlformats.org/wordprocessingml/2006/main" xmlns:w14="http://schemas.microsoft.com/office/word/2010/wordml" xmlns:w15="http://schemas.microsoft.com/office/word/2012/wordml" xmlns:w16cex="http://schemas.microsoft.com/office/word/2018/wordml/cex" xmlns:w16cid="http://schemas.microsoft.com/office/word/2016/wordml/cid" xmlns:w16="http://schemas.microsoft.com/office/word/2018/wordml" xmlns:w16du="http://schemas.microsoft.com/office/word/2023/wordml/word16du" xmlns:w16sdtdh="http://schemas.microsoft.com/office/word/2020/wordml/sdtdatahash" xmlns:w16sdtfl="http://schemas.microsoft.com/office/word/2024/wordml/sdtformatlock" xmlns:w16se="http://schemas.microsoft.com/office/word/2015/wordml/symex" xmlns:wpg="http://schemas.microsoft.com/office/word/2010/wordprocessingGroup" xmlns:wpi="http://schemas.microsoft.com/office/word/2010/wordprocessingInk" xmlns:wne="http://schemas.microsoft.com/office/word/2006/wordml" xmlns:wps="http://schemas.microsoft.com/office/word/2010/wordprocessingShape" mc:Ignorable="w14 w15 w16se w16cid w16 w16cex w16sdtdh w16sdtfl w16du wp14">
+  <w:footnote w:type="separator" w:id="-1">
+    <w:p>
+      <w:pPr>
+        <w:spacing w:after="0" w:line="240" w:lineRule="auto"/>
+      </w:pPr>
+      <w:r>
+        <w:separator/>
+      </w:r>
+    </w:p>
+  </w:footnote>
+  <w:footnote w:type="continuationSeparator" w:id="0">
+    <w:p>
+      <w:pPr>
+        <w:spacing w:after="0" w:line="240" w:lineRule="auto"/>
+      </w:pPr>
+      <w:r>
+        <w:continuationSeparator/>
+      </w:r>
+    </w:p>
+  </w:footnote>
+</w:footnotes>
 </file>
 
 <file path=word/numbering.xml><?xml version="1.0" encoding="utf-8"?>
@@ -2331,7 +5835,7 @@
   <w:abstractNum w:abstractNumId="8" w15:restartNumberingAfterBreak="0">
     <w:nsid w:val="FFFFFF89"/>
     <w:multiLevelType w:val="singleLevel"/>
-    <w:tmpl w:val="29761A62"/>
+    <w:tmpl w:val="09F2E53C"/>
     <w:lvl w:ilvl="0">
       <w:start w:val="1"/>
       <w:numFmt w:val="bullet"/>
@@ -2346,6 +5850,720 @@
       </w:pPr>
       <w:rPr>
         <w:rFonts w:ascii="Symbol" w:hAnsi="Symbol" w:hint="default"/>
+      </w:rPr>
+    </w:lvl>
+  </w:abstractNum>
+  <w:abstractNum w:abstractNumId="9" w15:restartNumberingAfterBreak="0">
+    <w:nsid w:val="0A464F9C"/>
+    <w:multiLevelType w:val="hybridMultilevel"/>
+    <w:tmpl w:val="9AC639A4"/>
+    <w:lvl w:ilvl="0" w:tplc="18090001">
+      <w:start w:val="1"/>
+      <w:numFmt w:val="bullet"/>
+      <w:lvlText w:val=""/>
+      <w:lvlJc w:val="left"/>
+      <w:pPr>
+        <w:ind w:left="720" w:hanging="360"/>
+      </w:pPr>
+      <w:rPr>
+        <w:rFonts w:ascii="Symbol" w:hAnsi="Symbol" w:hint="default"/>
+      </w:rPr>
+    </w:lvl>
+    <w:lvl w:ilvl="1" w:tplc="18090003" w:tentative="1">
+      <w:start w:val="1"/>
+      <w:numFmt w:val="bullet"/>
+      <w:lvlText w:val="o"/>
+      <w:lvlJc w:val="left"/>
+      <w:pPr>
+        <w:ind w:left="1440" w:hanging="360"/>
+      </w:pPr>
+      <w:rPr>
+        <w:rFonts w:ascii="Courier New" w:hAnsi="Courier New" w:cs="Courier New" w:hint="default"/>
+      </w:rPr>
+    </w:lvl>
+    <w:lvl w:ilvl="2" w:tplc="18090005" w:tentative="1">
+      <w:start w:val="1"/>
+      <w:numFmt w:val="bullet"/>
+      <w:lvlText w:val=""/>
+      <w:lvlJc w:val="left"/>
+      <w:pPr>
+        <w:ind w:left="2160" w:hanging="360"/>
+      </w:pPr>
+      <w:rPr>
+        <w:rFonts w:ascii="Wingdings" w:hAnsi="Wingdings" w:hint="default"/>
+      </w:rPr>
+    </w:lvl>
+    <w:lvl w:ilvl="3" w:tplc="18090001" w:tentative="1">
+      <w:start w:val="1"/>
+      <w:numFmt w:val="bullet"/>
+      <w:lvlText w:val=""/>
+      <w:lvlJc w:val="left"/>
+      <w:pPr>
+        <w:ind w:left="2880" w:hanging="360"/>
+      </w:pPr>
+      <w:rPr>
+        <w:rFonts w:ascii="Symbol" w:hAnsi="Symbol" w:hint="default"/>
+      </w:rPr>
+    </w:lvl>
+    <w:lvl w:ilvl="4" w:tplc="18090003" w:tentative="1">
+      <w:start w:val="1"/>
+      <w:numFmt w:val="bullet"/>
+      <w:lvlText w:val="o"/>
+      <w:lvlJc w:val="left"/>
+      <w:pPr>
+        <w:ind w:left="3600" w:hanging="360"/>
+      </w:pPr>
+      <w:rPr>
+        <w:rFonts w:ascii="Courier New" w:hAnsi="Courier New" w:cs="Courier New" w:hint="default"/>
+      </w:rPr>
+    </w:lvl>
+    <w:lvl w:ilvl="5" w:tplc="18090005" w:tentative="1">
+      <w:start w:val="1"/>
+      <w:numFmt w:val="bullet"/>
+      <w:lvlText w:val=""/>
+      <w:lvlJc w:val="left"/>
+      <w:pPr>
+        <w:ind w:left="4320" w:hanging="360"/>
+      </w:pPr>
+      <w:rPr>
+        <w:rFonts w:ascii="Wingdings" w:hAnsi="Wingdings" w:hint="default"/>
+      </w:rPr>
+    </w:lvl>
+    <w:lvl w:ilvl="6" w:tplc="18090001" w:tentative="1">
+      <w:start w:val="1"/>
+      <w:numFmt w:val="bullet"/>
+      <w:lvlText w:val=""/>
+      <w:lvlJc w:val="left"/>
+      <w:pPr>
+        <w:ind w:left="5040" w:hanging="360"/>
+      </w:pPr>
+      <w:rPr>
+        <w:rFonts w:ascii="Symbol" w:hAnsi="Symbol" w:hint="default"/>
+      </w:rPr>
+    </w:lvl>
+    <w:lvl w:ilvl="7" w:tplc="18090003" w:tentative="1">
+      <w:start w:val="1"/>
+      <w:numFmt w:val="bullet"/>
+      <w:lvlText w:val="o"/>
+      <w:lvlJc w:val="left"/>
+      <w:pPr>
+        <w:ind w:left="5760" w:hanging="360"/>
+      </w:pPr>
+      <w:rPr>
+        <w:rFonts w:ascii="Courier New" w:hAnsi="Courier New" w:cs="Courier New" w:hint="default"/>
+      </w:rPr>
+    </w:lvl>
+    <w:lvl w:ilvl="8" w:tplc="18090005" w:tentative="1">
+      <w:start w:val="1"/>
+      <w:numFmt w:val="bullet"/>
+      <w:lvlText w:val=""/>
+      <w:lvlJc w:val="left"/>
+      <w:pPr>
+        <w:ind w:left="6480" w:hanging="360"/>
+      </w:pPr>
+      <w:rPr>
+        <w:rFonts w:ascii="Wingdings" w:hAnsi="Wingdings" w:hint="default"/>
+      </w:rPr>
+    </w:lvl>
+  </w:abstractNum>
+  <w:abstractNum w:abstractNumId="10" w15:restartNumberingAfterBreak="0">
+    <w:nsid w:val="122839BB"/>
+    <w:multiLevelType w:val="multilevel"/>
+    <w:tmpl w:val="FC20DD98"/>
+    <w:lvl w:ilvl="0">
+      <w:start w:val="1"/>
+      <w:numFmt w:val="bullet"/>
+      <w:lvlText w:val=""/>
+      <w:lvlJc w:val="left"/>
+      <w:pPr>
+        <w:tabs>
+          <w:tab w:val="num" w:pos="720"/>
+        </w:tabs>
+        <w:ind w:left="720" w:hanging="360"/>
+      </w:pPr>
+      <w:rPr>
+        <w:rFonts w:ascii="Symbol" w:hAnsi="Symbol" w:hint="default"/>
+        <w:sz w:val="20"/>
+      </w:rPr>
+    </w:lvl>
+    <w:lvl w:ilvl="1" w:tentative="1">
+      <w:start w:val="1"/>
+      <w:numFmt w:val="bullet"/>
+      <w:lvlText w:val="o"/>
+      <w:lvlJc w:val="left"/>
+      <w:pPr>
+        <w:tabs>
+          <w:tab w:val="num" w:pos="1440"/>
+        </w:tabs>
+        <w:ind w:left="1440" w:hanging="360"/>
+      </w:pPr>
+      <w:rPr>
+        <w:rFonts w:ascii="Courier New" w:hAnsi="Courier New" w:hint="default"/>
+        <w:sz w:val="20"/>
+      </w:rPr>
+    </w:lvl>
+    <w:lvl w:ilvl="2" w:tentative="1">
+      <w:start w:val="1"/>
+      <w:numFmt w:val="bullet"/>
+      <w:lvlText w:val=""/>
+      <w:lvlJc w:val="left"/>
+      <w:pPr>
+        <w:tabs>
+          <w:tab w:val="num" w:pos="2160"/>
+        </w:tabs>
+        <w:ind w:left="2160" w:hanging="360"/>
+      </w:pPr>
+      <w:rPr>
+        <w:rFonts w:ascii="Wingdings" w:hAnsi="Wingdings" w:hint="default"/>
+        <w:sz w:val="20"/>
+      </w:rPr>
+    </w:lvl>
+    <w:lvl w:ilvl="3" w:tentative="1">
+      <w:start w:val="1"/>
+      <w:numFmt w:val="bullet"/>
+      <w:lvlText w:val=""/>
+      <w:lvlJc w:val="left"/>
+      <w:pPr>
+        <w:tabs>
+          <w:tab w:val="num" w:pos="2880"/>
+        </w:tabs>
+        <w:ind w:left="2880" w:hanging="360"/>
+      </w:pPr>
+      <w:rPr>
+        <w:rFonts w:ascii="Wingdings" w:hAnsi="Wingdings" w:hint="default"/>
+        <w:sz w:val="20"/>
+      </w:rPr>
+    </w:lvl>
+    <w:lvl w:ilvl="4" w:tentative="1">
+      <w:start w:val="1"/>
+      <w:numFmt w:val="bullet"/>
+      <w:lvlText w:val=""/>
+      <w:lvlJc w:val="left"/>
+      <w:pPr>
+        <w:tabs>
+          <w:tab w:val="num" w:pos="3600"/>
+        </w:tabs>
+        <w:ind w:left="3600" w:hanging="360"/>
+      </w:pPr>
+      <w:rPr>
+        <w:rFonts w:ascii="Wingdings" w:hAnsi="Wingdings" w:hint="default"/>
+        <w:sz w:val="20"/>
+      </w:rPr>
+    </w:lvl>
+    <w:lvl w:ilvl="5" w:tentative="1">
+      <w:start w:val="1"/>
+      <w:numFmt w:val="bullet"/>
+      <w:lvlText w:val=""/>
+      <w:lvlJc w:val="left"/>
+      <w:pPr>
+        <w:tabs>
+          <w:tab w:val="num" w:pos="4320"/>
+        </w:tabs>
+        <w:ind w:left="4320" w:hanging="360"/>
+      </w:pPr>
+      <w:rPr>
+        <w:rFonts w:ascii="Wingdings" w:hAnsi="Wingdings" w:hint="default"/>
+        <w:sz w:val="20"/>
+      </w:rPr>
+    </w:lvl>
+    <w:lvl w:ilvl="6" w:tentative="1">
+      <w:start w:val="1"/>
+      <w:numFmt w:val="bullet"/>
+      <w:lvlText w:val=""/>
+      <w:lvlJc w:val="left"/>
+      <w:pPr>
+        <w:tabs>
+          <w:tab w:val="num" w:pos="5040"/>
+        </w:tabs>
+        <w:ind w:left="5040" w:hanging="360"/>
+      </w:pPr>
+      <w:rPr>
+        <w:rFonts w:ascii="Wingdings" w:hAnsi="Wingdings" w:hint="default"/>
+        <w:sz w:val="20"/>
+      </w:rPr>
+    </w:lvl>
+    <w:lvl w:ilvl="7" w:tentative="1">
+      <w:start w:val="1"/>
+      <w:numFmt w:val="bullet"/>
+      <w:lvlText w:val=""/>
+      <w:lvlJc w:val="left"/>
+      <w:pPr>
+        <w:tabs>
+          <w:tab w:val="num" w:pos="5760"/>
+        </w:tabs>
+        <w:ind w:left="5760" w:hanging="360"/>
+      </w:pPr>
+      <w:rPr>
+        <w:rFonts w:ascii="Wingdings" w:hAnsi="Wingdings" w:hint="default"/>
+        <w:sz w:val="20"/>
+      </w:rPr>
+    </w:lvl>
+    <w:lvl w:ilvl="8" w:tentative="1">
+      <w:start w:val="1"/>
+      <w:numFmt w:val="bullet"/>
+      <w:lvlText w:val=""/>
+      <w:lvlJc w:val="left"/>
+      <w:pPr>
+        <w:tabs>
+          <w:tab w:val="num" w:pos="6480"/>
+        </w:tabs>
+        <w:ind w:left="6480" w:hanging="360"/>
+      </w:pPr>
+      <w:rPr>
+        <w:rFonts w:ascii="Wingdings" w:hAnsi="Wingdings" w:hint="default"/>
+        <w:sz w:val="20"/>
+      </w:rPr>
+    </w:lvl>
+  </w:abstractNum>
+  <w:abstractNum w:abstractNumId="11" w15:restartNumberingAfterBreak="0">
+    <w:nsid w:val="27D835FC"/>
+    <w:multiLevelType w:val="hybridMultilevel"/>
+    <w:tmpl w:val="7B4C75A4"/>
+    <w:lvl w:ilvl="0" w:tplc="18090001">
+      <w:start w:val="1"/>
+      <w:numFmt w:val="bullet"/>
+      <w:lvlText w:val=""/>
+      <w:lvlJc w:val="left"/>
+      <w:pPr>
+        <w:ind w:left="720" w:hanging="360"/>
+      </w:pPr>
+      <w:rPr>
+        <w:rFonts w:ascii="Symbol" w:hAnsi="Symbol" w:hint="default"/>
+      </w:rPr>
+    </w:lvl>
+    <w:lvl w:ilvl="1" w:tplc="18090003" w:tentative="1">
+      <w:start w:val="1"/>
+      <w:numFmt w:val="bullet"/>
+      <w:lvlText w:val="o"/>
+      <w:lvlJc w:val="left"/>
+      <w:pPr>
+        <w:ind w:left="1440" w:hanging="360"/>
+      </w:pPr>
+      <w:rPr>
+        <w:rFonts w:ascii="Courier New" w:hAnsi="Courier New" w:cs="Courier New" w:hint="default"/>
+      </w:rPr>
+    </w:lvl>
+    <w:lvl w:ilvl="2" w:tplc="18090005" w:tentative="1">
+      <w:start w:val="1"/>
+      <w:numFmt w:val="bullet"/>
+      <w:lvlText w:val=""/>
+      <w:lvlJc w:val="left"/>
+      <w:pPr>
+        <w:ind w:left="2160" w:hanging="360"/>
+      </w:pPr>
+      <w:rPr>
+        <w:rFonts w:ascii="Wingdings" w:hAnsi="Wingdings" w:hint="default"/>
+      </w:rPr>
+    </w:lvl>
+    <w:lvl w:ilvl="3" w:tplc="18090001" w:tentative="1">
+      <w:start w:val="1"/>
+      <w:numFmt w:val="bullet"/>
+      <w:lvlText w:val=""/>
+      <w:lvlJc w:val="left"/>
+      <w:pPr>
+        <w:ind w:left="2880" w:hanging="360"/>
+      </w:pPr>
+      <w:rPr>
+        <w:rFonts w:ascii="Symbol" w:hAnsi="Symbol" w:hint="default"/>
+      </w:rPr>
+    </w:lvl>
+    <w:lvl w:ilvl="4" w:tplc="18090003" w:tentative="1">
+      <w:start w:val="1"/>
+      <w:numFmt w:val="bullet"/>
+      <w:lvlText w:val="o"/>
+      <w:lvlJc w:val="left"/>
+      <w:pPr>
+        <w:ind w:left="3600" w:hanging="360"/>
+      </w:pPr>
+      <w:rPr>
+        <w:rFonts w:ascii="Courier New" w:hAnsi="Courier New" w:cs="Courier New" w:hint="default"/>
+      </w:rPr>
+    </w:lvl>
+    <w:lvl w:ilvl="5" w:tplc="18090005" w:tentative="1">
+      <w:start w:val="1"/>
+      <w:numFmt w:val="bullet"/>
+      <w:lvlText w:val=""/>
+      <w:lvlJc w:val="left"/>
+      <w:pPr>
+        <w:ind w:left="4320" w:hanging="360"/>
+      </w:pPr>
+      <w:rPr>
+        <w:rFonts w:ascii="Wingdings" w:hAnsi="Wingdings" w:hint="default"/>
+      </w:rPr>
+    </w:lvl>
+    <w:lvl w:ilvl="6" w:tplc="18090001" w:tentative="1">
+      <w:start w:val="1"/>
+      <w:numFmt w:val="bullet"/>
+      <w:lvlText w:val=""/>
+      <w:lvlJc w:val="left"/>
+      <w:pPr>
+        <w:ind w:left="5040" w:hanging="360"/>
+      </w:pPr>
+      <w:rPr>
+        <w:rFonts w:ascii="Symbol" w:hAnsi="Symbol" w:hint="default"/>
+      </w:rPr>
+    </w:lvl>
+    <w:lvl w:ilvl="7" w:tplc="18090003" w:tentative="1">
+      <w:start w:val="1"/>
+      <w:numFmt w:val="bullet"/>
+      <w:lvlText w:val="o"/>
+      <w:lvlJc w:val="left"/>
+      <w:pPr>
+        <w:ind w:left="5760" w:hanging="360"/>
+      </w:pPr>
+      <w:rPr>
+        <w:rFonts w:ascii="Courier New" w:hAnsi="Courier New" w:cs="Courier New" w:hint="default"/>
+      </w:rPr>
+    </w:lvl>
+    <w:lvl w:ilvl="8" w:tplc="18090005" w:tentative="1">
+      <w:start w:val="1"/>
+      <w:numFmt w:val="bullet"/>
+      <w:lvlText w:val=""/>
+      <w:lvlJc w:val="left"/>
+      <w:pPr>
+        <w:ind w:left="6480" w:hanging="360"/>
+      </w:pPr>
+      <w:rPr>
+        <w:rFonts w:ascii="Wingdings" w:hAnsi="Wingdings" w:hint="default"/>
+      </w:rPr>
+    </w:lvl>
+  </w:abstractNum>
+  <w:abstractNum w:abstractNumId="12" w15:restartNumberingAfterBreak="0">
+    <w:nsid w:val="3E5E67E7"/>
+    <w:multiLevelType w:val="hybridMultilevel"/>
+    <w:tmpl w:val="9BFA4006"/>
+    <w:lvl w:ilvl="0" w:tplc="18090001">
+      <w:start w:val="1"/>
+      <w:numFmt w:val="bullet"/>
+      <w:lvlText w:val=""/>
+      <w:lvlJc w:val="left"/>
+      <w:pPr>
+        <w:ind w:left="720" w:hanging="360"/>
+      </w:pPr>
+      <w:rPr>
+        <w:rFonts w:ascii="Symbol" w:hAnsi="Symbol" w:hint="default"/>
+      </w:rPr>
+    </w:lvl>
+    <w:lvl w:ilvl="1" w:tplc="18090003" w:tentative="1">
+      <w:start w:val="1"/>
+      <w:numFmt w:val="bullet"/>
+      <w:lvlText w:val="o"/>
+      <w:lvlJc w:val="left"/>
+      <w:pPr>
+        <w:ind w:left="1440" w:hanging="360"/>
+      </w:pPr>
+      <w:rPr>
+        <w:rFonts w:ascii="Courier New" w:hAnsi="Courier New" w:cs="Courier New" w:hint="default"/>
+      </w:rPr>
+    </w:lvl>
+    <w:lvl w:ilvl="2" w:tplc="18090005" w:tentative="1">
+      <w:start w:val="1"/>
+      <w:numFmt w:val="bullet"/>
+      <w:lvlText w:val=""/>
+      <w:lvlJc w:val="left"/>
+      <w:pPr>
+        <w:ind w:left="2160" w:hanging="360"/>
+      </w:pPr>
+      <w:rPr>
+        <w:rFonts w:ascii="Wingdings" w:hAnsi="Wingdings" w:hint="default"/>
+      </w:rPr>
+    </w:lvl>
+    <w:lvl w:ilvl="3" w:tplc="18090001" w:tentative="1">
+      <w:start w:val="1"/>
+      <w:numFmt w:val="bullet"/>
+      <w:lvlText w:val=""/>
+      <w:lvlJc w:val="left"/>
+      <w:pPr>
+        <w:ind w:left="2880" w:hanging="360"/>
+      </w:pPr>
+      <w:rPr>
+        <w:rFonts w:ascii="Symbol" w:hAnsi="Symbol" w:hint="default"/>
+      </w:rPr>
+    </w:lvl>
+    <w:lvl w:ilvl="4" w:tplc="18090003" w:tentative="1">
+      <w:start w:val="1"/>
+      <w:numFmt w:val="bullet"/>
+      <w:lvlText w:val="o"/>
+      <w:lvlJc w:val="left"/>
+      <w:pPr>
+        <w:ind w:left="3600" w:hanging="360"/>
+      </w:pPr>
+      <w:rPr>
+        <w:rFonts w:ascii="Courier New" w:hAnsi="Courier New" w:cs="Courier New" w:hint="default"/>
+      </w:rPr>
+    </w:lvl>
+    <w:lvl w:ilvl="5" w:tplc="18090005" w:tentative="1">
+      <w:start w:val="1"/>
+      <w:numFmt w:val="bullet"/>
+      <w:lvlText w:val=""/>
+      <w:lvlJc w:val="left"/>
+      <w:pPr>
+        <w:ind w:left="4320" w:hanging="360"/>
+      </w:pPr>
+      <w:rPr>
+        <w:rFonts w:ascii="Wingdings" w:hAnsi="Wingdings" w:hint="default"/>
+      </w:rPr>
+    </w:lvl>
+    <w:lvl w:ilvl="6" w:tplc="18090001" w:tentative="1">
+      <w:start w:val="1"/>
+      <w:numFmt w:val="bullet"/>
+      <w:lvlText w:val=""/>
+      <w:lvlJc w:val="left"/>
+      <w:pPr>
+        <w:ind w:left="5040" w:hanging="360"/>
+      </w:pPr>
+      <w:rPr>
+        <w:rFonts w:ascii="Symbol" w:hAnsi="Symbol" w:hint="default"/>
+      </w:rPr>
+    </w:lvl>
+    <w:lvl w:ilvl="7" w:tplc="18090003" w:tentative="1">
+      <w:start w:val="1"/>
+      <w:numFmt w:val="bullet"/>
+      <w:lvlText w:val="o"/>
+      <w:lvlJc w:val="left"/>
+      <w:pPr>
+        <w:ind w:left="5760" w:hanging="360"/>
+      </w:pPr>
+      <w:rPr>
+        <w:rFonts w:ascii="Courier New" w:hAnsi="Courier New" w:cs="Courier New" w:hint="default"/>
+      </w:rPr>
+    </w:lvl>
+    <w:lvl w:ilvl="8" w:tplc="18090005" w:tentative="1">
+      <w:start w:val="1"/>
+      <w:numFmt w:val="bullet"/>
+      <w:lvlText w:val=""/>
+      <w:lvlJc w:val="left"/>
+      <w:pPr>
+        <w:ind w:left="6480" w:hanging="360"/>
+      </w:pPr>
+      <w:rPr>
+        <w:rFonts w:ascii="Wingdings" w:hAnsi="Wingdings" w:hint="default"/>
+      </w:rPr>
+    </w:lvl>
+  </w:abstractNum>
+  <w:abstractNum w:abstractNumId="13" w15:restartNumberingAfterBreak="0">
+    <w:nsid w:val="45EF335E"/>
+    <w:multiLevelType w:val="hybridMultilevel"/>
+    <w:tmpl w:val="B15A6A94"/>
+    <w:lvl w:ilvl="0" w:tplc="18090001">
+      <w:start w:val="1"/>
+      <w:numFmt w:val="bullet"/>
+      <w:lvlText w:val=""/>
+      <w:lvlJc w:val="left"/>
+      <w:pPr>
+        <w:ind w:left="720" w:hanging="360"/>
+      </w:pPr>
+      <w:rPr>
+        <w:rFonts w:ascii="Symbol" w:hAnsi="Symbol" w:hint="default"/>
+      </w:rPr>
+    </w:lvl>
+    <w:lvl w:ilvl="1" w:tplc="18090003" w:tentative="1">
+      <w:start w:val="1"/>
+      <w:numFmt w:val="bullet"/>
+      <w:lvlText w:val="o"/>
+      <w:lvlJc w:val="left"/>
+      <w:pPr>
+        <w:ind w:left="1440" w:hanging="360"/>
+      </w:pPr>
+      <w:rPr>
+        <w:rFonts w:ascii="Courier New" w:hAnsi="Courier New" w:cs="Courier New" w:hint="default"/>
+      </w:rPr>
+    </w:lvl>
+    <w:lvl w:ilvl="2" w:tplc="18090005" w:tentative="1">
+      <w:start w:val="1"/>
+      <w:numFmt w:val="bullet"/>
+      <w:lvlText w:val=""/>
+      <w:lvlJc w:val="left"/>
+      <w:pPr>
+        <w:ind w:left="2160" w:hanging="360"/>
+      </w:pPr>
+      <w:rPr>
+        <w:rFonts w:ascii="Wingdings" w:hAnsi="Wingdings" w:hint="default"/>
+      </w:rPr>
+    </w:lvl>
+    <w:lvl w:ilvl="3" w:tplc="18090001" w:tentative="1">
+      <w:start w:val="1"/>
+      <w:numFmt w:val="bullet"/>
+      <w:lvlText w:val=""/>
+      <w:lvlJc w:val="left"/>
+      <w:pPr>
+        <w:ind w:left="2880" w:hanging="360"/>
+      </w:pPr>
+      <w:rPr>
+        <w:rFonts w:ascii="Symbol" w:hAnsi="Symbol" w:hint="default"/>
+      </w:rPr>
+    </w:lvl>
+    <w:lvl w:ilvl="4" w:tplc="18090003" w:tentative="1">
+      <w:start w:val="1"/>
+      <w:numFmt w:val="bullet"/>
+      <w:lvlText w:val="o"/>
+      <w:lvlJc w:val="left"/>
+      <w:pPr>
+        <w:ind w:left="3600" w:hanging="360"/>
+      </w:pPr>
+      <w:rPr>
+        <w:rFonts w:ascii="Courier New" w:hAnsi="Courier New" w:cs="Courier New" w:hint="default"/>
+      </w:rPr>
+    </w:lvl>
+    <w:lvl w:ilvl="5" w:tplc="18090005" w:tentative="1">
+      <w:start w:val="1"/>
+      <w:numFmt w:val="bullet"/>
+      <w:lvlText w:val=""/>
+      <w:lvlJc w:val="left"/>
+      <w:pPr>
+        <w:ind w:left="4320" w:hanging="360"/>
+      </w:pPr>
+      <w:rPr>
+        <w:rFonts w:ascii="Wingdings" w:hAnsi="Wingdings" w:hint="default"/>
+      </w:rPr>
+    </w:lvl>
+    <w:lvl w:ilvl="6" w:tplc="18090001" w:tentative="1">
+      <w:start w:val="1"/>
+      <w:numFmt w:val="bullet"/>
+      <w:lvlText w:val=""/>
+      <w:lvlJc w:val="left"/>
+      <w:pPr>
+        <w:ind w:left="5040" w:hanging="360"/>
+      </w:pPr>
+      <w:rPr>
+        <w:rFonts w:ascii="Symbol" w:hAnsi="Symbol" w:hint="default"/>
+      </w:rPr>
+    </w:lvl>
+    <w:lvl w:ilvl="7" w:tplc="18090003" w:tentative="1">
+      <w:start w:val="1"/>
+      <w:numFmt w:val="bullet"/>
+      <w:lvlText w:val="o"/>
+      <w:lvlJc w:val="left"/>
+      <w:pPr>
+        <w:ind w:left="5760" w:hanging="360"/>
+      </w:pPr>
+      <w:rPr>
+        <w:rFonts w:ascii="Courier New" w:hAnsi="Courier New" w:cs="Courier New" w:hint="default"/>
+      </w:rPr>
+    </w:lvl>
+    <w:lvl w:ilvl="8" w:tplc="18090005" w:tentative="1">
+      <w:start w:val="1"/>
+      <w:numFmt w:val="bullet"/>
+      <w:lvlText w:val=""/>
+      <w:lvlJc w:val="left"/>
+      <w:pPr>
+        <w:ind w:left="6480" w:hanging="360"/>
+      </w:pPr>
+      <w:rPr>
+        <w:rFonts w:ascii="Wingdings" w:hAnsi="Wingdings" w:hint="default"/>
+      </w:rPr>
+    </w:lvl>
+  </w:abstractNum>
+  <w:abstractNum w:abstractNumId="14" w15:restartNumberingAfterBreak="0">
+    <w:nsid w:val="56FA08AD"/>
+    <w:multiLevelType w:val="hybridMultilevel"/>
+    <w:tmpl w:val="09C07A04"/>
+    <w:lvl w:ilvl="0" w:tplc="18090001">
+      <w:start w:val="1"/>
+      <w:numFmt w:val="bullet"/>
+      <w:lvlText w:val=""/>
+      <w:lvlJc w:val="left"/>
+      <w:pPr>
+        <w:ind w:left="780" w:hanging="360"/>
+      </w:pPr>
+      <w:rPr>
+        <w:rFonts w:ascii="Symbol" w:hAnsi="Symbol" w:hint="default"/>
+      </w:rPr>
+    </w:lvl>
+    <w:lvl w:ilvl="1" w:tplc="18090003" w:tentative="1">
+      <w:start w:val="1"/>
+      <w:numFmt w:val="bullet"/>
+      <w:lvlText w:val="o"/>
+      <w:lvlJc w:val="left"/>
+      <w:pPr>
+        <w:ind w:left="1500" w:hanging="360"/>
+      </w:pPr>
+      <w:rPr>
+        <w:rFonts w:ascii="Courier New" w:hAnsi="Courier New" w:cs="Courier New" w:hint="default"/>
+      </w:rPr>
+    </w:lvl>
+    <w:lvl w:ilvl="2" w:tplc="18090005" w:tentative="1">
+      <w:start w:val="1"/>
+      <w:numFmt w:val="bullet"/>
+      <w:lvlText w:val=""/>
+      <w:lvlJc w:val="left"/>
+      <w:pPr>
+        <w:ind w:left="2220" w:hanging="360"/>
+      </w:pPr>
+      <w:rPr>
+        <w:rFonts w:ascii="Wingdings" w:hAnsi="Wingdings" w:hint="default"/>
+      </w:rPr>
+    </w:lvl>
+    <w:lvl w:ilvl="3" w:tplc="18090001" w:tentative="1">
+      <w:start w:val="1"/>
+      <w:numFmt w:val="bullet"/>
+      <w:lvlText w:val=""/>
+      <w:lvlJc w:val="left"/>
+      <w:pPr>
+        <w:ind w:left="2940" w:hanging="360"/>
+      </w:pPr>
+      <w:rPr>
+        <w:rFonts w:ascii="Symbol" w:hAnsi="Symbol" w:hint="default"/>
+      </w:rPr>
+    </w:lvl>
+    <w:lvl w:ilvl="4" w:tplc="18090003" w:tentative="1">
+      <w:start w:val="1"/>
+      <w:numFmt w:val="bullet"/>
+      <w:lvlText w:val="o"/>
+      <w:lvlJc w:val="left"/>
+      <w:pPr>
+        <w:ind w:left="3660" w:hanging="360"/>
+      </w:pPr>
+      <w:rPr>
+        <w:rFonts w:ascii="Courier New" w:hAnsi="Courier New" w:cs="Courier New" w:hint="default"/>
+      </w:rPr>
+    </w:lvl>
+    <w:lvl w:ilvl="5" w:tplc="18090005" w:tentative="1">
+      <w:start w:val="1"/>
+      <w:numFmt w:val="bullet"/>
+      <w:lvlText w:val=""/>
+      <w:lvlJc w:val="left"/>
+      <w:pPr>
+        <w:ind w:left="4380" w:hanging="360"/>
+      </w:pPr>
+      <w:rPr>
+        <w:rFonts w:ascii="Wingdings" w:hAnsi="Wingdings" w:hint="default"/>
+      </w:rPr>
+    </w:lvl>
+    <w:lvl w:ilvl="6" w:tplc="18090001" w:tentative="1">
+      <w:start w:val="1"/>
+      <w:numFmt w:val="bullet"/>
+      <w:lvlText w:val=""/>
+      <w:lvlJc w:val="left"/>
+      <w:pPr>
+        <w:ind w:left="5100" w:hanging="360"/>
+      </w:pPr>
+      <w:rPr>
+        <w:rFonts w:ascii="Symbol" w:hAnsi="Symbol" w:hint="default"/>
+      </w:rPr>
+    </w:lvl>
+    <w:lvl w:ilvl="7" w:tplc="18090003" w:tentative="1">
+      <w:start w:val="1"/>
+      <w:numFmt w:val="bullet"/>
+      <w:lvlText w:val="o"/>
+      <w:lvlJc w:val="left"/>
+      <w:pPr>
+        <w:ind w:left="5820" w:hanging="360"/>
+      </w:pPr>
+      <w:rPr>
+        <w:rFonts w:ascii="Courier New" w:hAnsi="Courier New" w:cs="Courier New" w:hint="default"/>
+      </w:rPr>
+    </w:lvl>
+    <w:lvl w:ilvl="8" w:tplc="18090005" w:tentative="1">
+      <w:start w:val="1"/>
+      <w:numFmt w:val="bullet"/>
+      <w:lvlText w:val=""/>
+      <w:lvlJc w:val="left"/>
+      <w:pPr>
+        <w:ind w:left="6540" w:hanging="360"/>
+      </w:pPr>
+      <w:rPr>
+        <w:rFonts w:ascii="Wingdings" w:hAnsi="Wingdings" w:hint="default"/>
       </w:rPr>
     </w:lvl>
   </w:abstractNum>
@@ -2375,6 +6593,24 @@
   </w:num>
   <w:num w:numId="9" w16cid:durableId="405692293">
     <w:abstractNumId w:val="0"/>
+  </w:num>
+  <w:num w:numId="10" w16cid:durableId="602418386">
+    <w:abstractNumId w:val="11"/>
+  </w:num>
+  <w:num w:numId="11" w16cid:durableId="1595169676">
+    <w:abstractNumId w:val="13"/>
+  </w:num>
+  <w:num w:numId="12" w16cid:durableId="898400234">
+    <w:abstractNumId w:val="9"/>
+  </w:num>
+  <w:num w:numId="13" w16cid:durableId="1153791886">
+    <w:abstractNumId w:val="14"/>
+  </w:num>
+  <w:num w:numId="14" w16cid:durableId="403719604">
+    <w:abstractNumId w:val="12"/>
+  </w:num>
+  <w:num w:numId="15" w16cid:durableId="1783106351">
+    <w:abstractNumId w:val="10"/>
   </w:num>
 </w:numbering>
 </file>
@@ -2982,7 +7218,6 @@
   <w:style w:type="character" w:default="1" w:styleId="DefaultParagraphFont">
     <w:name w:val="Default Paragraph Font"/>
     <w:uiPriority w:val="1"/>
-    <w:semiHidden/>
     <w:unhideWhenUsed/>
   </w:style>
   <w:style w:type="table" w:default="1" w:styleId="TableNormal">

</xml_diff>

<commit_message>
Implement responsive dashboard with live summary data
</commit_message>
<xml_diff>
--- a/docs/scrum/Sprint_1_to_4_Documentation_initial_Draft.docx
+++ b/docs/scrum/Sprint_1_to_4_Documentation_initial_Draft.docx
@@ -4469,16 +4469,19 @@
         <w:tblLook w:val="04A0" w:firstRow="1" w:lastRow="0" w:firstColumn="1" w:lastColumn="0" w:noHBand="0" w:noVBand="1"/>
       </w:tblPr>
       <w:tblGrid>
-        <w:gridCol w:w="1658"/>
-        <w:gridCol w:w="2005"/>
-        <w:gridCol w:w="1875"/>
-        <w:gridCol w:w="1546"/>
-        <w:gridCol w:w="1546"/>
+        <w:gridCol w:w="1552"/>
+        <w:gridCol w:w="60"/>
+        <w:gridCol w:w="2210"/>
+        <w:gridCol w:w="45"/>
+        <w:gridCol w:w="1799"/>
+        <w:gridCol w:w="1417"/>
+        <w:gridCol w:w="59"/>
+        <w:gridCol w:w="1488"/>
       </w:tblGrid>
       <w:tr>
         <w:tc>
           <w:tcPr>
-            <w:tcW w:w="1658" w:type="dxa"/>
+            <w:tcW w:w="1552" w:type="dxa"/>
           </w:tcPr>
           <w:p>
             <w:pPr>
@@ -4500,7 +4503,8 @@
         </w:tc>
         <w:tc>
           <w:tcPr>
-            <w:tcW w:w="2005" w:type="dxa"/>
+            <w:tcW w:w="2315" w:type="dxa"/>
+            <w:gridSpan w:val="3"/>
           </w:tcPr>
           <w:p>
             <w:pPr>
@@ -4522,7 +4526,7 @@
         </w:tc>
         <w:tc>
           <w:tcPr>
-            <w:tcW w:w="1875" w:type="dxa"/>
+            <w:tcW w:w="1799" w:type="dxa"/>
           </w:tcPr>
           <w:p>
             <w:pPr>
@@ -4544,7 +4548,8 @@
         </w:tc>
         <w:tc>
           <w:tcPr>
-            <w:tcW w:w="1546" w:type="dxa"/>
+            <w:tcW w:w="1476" w:type="dxa"/>
+            <w:gridSpan w:val="2"/>
           </w:tcPr>
           <w:p>
             <w:pPr>
@@ -4566,7 +4571,7 @@
         </w:tc>
         <w:tc>
           <w:tcPr>
-            <w:tcW w:w="1546" w:type="dxa"/>
+            <w:tcW w:w="1488" w:type="dxa"/>
           </w:tcPr>
           <w:p>
             <w:pPr>
@@ -4590,7 +4595,7 @@
       <w:tr>
         <w:tc>
           <w:tcPr>
-            <w:tcW w:w="1658" w:type="dxa"/>
+            <w:tcW w:w="1552" w:type="dxa"/>
           </w:tcPr>
           <w:p>
             <w:pPr>
@@ -4612,7 +4617,8 @@
         </w:tc>
         <w:tc>
           <w:tcPr>
-            <w:tcW w:w="2005" w:type="dxa"/>
+            <w:tcW w:w="2315" w:type="dxa"/>
+            <w:gridSpan w:val="3"/>
           </w:tcPr>
           <w:p>
             <w:pPr>
@@ -4676,7 +4682,7 @@
         </w:tc>
         <w:tc>
           <w:tcPr>
-            <w:tcW w:w="1875" w:type="dxa"/>
+            <w:tcW w:w="1799" w:type="dxa"/>
           </w:tcPr>
           <w:p>
             <w:pPr>
@@ -4698,7 +4704,8 @@
         </w:tc>
         <w:tc>
           <w:tcPr>
-            <w:tcW w:w="1546" w:type="dxa"/>
+            <w:tcW w:w="1476" w:type="dxa"/>
+            <w:gridSpan w:val="2"/>
           </w:tcPr>
           <w:p>
             <w:pPr>
@@ -4720,7 +4727,7 @@
         </w:tc>
         <w:tc>
           <w:tcPr>
-            <w:tcW w:w="1546" w:type="dxa"/>
+            <w:tcW w:w="1488" w:type="dxa"/>
           </w:tcPr>
           <w:p>
             <w:pPr>
@@ -4742,9 +4749,12 @@
         </w:tc>
       </w:tr>
       <w:tr>
-        <w:tc>
-          <w:tcPr>
-            <w:tcW w:w="1658" w:type="dxa"/>
+        <w:trPr>
+          <w:trHeight w:val="1365"/>
+        </w:trPr>
+        <w:tc>
+          <w:tcPr>
+            <w:tcW w:w="1552" w:type="dxa"/>
           </w:tcPr>
           <w:p>
             <w:pPr>
@@ -4766,7 +4776,8 @@
         </w:tc>
         <w:tc>
           <w:tcPr>
-            <w:tcW w:w="2005" w:type="dxa"/>
+            <w:tcW w:w="2315" w:type="dxa"/>
+            <w:gridSpan w:val="3"/>
           </w:tcPr>
           <w:p>
             <w:pPr>
@@ -4790,7 +4801,7 @@
         </w:tc>
         <w:tc>
           <w:tcPr>
-            <w:tcW w:w="1875" w:type="dxa"/>
+            <w:tcW w:w="1799" w:type="dxa"/>
           </w:tcPr>
           <w:p>
             <w:pPr>
@@ -4812,7 +4823,8 @@
         </w:tc>
         <w:tc>
           <w:tcPr>
-            <w:tcW w:w="1546" w:type="dxa"/>
+            <w:tcW w:w="1476" w:type="dxa"/>
+            <w:gridSpan w:val="2"/>
           </w:tcPr>
           <w:p>
             <w:pPr>
@@ -4834,7 +4846,7 @@
         </w:tc>
         <w:tc>
           <w:tcPr>
-            <w:tcW w:w="1546" w:type="dxa"/>
+            <w:tcW w:w="1488" w:type="dxa"/>
           </w:tcPr>
           <w:p>
             <w:pPr>
@@ -4852,6 +4864,271 @@
               </w:rPr>
               <w:t>Done</w:t>
             </w:r>
+          </w:p>
+        </w:tc>
+      </w:tr>
+      <w:tr>
+        <w:tc>
+          <w:tcPr>
+            <w:tcW w:w="1552" w:type="dxa"/>
+          </w:tcPr>
+          <w:p>
+            <w:pPr>
+              <w:rPr>
+                <w:color w:val="000000" w:themeColor="text1"/>
+                <w:sz w:val="28"/>
+                <w:szCs w:val="28"/>
+              </w:rPr>
+            </w:pPr>
+            <w:r>
+              <w:rPr>
+                <w:color w:val="000000" w:themeColor="text1"/>
+                <w:sz w:val="28"/>
+                <w:szCs w:val="28"/>
+              </w:rPr>
+              <w:t>PB-20</w:t>
+            </w:r>
+          </w:p>
+        </w:tc>
+        <w:tc>
+          <w:tcPr>
+            <w:tcW w:w="2270" w:type="dxa"/>
+            <w:gridSpan w:val="2"/>
+          </w:tcPr>
+          <w:p>
+            <w:pPr>
+              <w:rPr>
+                <w:color w:val="000000" w:themeColor="text1"/>
+                <w:sz w:val="28"/>
+                <w:szCs w:val="28"/>
+              </w:rPr>
+            </w:pPr>
+            <w:r>
+              <w:rPr>
+                <w:color w:val="000000" w:themeColor="text1"/>
+                <w:sz w:val="28"/>
+                <w:szCs w:val="28"/>
+              </w:rPr>
+              <w:t>Complete System Design Documentation</w:t>
+            </w:r>
+          </w:p>
+        </w:tc>
+        <w:tc>
+          <w:tcPr>
+            <w:tcW w:w="1844" w:type="dxa"/>
+            <w:gridSpan w:val="2"/>
+          </w:tcPr>
+          <w:p>
+            <w:pPr>
+              <w:rPr>
+                <w:color w:val="000000" w:themeColor="text1"/>
+                <w:sz w:val="28"/>
+                <w:szCs w:val="28"/>
+              </w:rPr>
+            </w:pPr>
+            <w:r>
+              <w:rPr>
+                <w:color w:val="000000" w:themeColor="text1"/>
+                <w:sz w:val="28"/>
+                <w:szCs w:val="28"/>
+              </w:rPr>
+              <w:t>Must</w:t>
+            </w:r>
+          </w:p>
+        </w:tc>
+        <w:tc>
+          <w:tcPr>
+            <w:tcW w:w="1417" w:type="dxa"/>
+          </w:tcPr>
+          <w:p>
+            <w:pPr>
+              <w:rPr>
+                <w:color w:val="000000" w:themeColor="text1"/>
+                <w:sz w:val="28"/>
+                <w:szCs w:val="28"/>
+              </w:rPr>
+            </w:pPr>
+            <w:r>
+              <w:rPr>
+                <w:color w:val="000000" w:themeColor="text1"/>
+                <w:sz w:val="28"/>
+                <w:szCs w:val="28"/>
+              </w:rPr>
+              <w:t>5</w:t>
+            </w:r>
+          </w:p>
+        </w:tc>
+        <w:tc>
+          <w:tcPr>
+            <w:tcW w:w="1547" w:type="dxa"/>
+            <w:gridSpan w:val="2"/>
+          </w:tcPr>
+          <w:p>
+            <w:pPr>
+              <w:rPr>
+                <w:color w:val="000000" w:themeColor="text1"/>
+                <w:sz w:val="28"/>
+                <w:szCs w:val="28"/>
+              </w:rPr>
+            </w:pPr>
+            <w:r>
+              <w:rPr>
+                <w:color w:val="000000" w:themeColor="text1"/>
+                <w:sz w:val="28"/>
+                <w:szCs w:val="28"/>
+              </w:rPr>
+              <w:t>Done</w:t>
+            </w:r>
+          </w:p>
+        </w:tc>
+      </w:tr>
+      <w:tr>
+        <w:tc>
+          <w:tcPr>
+            <w:tcW w:w="1612" w:type="dxa"/>
+            <w:gridSpan w:val="2"/>
+          </w:tcPr>
+          <w:p>
+            <w:pPr>
+              <w:rPr>
+                <w:color w:val="000000" w:themeColor="text1"/>
+                <w:sz w:val="28"/>
+                <w:szCs w:val="28"/>
+              </w:rPr>
+            </w:pPr>
+          </w:p>
+        </w:tc>
+        <w:tc>
+          <w:tcPr>
+            <w:tcW w:w="2210" w:type="dxa"/>
+          </w:tcPr>
+          <w:p>
+            <w:pPr>
+              <w:rPr>
+                <w:color w:val="000000" w:themeColor="text1"/>
+                <w:sz w:val="28"/>
+                <w:szCs w:val="28"/>
+              </w:rPr>
+            </w:pPr>
+          </w:p>
+        </w:tc>
+        <w:tc>
+          <w:tcPr>
+            <w:tcW w:w="1844" w:type="dxa"/>
+            <w:gridSpan w:val="2"/>
+          </w:tcPr>
+          <w:p>
+            <w:pPr>
+              <w:rPr>
+                <w:color w:val="000000" w:themeColor="text1"/>
+                <w:sz w:val="28"/>
+                <w:szCs w:val="28"/>
+              </w:rPr>
+            </w:pPr>
+          </w:p>
+        </w:tc>
+        <w:tc>
+          <w:tcPr>
+            <w:tcW w:w="1417" w:type="dxa"/>
+          </w:tcPr>
+          <w:p>
+            <w:pPr>
+              <w:rPr>
+                <w:color w:val="000000" w:themeColor="text1"/>
+                <w:sz w:val="28"/>
+                <w:szCs w:val="28"/>
+              </w:rPr>
+            </w:pPr>
+          </w:p>
+        </w:tc>
+        <w:tc>
+          <w:tcPr>
+            <w:tcW w:w="1547" w:type="dxa"/>
+            <w:gridSpan w:val="2"/>
+          </w:tcPr>
+          <w:p>
+            <w:pPr>
+              <w:rPr>
+                <w:color w:val="000000" w:themeColor="text1"/>
+                <w:sz w:val="28"/>
+                <w:szCs w:val="28"/>
+              </w:rPr>
+            </w:pPr>
+          </w:p>
+        </w:tc>
+      </w:tr>
+      <w:tr>
+        <w:tc>
+          <w:tcPr>
+            <w:tcW w:w="1612" w:type="dxa"/>
+            <w:gridSpan w:val="2"/>
+          </w:tcPr>
+          <w:p>
+            <w:pPr>
+              <w:rPr>
+                <w:color w:val="000000" w:themeColor="text1"/>
+                <w:sz w:val="28"/>
+                <w:szCs w:val="28"/>
+              </w:rPr>
+            </w:pPr>
+          </w:p>
+        </w:tc>
+        <w:tc>
+          <w:tcPr>
+            <w:tcW w:w="2210" w:type="dxa"/>
+          </w:tcPr>
+          <w:p>
+            <w:pPr>
+              <w:rPr>
+                <w:color w:val="000000" w:themeColor="text1"/>
+                <w:sz w:val="28"/>
+                <w:szCs w:val="28"/>
+              </w:rPr>
+            </w:pPr>
+          </w:p>
+        </w:tc>
+        <w:tc>
+          <w:tcPr>
+            <w:tcW w:w="1844" w:type="dxa"/>
+            <w:gridSpan w:val="2"/>
+          </w:tcPr>
+          <w:p>
+            <w:pPr>
+              <w:rPr>
+                <w:color w:val="000000" w:themeColor="text1"/>
+                <w:sz w:val="28"/>
+                <w:szCs w:val="28"/>
+              </w:rPr>
+            </w:pPr>
+          </w:p>
+        </w:tc>
+        <w:tc>
+          <w:tcPr>
+            <w:tcW w:w="1417" w:type="dxa"/>
+          </w:tcPr>
+          <w:p>
+            <w:pPr>
+              <w:rPr>
+                <w:color w:val="000000" w:themeColor="text1"/>
+                <w:sz w:val="28"/>
+                <w:szCs w:val="28"/>
+              </w:rPr>
+            </w:pPr>
+          </w:p>
+        </w:tc>
+        <w:tc>
+          <w:tcPr>
+            <w:tcW w:w="1547" w:type="dxa"/>
+            <w:gridSpan w:val="2"/>
+          </w:tcPr>
+          <w:p>
+            <w:pPr>
+              <w:rPr>
+                <w:color w:val="000000" w:themeColor="text1"/>
+                <w:sz w:val="28"/>
+                <w:szCs w:val="28"/>
+              </w:rPr>
+            </w:pPr>
           </w:p>
         </w:tc>
       </w:tr>
@@ -5138,6 +5415,7 @@
           <w:sz w:val="28"/>
           <w:szCs w:val="28"/>
         </w:rPr>
+        <w:lastRenderedPageBreak/>
         <w:t>All tests passing</w:t>
       </w:r>
     </w:p>
@@ -5160,7 +5438,7 @@
           <w:sz w:val="28"/>
           <w:szCs w:val="28"/>
         </w:rPr>
-        <w:t>Changed committed to Git</w:t>
+        <w:t>Wireframes completed</w:t>
       </w:r>
     </w:p>
     <w:p>
@@ -5182,29 +5460,38 @@
           <w:sz w:val="28"/>
           <w:szCs w:val="28"/>
         </w:rPr>
-        <w:t>Backend ready for final documentation</w:t>
-      </w:r>
-    </w:p>
-    <w:p>
-      <w:pPr>
+        <w:t>UML documentation completed</w:t>
+      </w:r>
+    </w:p>
+    <w:p>
+      <w:pPr>
+        <w:pStyle w:val="ListParagraph"/>
+        <w:numPr>
+          <w:ilvl w:val="0"/>
+          <w:numId w:val="11"/>
+        </w:numPr>
         <w:rPr>
           <w:color w:val="000000" w:themeColor="text1"/>
           <w:sz w:val="28"/>
           <w:szCs w:val="28"/>
         </w:rPr>
       </w:pPr>
-    </w:p>
-    <w:p>
-      <w:pPr>
+      <w:r>
         <w:rPr>
           <w:color w:val="000000" w:themeColor="text1"/>
           <w:sz w:val="28"/>
           <w:szCs w:val="28"/>
         </w:rPr>
-      </w:pPr>
-    </w:p>
-    <w:p>
-      <w:pPr>
+        <w:t>Changed committed to Git</w:t>
+      </w:r>
+    </w:p>
+    <w:p>
+      <w:pPr>
+        <w:pStyle w:val="ListParagraph"/>
+        <w:numPr>
+          <w:ilvl w:val="0"/>
+          <w:numId w:val="11"/>
+        </w:numPr>
         <w:rPr>
           <w:color w:val="000000" w:themeColor="text1"/>
           <w:sz w:val="28"/>
@@ -5217,7 +5504,41 @@
           <w:sz w:val="28"/>
           <w:szCs w:val="28"/>
         </w:rPr>
-        <w:lastRenderedPageBreak/>
+        <w:t>Backend ready for final documentation</w:t>
+      </w:r>
+    </w:p>
+    <w:p>
+      <w:pPr>
+        <w:rPr>
+          <w:color w:val="000000" w:themeColor="text1"/>
+          <w:sz w:val="28"/>
+          <w:szCs w:val="28"/>
+        </w:rPr>
+      </w:pPr>
+    </w:p>
+    <w:p>
+      <w:pPr>
+        <w:rPr>
+          <w:color w:val="000000" w:themeColor="text1"/>
+          <w:sz w:val="28"/>
+          <w:szCs w:val="28"/>
+        </w:rPr>
+      </w:pPr>
+    </w:p>
+    <w:p>
+      <w:pPr>
+        <w:rPr>
+          <w:color w:val="000000" w:themeColor="text1"/>
+          <w:sz w:val="28"/>
+          <w:szCs w:val="28"/>
+        </w:rPr>
+      </w:pPr>
+      <w:r>
+        <w:rPr>
+          <w:color w:val="000000" w:themeColor="text1"/>
+          <w:sz w:val="28"/>
+          <w:szCs w:val="28"/>
+        </w:rPr>
         <w:t>Sprint Review</w:t>
       </w:r>
     </w:p>
@@ -5311,6 +5632,72 @@
     </w:p>
     <w:p>
       <w:pPr>
+        <w:pStyle w:val="ListParagraph"/>
+        <w:numPr>
+          <w:ilvl w:val="0"/>
+          <w:numId w:val="12"/>
+        </w:numPr>
+        <w:rPr>
+          <w:color w:val="000000" w:themeColor="text1"/>
+          <w:sz w:val="28"/>
+          <w:szCs w:val="28"/>
+        </w:rPr>
+      </w:pPr>
+      <w:r>
+        <w:rPr>
+          <w:color w:val="000000" w:themeColor="text1"/>
+          <w:sz w:val="28"/>
+          <w:szCs w:val="28"/>
+        </w:rPr>
+        <w:t>Dashboard and Container management wireframes completed</w:t>
+      </w:r>
+    </w:p>
+    <w:p>
+      <w:pPr>
+        <w:pStyle w:val="ListParagraph"/>
+        <w:numPr>
+          <w:ilvl w:val="0"/>
+          <w:numId w:val="12"/>
+        </w:numPr>
+        <w:rPr>
+          <w:color w:val="000000" w:themeColor="text1"/>
+          <w:sz w:val="28"/>
+          <w:szCs w:val="28"/>
+        </w:rPr>
+      </w:pPr>
+      <w:r>
+        <w:rPr>
+          <w:color w:val="000000" w:themeColor="text1"/>
+          <w:sz w:val="28"/>
+          <w:szCs w:val="28"/>
+        </w:rPr>
+        <w:t>UML documentation complete, use case, class and four sequence diagrams</w:t>
+      </w:r>
+    </w:p>
+    <w:p>
+      <w:pPr>
+        <w:pStyle w:val="ListParagraph"/>
+        <w:numPr>
+          <w:ilvl w:val="0"/>
+          <w:numId w:val="12"/>
+        </w:numPr>
+        <w:rPr>
+          <w:color w:val="000000" w:themeColor="text1"/>
+          <w:sz w:val="28"/>
+          <w:szCs w:val="28"/>
+        </w:rPr>
+      </w:pPr>
+      <w:r>
+        <w:rPr>
+          <w:color w:val="000000" w:themeColor="text1"/>
+          <w:sz w:val="28"/>
+          <w:szCs w:val="28"/>
+        </w:rPr>
+        <w:t>Design phase completed</w:t>
+      </w:r>
+    </w:p>
+    <w:p>
+      <w:pPr>
         <w:rPr>
           <w:color w:val="000000" w:themeColor="text1"/>
           <w:sz w:val="28"/>
@@ -5394,6 +5781,39 @@
     </w:p>
     <w:p>
       <w:pPr>
+        <w:pStyle w:val="ListParagraph"/>
+        <w:numPr>
+          <w:ilvl w:val="0"/>
+          <w:numId w:val="13"/>
+        </w:numPr>
+        <w:rPr>
+          <w:color w:val="000000" w:themeColor="text1"/>
+          <w:sz w:val="28"/>
+          <w:szCs w:val="28"/>
+        </w:rPr>
+      </w:pPr>
+      <w:r>
+        <w:rPr>
+          <w:color w:val="000000" w:themeColor="text1"/>
+          <w:sz w:val="28"/>
+          <w:szCs w:val="28"/>
+        </w:rPr>
+        <w:t>Design documentation accurately reflects the implemented system</w:t>
+      </w:r>
+    </w:p>
+    <w:p>
+      <w:pPr>
+        <w:pStyle w:val="ListParagraph"/>
+        <w:ind w:left="780"/>
+        <w:rPr>
+          <w:color w:val="000000" w:themeColor="text1"/>
+          <w:sz w:val="28"/>
+          <w:szCs w:val="28"/>
+        </w:rPr>
+      </w:pPr>
+    </w:p>
+    <w:p>
+      <w:pPr>
         <w:rPr>
           <w:color w:val="000000" w:themeColor="text1"/>
           <w:sz w:val="28"/>
@@ -5477,6 +5897,28 @@
     </w:p>
     <w:p>
       <w:pPr>
+        <w:pStyle w:val="ListParagraph"/>
+        <w:numPr>
+          <w:ilvl w:val="0"/>
+          <w:numId w:val="14"/>
+        </w:numPr>
+        <w:rPr>
+          <w:color w:val="000000" w:themeColor="text1"/>
+          <w:sz w:val="28"/>
+          <w:szCs w:val="28"/>
+        </w:rPr>
+      </w:pPr>
+      <w:r>
+        <w:rPr>
+          <w:color w:val="000000" w:themeColor="text1"/>
+          <w:sz w:val="28"/>
+          <w:szCs w:val="28"/>
+        </w:rPr>
+        <w:t>Implementing business logic into diagrams</w:t>
+      </w:r>
+    </w:p>
+    <w:p>
+      <w:pPr>
         <w:rPr>
           <w:color w:val="000000" w:themeColor="text1"/>
           <w:sz w:val="28"/>
@@ -5493,6 +5935,7 @@
           <w:szCs w:val="28"/>
           <w:lang w:val="en-IE"/>
         </w:rPr>
+        <w:lastRenderedPageBreak/>
         <w:t>Focus for Next Sprint</w:t>
       </w:r>
     </w:p>

</xml_diff>

<commit_message>
Complete Sprint 5 dashboard implementation
</commit_message>
<xml_diff>
--- a/docs/scrum/Sprint_1_to_4_Documentation_initial_Draft.docx
+++ b/docs/scrum/Sprint_1_to_4_Documentation_initial_Draft.docx
@@ -4996,6 +4996,14 @@
                 <w:szCs w:val="28"/>
               </w:rPr>
             </w:pPr>
+            <w:r>
+              <w:rPr>
+                <w:color w:val="000000" w:themeColor="text1"/>
+                <w:sz w:val="28"/>
+                <w:szCs w:val="28"/>
+              </w:rPr>
+              <w:t>PB-21</w:t>
+            </w:r>
           </w:p>
         </w:tc>
         <w:tc>
@@ -5010,6 +5018,24 @@
                 <w:szCs w:val="28"/>
               </w:rPr>
             </w:pPr>
+            <w:proofErr w:type="gramStart"/>
+            <w:r>
+              <w:rPr>
+                <w:color w:val="000000" w:themeColor="text1"/>
+                <w:sz w:val="28"/>
+                <w:szCs w:val="28"/>
+              </w:rPr>
+              <w:t>Develop</w:t>
+            </w:r>
+            <w:proofErr w:type="gramEnd"/>
+            <w:r>
+              <w:rPr>
+                <w:color w:val="000000" w:themeColor="text1"/>
+                <w:sz w:val="28"/>
+                <w:szCs w:val="28"/>
+              </w:rPr>
+              <w:t xml:space="preserve"> Dashboard Interface</w:t>
+            </w:r>
           </w:p>
         </w:tc>
         <w:tc>
@@ -5025,6 +5051,14 @@
                 <w:szCs w:val="28"/>
               </w:rPr>
             </w:pPr>
+            <w:r>
+              <w:rPr>
+                <w:color w:val="000000" w:themeColor="text1"/>
+                <w:sz w:val="28"/>
+                <w:szCs w:val="28"/>
+              </w:rPr>
+              <w:t>Must</w:t>
+            </w:r>
           </w:p>
         </w:tc>
         <w:tc>
@@ -5039,6 +5073,14 @@
                 <w:szCs w:val="28"/>
               </w:rPr>
             </w:pPr>
+            <w:r>
+              <w:rPr>
+                <w:color w:val="000000" w:themeColor="text1"/>
+                <w:sz w:val="28"/>
+                <w:szCs w:val="28"/>
+              </w:rPr>
+              <w:t>3</w:t>
+            </w:r>
           </w:p>
         </w:tc>
         <w:tc>
@@ -5054,6 +5096,14 @@
                 <w:szCs w:val="28"/>
               </w:rPr>
             </w:pPr>
+            <w:r>
+              <w:rPr>
+                <w:color w:val="000000" w:themeColor="text1"/>
+                <w:sz w:val="28"/>
+                <w:szCs w:val="28"/>
+              </w:rPr>
+              <w:t>Done</w:t>
+            </w:r>
           </w:p>
         </w:tc>
       </w:tr>
@@ -5315,6 +5365,11 @@
     </w:p>
     <w:p>
       <w:pPr>
+        <w:pStyle w:val="ListParagraph"/>
+        <w:numPr>
+          <w:ilvl w:val="0"/>
+          <w:numId w:val="10"/>
+        </w:numPr>
         <w:rPr>
           <w:color w:val="000000" w:themeColor="text1"/>
           <w:sz w:val="28"/>
@@ -5327,6 +5382,68 @@
           <w:sz w:val="28"/>
           <w:szCs w:val="28"/>
         </w:rPr>
+        <w:t>Develop React dashboard</w:t>
+      </w:r>
+    </w:p>
+    <w:p>
+      <w:pPr>
+        <w:pStyle w:val="ListParagraph"/>
+        <w:numPr>
+          <w:ilvl w:val="0"/>
+          <w:numId w:val="10"/>
+        </w:numPr>
+        <w:rPr>
+          <w:color w:val="000000" w:themeColor="text1"/>
+          <w:sz w:val="28"/>
+          <w:szCs w:val="28"/>
+        </w:rPr>
+      </w:pPr>
+      <w:r>
+        <w:rPr>
+          <w:color w:val="000000" w:themeColor="text1"/>
+          <w:sz w:val="28"/>
+          <w:szCs w:val="28"/>
+        </w:rPr>
+        <w:t>Integrate the dashboard with the backend API</w:t>
+      </w:r>
+    </w:p>
+    <w:p>
+      <w:pPr>
+        <w:pStyle w:val="ListParagraph"/>
+        <w:numPr>
+          <w:ilvl w:val="0"/>
+          <w:numId w:val="10"/>
+        </w:numPr>
+        <w:rPr>
+          <w:color w:val="000000" w:themeColor="text1"/>
+          <w:sz w:val="28"/>
+          <w:szCs w:val="28"/>
+        </w:rPr>
+      </w:pPr>
+      <w:r>
+        <w:rPr>
+          <w:color w:val="000000" w:themeColor="text1"/>
+          <w:sz w:val="28"/>
+          <w:szCs w:val="28"/>
+        </w:rPr>
+        <w:t>Implement responsive dashboard summary cards</w:t>
+      </w:r>
+    </w:p>
+    <w:p>
+      <w:pPr>
+        <w:rPr>
+          <w:color w:val="000000" w:themeColor="text1"/>
+          <w:sz w:val="28"/>
+          <w:szCs w:val="28"/>
+        </w:rPr>
+      </w:pPr>
+      <w:r>
+        <w:rPr>
+          <w:color w:val="000000" w:themeColor="text1"/>
+          <w:sz w:val="28"/>
+          <w:szCs w:val="28"/>
+        </w:rPr>
+        <w:lastRenderedPageBreak/>
         <w:t>Definition of Done</w:t>
       </w:r>
     </w:p>
@@ -5415,7 +5532,6 @@
           <w:sz w:val="28"/>
           <w:szCs w:val="28"/>
         </w:rPr>
-        <w:lastRenderedPageBreak/>
         <w:t>All tests passing</w:t>
       </w:r>
     </w:p>
@@ -5438,6 +5554,14 @@
           <w:sz w:val="28"/>
           <w:szCs w:val="28"/>
         </w:rPr>
+        <w:t xml:space="preserve">Dashboard </w:t>
+      </w:r>
+      <w:r>
+        <w:rPr>
+          <w:color w:val="000000" w:themeColor="text1"/>
+          <w:sz w:val="28"/>
+          <w:szCs w:val="28"/>
+        </w:rPr>
         <w:t>Wireframes completed</w:t>
       </w:r>
     </w:p>
@@ -5482,7 +5606,23 @@
           <w:sz w:val="28"/>
           <w:szCs w:val="28"/>
         </w:rPr>
-        <w:t>Changed committed to Git</w:t>
+        <w:t>Change</w:t>
+      </w:r>
+      <w:r>
+        <w:rPr>
+          <w:color w:val="000000" w:themeColor="text1"/>
+          <w:sz w:val="28"/>
+          <w:szCs w:val="28"/>
+        </w:rPr>
+        <w:t>s</w:t>
+      </w:r>
+      <w:r>
+        <w:rPr>
+          <w:color w:val="000000" w:themeColor="text1"/>
+          <w:sz w:val="28"/>
+          <w:szCs w:val="28"/>
+        </w:rPr>
+        <w:t xml:space="preserve"> committed to Git</w:t>
       </w:r>
     </w:p>
     <w:p>
@@ -5515,24 +5655,6 @@
           <w:szCs w:val="28"/>
         </w:rPr>
       </w:pPr>
-    </w:p>
-    <w:p>
-      <w:pPr>
-        <w:rPr>
-          <w:color w:val="000000" w:themeColor="text1"/>
-          <w:sz w:val="28"/>
-          <w:szCs w:val="28"/>
-        </w:rPr>
-      </w:pPr>
-    </w:p>
-    <w:p>
-      <w:pPr>
-        <w:rPr>
-          <w:color w:val="000000" w:themeColor="text1"/>
-          <w:sz w:val="28"/>
-          <w:szCs w:val="28"/>
-        </w:rPr>
-      </w:pPr>
       <w:r>
         <w:rPr>
           <w:color w:val="000000" w:themeColor="text1"/>
@@ -5698,6 +5820,11 @@
     </w:p>
     <w:p>
       <w:pPr>
+        <w:pStyle w:val="ListParagraph"/>
+        <w:numPr>
+          <w:ilvl w:val="0"/>
+          <w:numId w:val="12"/>
+        </w:numPr>
         <w:rPr>
           <w:color w:val="000000" w:themeColor="text1"/>
           <w:sz w:val="28"/>
@@ -5710,6 +5837,126 @@
           <w:sz w:val="28"/>
           <w:szCs w:val="28"/>
         </w:rPr>
+        <w:t>React frontend structure established</w:t>
+      </w:r>
+    </w:p>
+    <w:p>
+      <w:pPr>
+        <w:pStyle w:val="ListParagraph"/>
+        <w:numPr>
+          <w:ilvl w:val="0"/>
+          <w:numId w:val="12"/>
+        </w:numPr>
+        <w:rPr>
+          <w:color w:val="000000" w:themeColor="text1"/>
+          <w:sz w:val="28"/>
+          <w:szCs w:val="28"/>
+        </w:rPr>
+      </w:pPr>
+      <w:r>
+        <w:rPr>
+          <w:color w:val="000000" w:themeColor="text1"/>
+          <w:sz w:val="28"/>
+          <w:szCs w:val="28"/>
+        </w:rPr>
+        <w:t>Responsive dashboard in place</w:t>
+      </w:r>
+    </w:p>
+    <w:p>
+      <w:pPr>
+        <w:pStyle w:val="ListParagraph"/>
+        <w:numPr>
+          <w:ilvl w:val="0"/>
+          <w:numId w:val="12"/>
+        </w:numPr>
+        <w:rPr>
+          <w:color w:val="000000" w:themeColor="text1"/>
+          <w:sz w:val="28"/>
+          <w:szCs w:val="28"/>
+        </w:rPr>
+      </w:pPr>
+      <w:r>
+        <w:rPr>
+          <w:color w:val="000000" w:themeColor="text1"/>
+          <w:sz w:val="28"/>
+          <w:szCs w:val="28"/>
+        </w:rPr>
+        <w:t>Dashboard successfully integrated with backend API using JWT authentication</w:t>
+      </w:r>
+    </w:p>
+    <w:p>
+      <w:pPr>
+        <w:pStyle w:val="ListParagraph"/>
+        <w:numPr>
+          <w:ilvl w:val="0"/>
+          <w:numId w:val="12"/>
+        </w:numPr>
+        <w:rPr>
+          <w:color w:val="000000" w:themeColor="text1"/>
+          <w:sz w:val="28"/>
+          <w:szCs w:val="28"/>
+        </w:rPr>
+      </w:pPr>
+      <w:r>
+        <w:rPr>
+          <w:color w:val="000000" w:themeColor="text1"/>
+          <w:sz w:val="28"/>
+          <w:szCs w:val="28"/>
+        </w:rPr>
+        <w:t>Live operational statistics displayed through dashboard components</w:t>
+      </w:r>
+    </w:p>
+    <w:p>
+      <w:pPr>
+        <w:rPr>
+          <w:color w:val="000000" w:themeColor="text1"/>
+          <w:sz w:val="28"/>
+          <w:szCs w:val="28"/>
+        </w:rPr>
+      </w:pPr>
+    </w:p>
+    <w:p>
+      <w:pPr>
+        <w:rPr>
+          <w:color w:val="000000" w:themeColor="text1"/>
+          <w:sz w:val="28"/>
+          <w:szCs w:val="28"/>
+        </w:rPr>
+      </w:pPr>
+    </w:p>
+    <w:p>
+      <w:pPr>
+        <w:rPr>
+          <w:color w:val="000000" w:themeColor="text1"/>
+          <w:sz w:val="28"/>
+          <w:szCs w:val="28"/>
+        </w:rPr>
+      </w:pPr>
+    </w:p>
+    <w:p>
+      <w:pPr>
+        <w:rPr>
+          <w:color w:val="000000" w:themeColor="text1"/>
+          <w:sz w:val="28"/>
+          <w:szCs w:val="28"/>
+        </w:rPr>
+      </w:pPr>
+    </w:p>
+    <w:p>
+      <w:pPr>
+        <w:rPr>
+          <w:color w:val="000000" w:themeColor="text1"/>
+          <w:sz w:val="28"/>
+          <w:szCs w:val="28"/>
+        </w:rPr>
+      </w:pPr>
+      <w:r>
+        <w:rPr>
+          <w:color w:val="000000" w:themeColor="text1"/>
+          <w:sz w:val="28"/>
+          <w:szCs w:val="28"/>
+        </w:rPr>
+        <w:lastRenderedPageBreak/>
         <w:t>What went well</w:t>
       </w:r>
     </w:p>
@@ -5804,13 +6051,46 @@
     <w:p>
       <w:pPr>
         <w:pStyle w:val="ListParagraph"/>
-        <w:ind w:left="780"/>
+        <w:numPr>
+          <w:ilvl w:val="0"/>
+          <w:numId w:val="13"/>
+        </w:numPr>
         <w:rPr>
           <w:color w:val="000000" w:themeColor="text1"/>
           <w:sz w:val="28"/>
           <w:szCs w:val="28"/>
         </w:rPr>
       </w:pPr>
+      <w:r>
+        <w:rPr>
+          <w:color w:val="000000" w:themeColor="text1"/>
+          <w:sz w:val="28"/>
+          <w:szCs w:val="28"/>
+        </w:rPr>
+        <w:t>Frontend architecture was successfully established using reusable React components</w:t>
+      </w:r>
+    </w:p>
+    <w:p>
+      <w:pPr>
+        <w:pStyle w:val="ListParagraph"/>
+        <w:numPr>
+          <w:ilvl w:val="0"/>
+          <w:numId w:val="13"/>
+        </w:numPr>
+        <w:rPr>
+          <w:color w:val="000000" w:themeColor="text1"/>
+          <w:sz w:val="28"/>
+          <w:szCs w:val="28"/>
+        </w:rPr>
+      </w:pPr>
+      <w:r>
+        <w:rPr>
+          <w:color w:val="000000" w:themeColor="text1"/>
+          <w:sz w:val="28"/>
+          <w:szCs w:val="28"/>
+        </w:rPr>
+        <w:t>Backend integration with the dashboard was completed with minimal changes to the existing API</w:t>
+      </w:r>
     </w:p>
     <w:p>
       <w:pPr>
@@ -5919,6 +6199,28 @@
     </w:p>
     <w:p>
       <w:pPr>
+        <w:pStyle w:val="ListParagraph"/>
+        <w:numPr>
+          <w:ilvl w:val="0"/>
+          <w:numId w:val="14"/>
+        </w:numPr>
+        <w:rPr>
+          <w:color w:val="000000" w:themeColor="text1"/>
+          <w:sz w:val="28"/>
+          <w:szCs w:val="28"/>
+        </w:rPr>
+      </w:pPr>
+      <w:r>
+        <w:rPr>
+          <w:color w:val="000000" w:themeColor="text1"/>
+          <w:sz w:val="28"/>
+          <w:szCs w:val="28"/>
+        </w:rPr>
+        <w:t xml:space="preserve">Adapting to changes in the Material UI Grid during dashboard development </w:t>
+      </w:r>
+    </w:p>
+    <w:p>
+      <w:pPr>
         <w:rPr>
           <w:color w:val="000000" w:themeColor="text1"/>
           <w:sz w:val="28"/>
@@ -5935,15 +6237,15 @@
           <w:szCs w:val="28"/>
           <w:lang w:val="en-IE"/>
         </w:rPr>
-        <w:lastRenderedPageBreak/>
         <w:t>Focus for Next Sprint</w:t>
       </w:r>
     </w:p>
     <w:p>
       <w:pPr>
+        <w:pStyle w:val="ListParagraph"/>
         <w:numPr>
           <w:ilvl w:val="0"/>
-          <w:numId w:val="15"/>
+          <w:numId w:val="14"/>
         </w:numPr>
         <w:rPr>
           <w:color w:val="000000" w:themeColor="text1"/>
@@ -5959,14 +6261,15 @@
           <w:szCs w:val="28"/>
           <w:lang w:val="en-IE"/>
         </w:rPr>
-        <w:t xml:space="preserve">Develop the React frontend. </w:t>
-      </w:r>
-    </w:p>
-    <w:p>
-      <w:pPr>
+        <w:t xml:space="preserve">Develop container management pages. </w:t>
+      </w:r>
+    </w:p>
+    <w:p>
+      <w:pPr>
+        <w:pStyle w:val="ListParagraph"/>
         <w:numPr>
           <w:ilvl w:val="0"/>
-          <w:numId w:val="15"/>
+          <w:numId w:val="14"/>
         </w:numPr>
         <w:rPr>
           <w:color w:val="000000" w:themeColor="text1"/>
@@ -5982,14 +6285,15 @@
           <w:szCs w:val="28"/>
           <w:lang w:val="en-IE"/>
         </w:rPr>
-        <w:t xml:space="preserve">Integrate frontend with the backend API. </w:t>
-      </w:r>
-    </w:p>
-    <w:p>
-      <w:pPr>
+        <w:t xml:space="preserve">Implement the approvals interface. </w:t>
+      </w:r>
+    </w:p>
+    <w:p>
+      <w:pPr>
+        <w:pStyle w:val="ListParagraph"/>
         <w:numPr>
           <w:ilvl w:val="0"/>
-          <w:numId w:val="15"/>
+          <w:numId w:val="14"/>
         </w:numPr>
         <w:rPr>
           <w:color w:val="000000" w:themeColor="text1"/>
@@ -6005,14 +6309,15 @@
           <w:szCs w:val="28"/>
           <w:lang w:val="en-IE"/>
         </w:rPr>
-        <w:t xml:space="preserve">Build dashboards and data visualisations. </w:t>
-      </w:r>
-    </w:p>
-    <w:p>
-      <w:pPr>
+        <w:t xml:space="preserve">Develop observations and reporting pages. </w:t>
+      </w:r>
+    </w:p>
+    <w:p>
+      <w:pPr>
+        <w:pStyle w:val="ListParagraph"/>
         <w:numPr>
           <w:ilvl w:val="0"/>
-          <w:numId w:val="15"/>
+          <w:numId w:val="14"/>
         </w:numPr>
         <w:rPr>
           <w:color w:val="000000" w:themeColor="text1"/>
@@ -6028,14 +6333,15 @@
           <w:szCs w:val="28"/>
           <w:lang w:val="en-IE"/>
         </w:rPr>
-        <w:t xml:space="preserve">Perform end-to-end testing. </w:t>
-      </w:r>
-    </w:p>
-    <w:p>
-      <w:pPr>
+        <w:t xml:space="preserve">Add dashboard charts and operational data visualisations. </w:t>
+      </w:r>
+    </w:p>
+    <w:p>
+      <w:pPr>
+        <w:pStyle w:val="ListParagraph"/>
         <w:numPr>
           <w:ilvl w:val="0"/>
-          <w:numId w:val="15"/>
+          <w:numId w:val="14"/>
         </w:numPr>
         <w:rPr>
           <w:color w:val="000000" w:themeColor="text1"/>
@@ -6051,17 +6357,31 @@
           <w:szCs w:val="28"/>
           <w:lang w:val="en-IE"/>
         </w:rPr>
-        <w:t>Begin project documentation.</w:t>
-      </w:r>
-    </w:p>
-    <w:p>
-      <w:pPr>
+        <w:t xml:space="preserve">Perform end-to-end testing. </w:t>
+      </w:r>
+    </w:p>
+    <w:p>
+      <w:pPr>
+        <w:pStyle w:val="ListParagraph"/>
+        <w:numPr>
+          <w:ilvl w:val="0"/>
+          <w:numId w:val="14"/>
+        </w:numPr>
         <w:rPr>
           <w:color w:val="000000" w:themeColor="text1"/>
           <w:sz w:val="28"/>
           <w:szCs w:val="28"/>
         </w:rPr>
       </w:pPr>
+      <w:r>
+        <w:rPr>
+          <w:color w:val="000000" w:themeColor="text1"/>
+          <w:sz w:val="28"/>
+          <w:szCs w:val="28"/>
+          <w:lang w:val="en-IE"/>
+        </w:rPr>
+        <w:t>Complete final project documentation</w:t>
+      </w:r>
     </w:p>
     <w:sectPr>
       <w:pgSz w:w="12240" w:h="15840"/>
@@ -6297,6 +6617,119 @@
     </w:lvl>
   </w:abstractNum>
   <w:abstractNum w:abstractNumId="9" w15:restartNumberingAfterBreak="0">
+    <w:nsid w:val="054602A3"/>
+    <w:multiLevelType w:val="hybridMultilevel"/>
+    <w:tmpl w:val="977C0816"/>
+    <w:lvl w:ilvl="0" w:tplc="18090001">
+      <w:start w:val="1"/>
+      <w:numFmt w:val="bullet"/>
+      <w:lvlText w:val=""/>
+      <w:lvlJc w:val="left"/>
+      <w:pPr>
+        <w:ind w:left="720" w:hanging="360"/>
+      </w:pPr>
+      <w:rPr>
+        <w:rFonts w:ascii="Symbol" w:hAnsi="Symbol" w:hint="default"/>
+      </w:rPr>
+    </w:lvl>
+    <w:lvl w:ilvl="1" w:tplc="18090003" w:tentative="1">
+      <w:start w:val="1"/>
+      <w:numFmt w:val="bullet"/>
+      <w:lvlText w:val="o"/>
+      <w:lvlJc w:val="left"/>
+      <w:pPr>
+        <w:ind w:left="1440" w:hanging="360"/>
+      </w:pPr>
+      <w:rPr>
+        <w:rFonts w:ascii="Courier New" w:hAnsi="Courier New" w:cs="Courier New" w:hint="default"/>
+      </w:rPr>
+    </w:lvl>
+    <w:lvl w:ilvl="2" w:tplc="18090005" w:tentative="1">
+      <w:start w:val="1"/>
+      <w:numFmt w:val="bullet"/>
+      <w:lvlText w:val=""/>
+      <w:lvlJc w:val="left"/>
+      <w:pPr>
+        <w:ind w:left="2160" w:hanging="360"/>
+      </w:pPr>
+      <w:rPr>
+        <w:rFonts w:ascii="Wingdings" w:hAnsi="Wingdings" w:hint="default"/>
+      </w:rPr>
+    </w:lvl>
+    <w:lvl w:ilvl="3" w:tplc="18090001" w:tentative="1">
+      <w:start w:val="1"/>
+      <w:numFmt w:val="bullet"/>
+      <w:lvlText w:val=""/>
+      <w:lvlJc w:val="left"/>
+      <w:pPr>
+        <w:ind w:left="2880" w:hanging="360"/>
+      </w:pPr>
+      <w:rPr>
+        <w:rFonts w:ascii="Symbol" w:hAnsi="Symbol" w:hint="default"/>
+      </w:rPr>
+    </w:lvl>
+    <w:lvl w:ilvl="4" w:tplc="18090003" w:tentative="1">
+      <w:start w:val="1"/>
+      <w:numFmt w:val="bullet"/>
+      <w:lvlText w:val="o"/>
+      <w:lvlJc w:val="left"/>
+      <w:pPr>
+        <w:ind w:left="3600" w:hanging="360"/>
+      </w:pPr>
+      <w:rPr>
+        <w:rFonts w:ascii="Courier New" w:hAnsi="Courier New" w:cs="Courier New" w:hint="default"/>
+      </w:rPr>
+    </w:lvl>
+    <w:lvl w:ilvl="5" w:tplc="18090005" w:tentative="1">
+      <w:start w:val="1"/>
+      <w:numFmt w:val="bullet"/>
+      <w:lvlText w:val=""/>
+      <w:lvlJc w:val="left"/>
+      <w:pPr>
+        <w:ind w:left="4320" w:hanging="360"/>
+      </w:pPr>
+      <w:rPr>
+        <w:rFonts w:ascii="Wingdings" w:hAnsi="Wingdings" w:hint="default"/>
+      </w:rPr>
+    </w:lvl>
+    <w:lvl w:ilvl="6" w:tplc="18090001" w:tentative="1">
+      <w:start w:val="1"/>
+      <w:numFmt w:val="bullet"/>
+      <w:lvlText w:val=""/>
+      <w:lvlJc w:val="left"/>
+      <w:pPr>
+        <w:ind w:left="5040" w:hanging="360"/>
+      </w:pPr>
+      <w:rPr>
+        <w:rFonts w:ascii="Symbol" w:hAnsi="Symbol" w:hint="default"/>
+      </w:rPr>
+    </w:lvl>
+    <w:lvl w:ilvl="7" w:tplc="18090003" w:tentative="1">
+      <w:start w:val="1"/>
+      <w:numFmt w:val="bullet"/>
+      <w:lvlText w:val="o"/>
+      <w:lvlJc w:val="left"/>
+      <w:pPr>
+        <w:ind w:left="5760" w:hanging="360"/>
+      </w:pPr>
+      <w:rPr>
+        <w:rFonts w:ascii="Courier New" w:hAnsi="Courier New" w:cs="Courier New" w:hint="default"/>
+      </w:rPr>
+    </w:lvl>
+    <w:lvl w:ilvl="8" w:tplc="18090005" w:tentative="1">
+      <w:start w:val="1"/>
+      <w:numFmt w:val="bullet"/>
+      <w:lvlText w:val=""/>
+      <w:lvlJc w:val="left"/>
+      <w:pPr>
+        <w:ind w:left="6480" w:hanging="360"/>
+      </w:pPr>
+      <w:rPr>
+        <w:rFonts w:ascii="Wingdings" w:hAnsi="Wingdings" w:hint="default"/>
+      </w:rPr>
+    </w:lvl>
+  </w:abstractNum>
+  <w:abstractNum w:abstractNumId="10" w15:restartNumberingAfterBreak="0">
     <w:nsid w:val="0A464F9C"/>
     <w:multiLevelType w:val="hybridMultilevel"/>
     <w:tmpl w:val="9AC639A4"/>
@@ -6409,7 +6842,7 @@
       </w:rPr>
     </w:lvl>
   </w:abstractNum>
-  <w:abstractNum w:abstractNumId="10" w15:restartNumberingAfterBreak="0">
+  <w:abstractNum w:abstractNumId="11" w15:restartNumberingAfterBreak="0">
     <w:nsid w:val="122839BB"/>
     <w:multiLevelType w:val="multilevel"/>
     <w:tmpl w:val="FC20DD98"/>
@@ -6558,7 +6991,7 @@
       </w:rPr>
     </w:lvl>
   </w:abstractNum>
-  <w:abstractNum w:abstractNumId="11" w15:restartNumberingAfterBreak="0">
+  <w:abstractNum w:abstractNumId="12" w15:restartNumberingAfterBreak="0">
     <w:nsid w:val="27D835FC"/>
     <w:multiLevelType w:val="hybridMultilevel"/>
     <w:tmpl w:val="7B4C75A4"/>
@@ -6671,7 +7104,7 @@
       </w:rPr>
     </w:lvl>
   </w:abstractNum>
-  <w:abstractNum w:abstractNumId="12" w15:restartNumberingAfterBreak="0">
+  <w:abstractNum w:abstractNumId="13" w15:restartNumberingAfterBreak="0">
     <w:nsid w:val="3E5E67E7"/>
     <w:multiLevelType w:val="hybridMultilevel"/>
     <w:tmpl w:val="9BFA4006"/>
@@ -6784,7 +7217,7 @@
       </w:rPr>
     </w:lvl>
   </w:abstractNum>
-  <w:abstractNum w:abstractNumId="13" w15:restartNumberingAfterBreak="0">
+  <w:abstractNum w:abstractNumId="14" w15:restartNumberingAfterBreak="0">
     <w:nsid w:val="45EF335E"/>
     <w:multiLevelType w:val="hybridMultilevel"/>
     <w:tmpl w:val="B15A6A94"/>
@@ -6897,7 +7330,7 @@
       </w:rPr>
     </w:lvl>
   </w:abstractNum>
-  <w:abstractNum w:abstractNumId="14" w15:restartNumberingAfterBreak="0">
+  <w:abstractNum w:abstractNumId="15" w15:restartNumberingAfterBreak="0">
     <w:nsid w:val="56FA08AD"/>
     <w:multiLevelType w:val="hybridMultilevel"/>
     <w:tmpl w:val="09C07A04"/>
@@ -7038,22 +7471,25 @@
     <w:abstractNumId w:val="0"/>
   </w:num>
   <w:num w:numId="10" w16cid:durableId="602418386">
+    <w:abstractNumId w:val="12"/>
+  </w:num>
+  <w:num w:numId="11" w16cid:durableId="1595169676">
+    <w:abstractNumId w:val="14"/>
+  </w:num>
+  <w:num w:numId="12" w16cid:durableId="898400234">
+    <w:abstractNumId w:val="10"/>
+  </w:num>
+  <w:num w:numId="13" w16cid:durableId="1153791886">
+    <w:abstractNumId w:val="15"/>
+  </w:num>
+  <w:num w:numId="14" w16cid:durableId="403719604">
+    <w:abstractNumId w:val="13"/>
+  </w:num>
+  <w:num w:numId="15" w16cid:durableId="1783106351">
     <w:abstractNumId w:val="11"/>
   </w:num>
-  <w:num w:numId="11" w16cid:durableId="1595169676">
-    <w:abstractNumId w:val="13"/>
-  </w:num>
-  <w:num w:numId="12" w16cid:durableId="898400234">
+  <w:num w:numId="16" w16cid:durableId="1429426107">
     <w:abstractNumId w:val="9"/>
-  </w:num>
-  <w:num w:numId="13" w16cid:durableId="1153791886">
-    <w:abstractNumId w:val="14"/>
-  </w:num>
-  <w:num w:numId="14" w16cid:durableId="403719604">
-    <w:abstractNumId w:val="12"/>
-  </w:num>
-  <w:num w:numId="15" w16cid:durableId="1783106351">
-    <w:abstractNumId w:val="10"/>
   </w:num>
 </w:numbering>
 </file>

</xml_diff>

<commit_message>
Remove observation module and simplify lifecycle workflow
</commit_message>
<xml_diff>
--- a/docs/scrum/Sprint_1_to_4_Documentation_initial_Draft.docx
+++ b/docs/scrum/Sprint_1_to_4_Documentation_initial_Draft.docx
@@ -6383,6 +6383,2296 @@
         <w:t>Complete final project documentation</w:t>
       </w:r>
     </w:p>
+    <w:p>
+      <w:pPr>
+        <w:rPr>
+          <w:color w:val="000000" w:themeColor="text1"/>
+          <w:sz w:val="28"/>
+          <w:szCs w:val="28"/>
+        </w:rPr>
+      </w:pPr>
+    </w:p>
+    <w:p>
+      <w:pPr>
+        <w:rPr>
+          <w:color w:val="000000" w:themeColor="text1"/>
+          <w:sz w:val="28"/>
+          <w:szCs w:val="28"/>
+        </w:rPr>
+      </w:pPr>
+    </w:p>
+    <w:p>
+      <w:pPr>
+        <w:rPr>
+          <w:color w:val="000000" w:themeColor="text1"/>
+          <w:sz w:val="28"/>
+          <w:szCs w:val="28"/>
+        </w:rPr>
+      </w:pPr>
+    </w:p>
+    <w:p>
+      <w:pPr>
+        <w:rPr>
+          <w:color w:val="000000" w:themeColor="text1"/>
+          <w:sz w:val="28"/>
+          <w:szCs w:val="28"/>
+        </w:rPr>
+      </w:pPr>
+    </w:p>
+    <w:p>
+      <w:pPr>
+        <w:rPr>
+          <w:b/>
+          <w:bCs/>
+          <w:color w:val="548DD4" w:themeColor="text2" w:themeTint="99"/>
+          <w:sz w:val="28"/>
+          <w:szCs w:val="28"/>
+        </w:rPr>
+      </w:pPr>
+      <w:r>
+        <w:rPr>
+          <w:b/>
+          <w:bCs/>
+          <w:color w:val="548DD4" w:themeColor="text2" w:themeTint="99"/>
+          <w:sz w:val="28"/>
+          <w:szCs w:val="28"/>
+        </w:rPr>
+        <w:lastRenderedPageBreak/>
+        <w:t xml:space="preserve">Sprint </w:t>
+      </w:r>
+      <w:r>
+        <w:rPr>
+          <w:b/>
+          <w:bCs/>
+          <w:color w:val="548DD4" w:themeColor="text2" w:themeTint="99"/>
+          <w:sz w:val="28"/>
+          <w:szCs w:val="28"/>
+        </w:rPr>
+        <w:t>6</w:t>
+      </w:r>
+    </w:p>
+    <w:p>
+      <w:pPr>
+        <w:rPr>
+          <w:b/>
+          <w:bCs/>
+          <w:color w:val="548DD4" w:themeColor="text2" w:themeTint="99"/>
+          <w:sz w:val="28"/>
+          <w:szCs w:val="28"/>
+        </w:rPr>
+      </w:pPr>
+    </w:p>
+    <w:p>
+      <w:pPr>
+        <w:rPr>
+          <w:color w:val="000000" w:themeColor="text1"/>
+          <w:sz w:val="28"/>
+          <w:szCs w:val="28"/>
+          <w:lang w:val="en-IE"/>
+        </w:rPr>
+      </w:pPr>
+      <w:r>
+        <w:rPr>
+          <w:color w:val="000000" w:themeColor="text1"/>
+          <w:sz w:val="28"/>
+          <w:szCs w:val="28"/>
+          <w:lang w:val="en-IE"/>
+        </w:rPr>
+        <w:t>Complete the core operational features of the Container Lifecycle Management System by implementing container management, approval workflows, and operational dashboards, while validating the complete lifecycle through end-to-end testing.</w:t>
+      </w:r>
+    </w:p>
+    <w:tbl>
+      <w:tblPr>
+        <w:tblStyle w:val="TableGrid"/>
+        <w:tblW w:w="0" w:type="auto"/>
+        <w:tblLook w:val="04A0" w:firstRow="1" w:lastRow="0" w:firstColumn="1" w:lastColumn="0" w:noHBand="0" w:noVBand="1"/>
+      </w:tblPr>
+      <w:tblGrid>
+        <w:gridCol w:w="809"/>
+        <w:gridCol w:w="3881"/>
+        <w:gridCol w:w="1147"/>
+        <w:gridCol w:w="1354"/>
+        <w:gridCol w:w="1439"/>
+      </w:tblGrid>
+      <w:tr>
+        <w:tc>
+          <w:tcPr>
+            <w:tcW w:w="0" w:type="auto"/>
+            <w:hideMark/>
+          </w:tcPr>
+          <w:p>
+            <w:pPr>
+              <w:spacing w:after="200" w:line="276" w:lineRule="auto"/>
+              <w:rPr>
+                <w:color w:val="000000" w:themeColor="text1"/>
+                <w:sz w:val="28"/>
+                <w:szCs w:val="28"/>
+                <w:lang w:val="en-IE"/>
+              </w:rPr>
+            </w:pPr>
+            <w:r>
+              <w:rPr>
+                <w:color w:val="000000" w:themeColor="text1"/>
+                <w:sz w:val="28"/>
+                <w:szCs w:val="28"/>
+                <w:lang w:val="en-IE"/>
+              </w:rPr>
+              <w:t>ID</w:t>
+            </w:r>
+          </w:p>
+        </w:tc>
+        <w:tc>
+          <w:tcPr>
+            <w:tcW w:w="0" w:type="auto"/>
+            <w:hideMark/>
+          </w:tcPr>
+          <w:p>
+            <w:pPr>
+              <w:spacing w:after="200" w:line="276" w:lineRule="auto"/>
+              <w:rPr>
+                <w:color w:val="000000" w:themeColor="text1"/>
+                <w:sz w:val="28"/>
+                <w:szCs w:val="28"/>
+                <w:lang w:val="en-IE"/>
+              </w:rPr>
+            </w:pPr>
+            <w:r>
+              <w:rPr>
+                <w:color w:val="000000" w:themeColor="text1"/>
+                <w:sz w:val="28"/>
+                <w:szCs w:val="28"/>
+                <w:lang w:val="en-IE"/>
+              </w:rPr>
+              <w:t>User Story</w:t>
+            </w:r>
+          </w:p>
+        </w:tc>
+        <w:tc>
+          <w:tcPr>
+            <w:tcW w:w="0" w:type="auto"/>
+            <w:hideMark/>
+          </w:tcPr>
+          <w:p>
+            <w:pPr>
+              <w:spacing w:after="200" w:line="276" w:lineRule="auto"/>
+              <w:rPr>
+                <w:color w:val="000000" w:themeColor="text1"/>
+                <w:sz w:val="28"/>
+                <w:szCs w:val="28"/>
+                <w:lang w:val="en-IE"/>
+              </w:rPr>
+            </w:pPr>
+            <w:r>
+              <w:rPr>
+                <w:color w:val="000000" w:themeColor="text1"/>
+                <w:sz w:val="28"/>
+                <w:szCs w:val="28"/>
+                <w:lang w:val="en-IE"/>
+              </w:rPr>
+              <w:t>Priority</w:t>
+            </w:r>
+          </w:p>
+        </w:tc>
+        <w:tc>
+          <w:tcPr>
+            <w:tcW w:w="0" w:type="auto"/>
+            <w:hideMark/>
+          </w:tcPr>
+          <w:p>
+            <w:pPr>
+              <w:spacing w:after="200" w:line="276" w:lineRule="auto"/>
+              <w:rPr>
+                <w:color w:val="000000" w:themeColor="text1"/>
+                <w:sz w:val="28"/>
+                <w:szCs w:val="28"/>
+                <w:lang w:val="en-IE"/>
+              </w:rPr>
+            </w:pPr>
+            <w:r>
+              <w:rPr>
+                <w:color w:val="000000" w:themeColor="text1"/>
+                <w:sz w:val="28"/>
+                <w:szCs w:val="28"/>
+                <w:lang w:val="en-IE"/>
+              </w:rPr>
+              <w:t>Story Points</w:t>
+            </w:r>
+          </w:p>
+        </w:tc>
+        <w:tc>
+          <w:tcPr>
+            <w:tcW w:w="0" w:type="auto"/>
+            <w:hideMark/>
+          </w:tcPr>
+          <w:p>
+            <w:pPr>
+              <w:spacing w:after="200" w:line="276" w:lineRule="auto"/>
+              <w:rPr>
+                <w:color w:val="000000" w:themeColor="text1"/>
+                <w:sz w:val="28"/>
+                <w:szCs w:val="28"/>
+                <w:lang w:val="en-IE"/>
+              </w:rPr>
+            </w:pPr>
+            <w:r>
+              <w:rPr>
+                <w:color w:val="000000" w:themeColor="text1"/>
+                <w:sz w:val="28"/>
+                <w:szCs w:val="28"/>
+                <w:lang w:val="en-IE"/>
+              </w:rPr>
+              <w:t>Status</w:t>
+            </w:r>
+          </w:p>
+        </w:tc>
+      </w:tr>
+      <w:tr>
+        <w:tc>
+          <w:tcPr>
+            <w:tcW w:w="0" w:type="auto"/>
+            <w:hideMark/>
+          </w:tcPr>
+          <w:p>
+            <w:pPr>
+              <w:spacing w:after="200" w:line="276" w:lineRule="auto"/>
+              <w:rPr>
+                <w:color w:val="000000" w:themeColor="text1"/>
+                <w:sz w:val="28"/>
+                <w:szCs w:val="28"/>
+                <w:lang w:val="en-IE"/>
+              </w:rPr>
+            </w:pPr>
+            <w:r>
+              <w:rPr>
+                <w:color w:val="000000" w:themeColor="text1"/>
+                <w:sz w:val="28"/>
+                <w:szCs w:val="28"/>
+                <w:lang w:val="en-IE"/>
+              </w:rPr>
+              <w:t>PB-22</w:t>
+            </w:r>
+          </w:p>
+        </w:tc>
+        <w:tc>
+          <w:tcPr>
+            <w:tcW w:w="0" w:type="auto"/>
+            <w:hideMark/>
+          </w:tcPr>
+          <w:p>
+            <w:pPr>
+              <w:spacing w:after="200" w:line="276" w:lineRule="auto"/>
+              <w:rPr>
+                <w:color w:val="000000" w:themeColor="text1"/>
+                <w:sz w:val="28"/>
+                <w:szCs w:val="28"/>
+                <w:lang w:val="en-IE"/>
+              </w:rPr>
+            </w:pPr>
+            <w:r>
+              <w:rPr>
+                <w:color w:val="000000" w:themeColor="text1"/>
+                <w:sz w:val="28"/>
+                <w:szCs w:val="28"/>
+                <w:lang w:val="en-IE"/>
+              </w:rPr>
+              <w:t>Develop Container Management Interface</w:t>
+            </w:r>
+          </w:p>
+        </w:tc>
+        <w:tc>
+          <w:tcPr>
+            <w:tcW w:w="0" w:type="auto"/>
+            <w:hideMark/>
+          </w:tcPr>
+          <w:p>
+            <w:pPr>
+              <w:spacing w:after="200" w:line="276" w:lineRule="auto"/>
+              <w:rPr>
+                <w:color w:val="000000" w:themeColor="text1"/>
+                <w:sz w:val="28"/>
+                <w:szCs w:val="28"/>
+                <w:lang w:val="en-IE"/>
+              </w:rPr>
+            </w:pPr>
+            <w:r>
+              <w:rPr>
+                <w:color w:val="000000" w:themeColor="text1"/>
+                <w:sz w:val="28"/>
+                <w:szCs w:val="28"/>
+                <w:lang w:val="en-IE"/>
+              </w:rPr>
+              <w:t>Must</w:t>
+            </w:r>
+          </w:p>
+        </w:tc>
+        <w:tc>
+          <w:tcPr>
+            <w:tcW w:w="0" w:type="auto"/>
+            <w:hideMark/>
+          </w:tcPr>
+          <w:p>
+            <w:pPr>
+              <w:spacing w:after="200" w:line="276" w:lineRule="auto"/>
+              <w:rPr>
+                <w:color w:val="000000" w:themeColor="text1"/>
+                <w:sz w:val="28"/>
+                <w:szCs w:val="28"/>
+                <w:lang w:val="en-IE"/>
+              </w:rPr>
+            </w:pPr>
+            <w:r>
+              <w:rPr>
+                <w:color w:val="000000" w:themeColor="text1"/>
+                <w:sz w:val="28"/>
+                <w:szCs w:val="28"/>
+                <w:lang w:val="en-IE"/>
+              </w:rPr>
+              <w:t>5</w:t>
+            </w:r>
+          </w:p>
+        </w:tc>
+        <w:tc>
+          <w:tcPr>
+            <w:tcW w:w="0" w:type="auto"/>
+            <w:hideMark/>
+          </w:tcPr>
+          <w:p>
+            <w:pPr>
+              <w:spacing w:after="200" w:line="276" w:lineRule="auto"/>
+              <w:rPr>
+                <w:color w:val="000000" w:themeColor="text1"/>
+                <w:sz w:val="28"/>
+                <w:szCs w:val="28"/>
+                <w:lang w:val="en-IE"/>
+              </w:rPr>
+            </w:pPr>
+            <w:r>
+              <w:rPr>
+                <w:color w:val="000000" w:themeColor="text1"/>
+                <w:sz w:val="28"/>
+                <w:szCs w:val="28"/>
+                <w:lang w:val="en-IE"/>
+              </w:rPr>
+              <w:t>Done</w:t>
+            </w:r>
+          </w:p>
+        </w:tc>
+      </w:tr>
+      <w:tr>
+        <w:tc>
+          <w:tcPr>
+            <w:tcW w:w="0" w:type="auto"/>
+            <w:hideMark/>
+          </w:tcPr>
+          <w:p>
+            <w:pPr>
+              <w:spacing w:after="200" w:line="276" w:lineRule="auto"/>
+              <w:rPr>
+                <w:color w:val="000000" w:themeColor="text1"/>
+                <w:sz w:val="28"/>
+                <w:szCs w:val="28"/>
+                <w:lang w:val="en-IE"/>
+              </w:rPr>
+            </w:pPr>
+            <w:r>
+              <w:rPr>
+                <w:color w:val="000000" w:themeColor="text1"/>
+                <w:sz w:val="28"/>
+                <w:szCs w:val="28"/>
+                <w:lang w:val="en-IE"/>
+              </w:rPr>
+              <w:t>PB-23</w:t>
+            </w:r>
+          </w:p>
+        </w:tc>
+        <w:tc>
+          <w:tcPr>
+            <w:tcW w:w="0" w:type="auto"/>
+            <w:hideMark/>
+          </w:tcPr>
+          <w:p>
+            <w:pPr>
+              <w:spacing w:after="200" w:line="276" w:lineRule="auto"/>
+              <w:rPr>
+                <w:color w:val="000000" w:themeColor="text1"/>
+                <w:sz w:val="28"/>
+                <w:szCs w:val="28"/>
+                <w:lang w:val="en-IE"/>
+              </w:rPr>
+            </w:pPr>
+            <w:r>
+              <w:rPr>
+                <w:color w:val="000000" w:themeColor="text1"/>
+                <w:sz w:val="28"/>
+                <w:szCs w:val="28"/>
+                <w:lang w:val="en-IE"/>
+              </w:rPr>
+              <w:t>Implement Approval Workflow Interface</w:t>
+            </w:r>
+          </w:p>
+        </w:tc>
+        <w:tc>
+          <w:tcPr>
+            <w:tcW w:w="0" w:type="auto"/>
+            <w:hideMark/>
+          </w:tcPr>
+          <w:p>
+            <w:pPr>
+              <w:spacing w:after="200" w:line="276" w:lineRule="auto"/>
+              <w:rPr>
+                <w:color w:val="000000" w:themeColor="text1"/>
+                <w:sz w:val="28"/>
+                <w:szCs w:val="28"/>
+                <w:lang w:val="en-IE"/>
+              </w:rPr>
+            </w:pPr>
+            <w:r>
+              <w:rPr>
+                <w:color w:val="000000" w:themeColor="text1"/>
+                <w:sz w:val="28"/>
+                <w:szCs w:val="28"/>
+                <w:lang w:val="en-IE"/>
+              </w:rPr>
+              <w:t>Must</w:t>
+            </w:r>
+          </w:p>
+        </w:tc>
+        <w:tc>
+          <w:tcPr>
+            <w:tcW w:w="0" w:type="auto"/>
+            <w:hideMark/>
+          </w:tcPr>
+          <w:p>
+            <w:pPr>
+              <w:spacing w:after="200" w:line="276" w:lineRule="auto"/>
+              <w:rPr>
+                <w:color w:val="000000" w:themeColor="text1"/>
+                <w:sz w:val="28"/>
+                <w:szCs w:val="28"/>
+                <w:lang w:val="en-IE"/>
+              </w:rPr>
+            </w:pPr>
+            <w:r>
+              <w:rPr>
+                <w:color w:val="000000" w:themeColor="text1"/>
+                <w:sz w:val="28"/>
+                <w:szCs w:val="28"/>
+                <w:lang w:val="en-IE"/>
+              </w:rPr>
+              <w:t>8</w:t>
+            </w:r>
+          </w:p>
+        </w:tc>
+        <w:tc>
+          <w:tcPr>
+            <w:tcW w:w="0" w:type="auto"/>
+            <w:hideMark/>
+          </w:tcPr>
+          <w:p>
+            <w:pPr>
+              <w:spacing w:after="200" w:line="276" w:lineRule="auto"/>
+              <w:rPr>
+                <w:color w:val="000000" w:themeColor="text1"/>
+                <w:sz w:val="28"/>
+                <w:szCs w:val="28"/>
+                <w:lang w:val="en-IE"/>
+              </w:rPr>
+            </w:pPr>
+            <w:r>
+              <w:rPr>
+                <w:color w:val="000000" w:themeColor="text1"/>
+                <w:sz w:val="28"/>
+                <w:szCs w:val="28"/>
+                <w:lang w:val="en-IE"/>
+              </w:rPr>
+              <w:t>Done</w:t>
+            </w:r>
+          </w:p>
+        </w:tc>
+      </w:tr>
+      <w:tr>
+        <w:tc>
+          <w:tcPr>
+            <w:tcW w:w="0" w:type="auto"/>
+            <w:hideMark/>
+          </w:tcPr>
+          <w:p>
+            <w:pPr>
+              <w:spacing w:after="200" w:line="276" w:lineRule="auto"/>
+              <w:rPr>
+                <w:color w:val="000000" w:themeColor="text1"/>
+                <w:sz w:val="28"/>
+                <w:szCs w:val="28"/>
+                <w:lang w:val="en-IE"/>
+              </w:rPr>
+            </w:pPr>
+            <w:r>
+              <w:rPr>
+                <w:color w:val="000000" w:themeColor="text1"/>
+                <w:sz w:val="28"/>
+                <w:szCs w:val="28"/>
+                <w:lang w:val="en-IE"/>
+              </w:rPr>
+              <w:t>PB-24</w:t>
+            </w:r>
+          </w:p>
+        </w:tc>
+        <w:tc>
+          <w:tcPr>
+            <w:tcW w:w="0" w:type="auto"/>
+            <w:hideMark/>
+          </w:tcPr>
+          <w:p>
+            <w:pPr>
+              <w:spacing w:after="200" w:line="276" w:lineRule="auto"/>
+              <w:rPr>
+                <w:color w:val="000000" w:themeColor="text1"/>
+                <w:sz w:val="28"/>
+                <w:szCs w:val="28"/>
+                <w:lang w:val="en-IE"/>
+              </w:rPr>
+            </w:pPr>
+            <w:r>
+              <w:rPr>
+                <w:color w:val="000000" w:themeColor="text1"/>
+                <w:sz w:val="28"/>
+                <w:szCs w:val="28"/>
+                <w:lang w:val="en-IE"/>
+              </w:rPr>
+              <w:t>Enhance Dashboard with Operational Metrics</w:t>
+            </w:r>
+          </w:p>
+        </w:tc>
+        <w:tc>
+          <w:tcPr>
+            <w:tcW w:w="0" w:type="auto"/>
+            <w:hideMark/>
+          </w:tcPr>
+          <w:p>
+            <w:pPr>
+              <w:spacing w:after="200" w:line="276" w:lineRule="auto"/>
+              <w:rPr>
+                <w:color w:val="000000" w:themeColor="text1"/>
+                <w:sz w:val="28"/>
+                <w:szCs w:val="28"/>
+                <w:lang w:val="en-IE"/>
+              </w:rPr>
+            </w:pPr>
+            <w:r>
+              <w:rPr>
+                <w:color w:val="000000" w:themeColor="text1"/>
+                <w:sz w:val="28"/>
+                <w:szCs w:val="28"/>
+                <w:lang w:val="en-IE"/>
+              </w:rPr>
+              <w:t>Must</w:t>
+            </w:r>
+          </w:p>
+        </w:tc>
+        <w:tc>
+          <w:tcPr>
+            <w:tcW w:w="0" w:type="auto"/>
+            <w:hideMark/>
+          </w:tcPr>
+          <w:p>
+            <w:pPr>
+              <w:spacing w:after="200" w:line="276" w:lineRule="auto"/>
+              <w:rPr>
+                <w:color w:val="000000" w:themeColor="text1"/>
+                <w:sz w:val="28"/>
+                <w:szCs w:val="28"/>
+                <w:lang w:val="en-IE"/>
+              </w:rPr>
+            </w:pPr>
+            <w:r>
+              <w:rPr>
+                <w:color w:val="000000" w:themeColor="text1"/>
+                <w:sz w:val="28"/>
+                <w:szCs w:val="28"/>
+                <w:lang w:val="en-IE"/>
+              </w:rPr>
+              <w:t>5</w:t>
+            </w:r>
+          </w:p>
+        </w:tc>
+        <w:tc>
+          <w:tcPr>
+            <w:tcW w:w="0" w:type="auto"/>
+            <w:hideMark/>
+          </w:tcPr>
+          <w:p>
+            <w:pPr>
+              <w:spacing w:after="200" w:line="276" w:lineRule="auto"/>
+              <w:rPr>
+                <w:color w:val="000000" w:themeColor="text1"/>
+                <w:sz w:val="28"/>
+                <w:szCs w:val="28"/>
+                <w:lang w:val="en-IE"/>
+              </w:rPr>
+            </w:pPr>
+            <w:r>
+              <w:rPr>
+                <w:color w:val="000000" w:themeColor="text1"/>
+                <w:sz w:val="28"/>
+                <w:szCs w:val="28"/>
+                <w:lang w:val="en-IE"/>
+              </w:rPr>
+              <w:t>In Progress</w:t>
+            </w:r>
+          </w:p>
+        </w:tc>
+      </w:tr>
+    </w:tbl>
+    <w:p>
+      <w:pPr>
+        <w:rPr>
+          <w:b/>
+          <w:bCs/>
+          <w:color w:val="548DD4" w:themeColor="text2" w:themeTint="99"/>
+          <w:sz w:val="28"/>
+          <w:szCs w:val="28"/>
+        </w:rPr>
+      </w:pPr>
+    </w:p>
+    <w:p>
+      <w:pPr>
+        <w:rPr>
+          <w:color w:val="000000" w:themeColor="text1"/>
+          <w:sz w:val="28"/>
+          <w:szCs w:val="28"/>
+          <w:lang w:val="en-IE"/>
+        </w:rPr>
+      </w:pPr>
+    </w:p>
+    <w:p>
+      <w:pPr>
+        <w:rPr>
+          <w:color w:val="000000" w:themeColor="text1"/>
+          <w:sz w:val="28"/>
+          <w:szCs w:val="28"/>
+          <w:lang w:val="en-IE"/>
+        </w:rPr>
+      </w:pPr>
+    </w:p>
+    <w:p>
+      <w:pPr>
+        <w:rPr>
+          <w:color w:val="000000" w:themeColor="text1"/>
+          <w:sz w:val="28"/>
+          <w:szCs w:val="28"/>
+          <w:lang w:val="en-IE"/>
+        </w:rPr>
+      </w:pPr>
+    </w:p>
+    <w:p>
+      <w:pPr>
+        <w:rPr>
+          <w:color w:val="000000" w:themeColor="text1"/>
+          <w:sz w:val="28"/>
+          <w:szCs w:val="28"/>
+          <w:lang w:val="en-IE"/>
+        </w:rPr>
+      </w:pPr>
+    </w:p>
+    <w:p>
+      <w:pPr>
+        <w:rPr>
+          <w:color w:val="000000" w:themeColor="text1"/>
+          <w:sz w:val="28"/>
+          <w:szCs w:val="28"/>
+          <w:lang w:val="en-IE"/>
+        </w:rPr>
+      </w:pPr>
+    </w:p>
+    <w:p>
+      <w:pPr>
+        <w:rPr>
+          <w:color w:val="000000" w:themeColor="text1"/>
+          <w:sz w:val="28"/>
+          <w:szCs w:val="28"/>
+          <w:lang w:val="en-IE"/>
+        </w:rPr>
+      </w:pPr>
+    </w:p>
+    <w:p>
+      <w:pPr>
+        <w:rPr>
+          <w:color w:val="000000" w:themeColor="text1"/>
+          <w:sz w:val="28"/>
+          <w:szCs w:val="28"/>
+          <w:lang w:val="en-IE"/>
+        </w:rPr>
+      </w:pPr>
+    </w:p>
+    <w:p>
+      <w:pPr>
+        <w:rPr>
+          <w:color w:val="000000" w:themeColor="text1"/>
+          <w:sz w:val="28"/>
+          <w:szCs w:val="28"/>
+          <w:lang w:val="en-IE"/>
+        </w:rPr>
+      </w:pPr>
+    </w:p>
+    <w:p>
+      <w:pPr>
+        <w:rPr>
+          <w:color w:val="000000" w:themeColor="text1"/>
+          <w:sz w:val="28"/>
+          <w:szCs w:val="28"/>
+          <w:lang w:val="en-IE"/>
+        </w:rPr>
+      </w:pPr>
+    </w:p>
+    <w:p>
+      <w:pPr>
+        <w:rPr>
+          <w:color w:val="000000" w:themeColor="text1"/>
+          <w:sz w:val="28"/>
+          <w:szCs w:val="28"/>
+          <w:lang w:val="en-IE"/>
+        </w:rPr>
+      </w:pPr>
+    </w:p>
+    <w:p>
+      <w:pPr>
+        <w:rPr>
+          <w:color w:val="000000" w:themeColor="text1"/>
+          <w:sz w:val="28"/>
+          <w:szCs w:val="28"/>
+          <w:lang w:val="en-IE"/>
+        </w:rPr>
+      </w:pPr>
+      <w:r>
+        <w:rPr>
+          <w:color w:val="000000" w:themeColor="text1"/>
+          <w:sz w:val="28"/>
+          <w:szCs w:val="28"/>
+          <w:lang w:val="en-IE"/>
+        </w:rPr>
+        <w:lastRenderedPageBreak/>
+        <w:t>Development Tasks</w:t>
+      </w:r>
+    </w:p>
+    <w:p>
+      <w:pPr>
+        <w:rPr>
+          <w:color w:val="000000" w:themeColor="text1"/>
+          <w:sz w:val="28"/>
+          <w:szCs w:val="28"/>
+          <w:lang w:val="en-IE"/>
+        </w:rPr>
+      </w:pPr>
+      <w:r>
+        <w:rPr>
+          <w:color w:val="000000" w:themeColor="text1"/>
+          <w:sz w:val="28"/>
+          <w:szCs w:val="28"/>
+          <w:lang w:val="en-IE"/>
+        </w:rPr>
+        <w:t>PB-22 – Container Management</w:t>
+      </w:r>
+    </w:p>
+    <w:p>
+      <w:pPr>
+        <w:numPr>
+          <w:ilvl w:val="0"/>
+          <w:numId w:val="17"/>
+        </w:numPr>
+        <w:rPr>
+          <w:color w:val="000000" w:themeColor="text1"/>
+          <w:sz w:val="28"/>
+          <w:szCs w:val="28"/>
+          <w:lang w:val="en-IE"/>
+        </w:rPr>
+      </w:pPr>
+      <w:r>
+        <w:rPr>
+          <w:color w:val="000000" w:themeColor="text1"/>
+          <w:sz w:val="28"/>
+          <w:szCs w:val="28"/>
+          <w:lang w:val="en-IE"/>
+        </w:rPr>
+        <w:t xml:space="preserve">Develop container list page </w:t>
+      </w:r>
+    </w:p>
+    <w:p>
+      <w:pPr>
+        <w:numPr>
+          <w:ilvl w:val="0"/>
+          <w:numId w:val="17"/>
+        </w:numPr>
+        <w:rPr>
+          <w:color w:val="000000" w:themeColor="text1"/>
+          <w:sz w:val="28"/>
+          <w:szCs w:val="28"/>
+          <w:lang w:val="en-IE"/>
+        </w:rPr>
+      </w:pPr>
+      <w:r>
+        <w:rPr>
+          <w:color w:val="000000" w:themeColor="text1"/>
+          <w:sz w:val="28"/>
+          <w:szCs w:val="28"/>
+          <w:lang w:val="en-IE"/>
+        </w:rPr>
+        <w:t xml:space="preserve">Implement container detail view </w:t>
+      </w:r>
+    </w:p>
+    <w:p>
+      <w:pPr>
+        <w:numPr>
+          <w:ilvl w:val="0"/>
+          <w:numId w:val="17"/>
+        </w:numPr>
+        <w:rPr>
+          <w:color w:val="000000" w:themeColor="text1"/>
+          <w:sz w:val="28"/>
+          <w:szCs w:val="28"/>
+          <w:lang w:val="en-IE"/>
+        </w:rPr>
+      </w:pPr>
+      <w:r>
+        <w:rPr>
+          <w:color w:val="000000" w:themeColor="text1"/>
+          <w:sz w:val="28"/>
+          <w:szCs w:val="28"/>
+          <w:lang w:val="en-IE"/>
+        </w:rPr>
+        <w:t xml:space="preserve">Develop movement workflow </w:t>
+      </w:r>
+    </w:p>
+    <w:p>
+      <w:pPr>
+        <w:numPr>
+          <w:ilvl w:val="0"/>
+          <w:numId w:val="17"/>
+        </w:numPr>
+        <w:rPr>
+          <w:color w:val="000000" w:themeColor="text1"/>
+          <w:sz w:val="28"/>
+          <w:szCs w:val="28"/>
+          <w:lang w:val="en-IE"/>
+        </w:rPr>
+      </w:pPr>
+      <w:r>
+        <w:rPr>
+          <w:color w:val="000000" w:themeColor="text1"/>
+          <w:sz w:val="28"/>
+          <w:szCs w:val="28"/>
+          <w:lang w:val="en-IE"/>
+        </w:rPr>
+        <w:t xml:space="preserve">Display lifecycle information </w:t>
+      </w:r>
+    </w:p>
+    <w:p>
+      <w:pPr>
+        <w:numPr>
+          <w:ilvl w:val="0"/>
+          <w:numId w:val="17"/>
+        </w:numPr>
+        <w:rPr>
+          <w:color w:val="000000" w:themeColor="text1"/>
+          <w:sz w:val="28"/>
+          <w:szCs w:val="28"/>
+          <w:lang w:val="en-IE"/>
+        </w:rPr>
+      </w:pPr>
+      <w:r>
+        <w:rPr>
+          <w:color w:val="000000" w:themeColor="text1"/>
+          <w:sz w:val="28"/>
+          <w:szCs w:val="28"/>
+          <w:lang w:val="en-IE"/>
+        </w:rPr>
+        <w:t xml:space="preserve">Implement role-based movement actions </w:t>
+      </w:r>
+    </w:p>
+    <w:p>
+      <w:pPr>
+        <w:rPr>
+          <w:color w:val="000000" w:themeColor="text1"/>
+          <w:sz w:val="28"/>
+          <w:szCs w:val="28"/>
+          <w:lang w:val="en-IE"/>
+        </w:rPr>
+      </w:pPr>
+      <w:r>
+        <w:rPr>
+          <w:color w:val="000000" w:themeColor="text1"/>
+          <w:sz w:val="28"/>
+          <w:szCs w:val="28"/>
+          <w:lang w:val="en-IE"/>
+        </w:rPr>
+        <w:t>PB-23 – Approval Workflow</w:t>
+      </w:r>
+    </w:p>
+    <w:p>
+      <w:pPr>
+        <w:numPr>
+          <w:ilvl w:val="0"/>
+          <w:numId w:val="18"/>
+        </w:numPr>
+        <w:rPr>
+          <w:color w:val="000000" w:themeColor="text1"/>
+          <w:sz w:val="28"/>
+          <w:szCs w:val="28"/>
+          <w:lang w:val="en-IE"/>
+        </w:rPr>
+      </w:pPr>
+      <w:r>
+        <w:rPr>
+          <w:color w:val="000000" w:themeColor="text1"/>
+          <w:sz w:val="28"/>
+          <w:szCs w:val="28"/>
+          <w:lang w:val="en-IE"/>
+        </w:rPr>
+        <w:t xml:space="preserve">Develop approvals page </w:t>
+      </w:r>
+    </w:p>
+    <w:p>
+      <w:pPr>
+        <w:numPr>
+          <w:ilvl w:val="0"/>
+          <w:numId w:val="18"/>
+        </w:numPr>
+        <w:rPr>
+          <w:color w:val="000000" w:themeColor="text1"/>
+          <w:sz w:val="28"/>
+          <w:szCs w:val="28"/>
+          <w:lang w:val="en-IE"/>
+        </w:rPr>
+      </w:pPr>
+      <w:r>
+        <w:rPr>
+          <w:color w:val="000000" w:themeColor="text1"/>
+          <w:sz w:val="28"/>
+          <w:szCs w:val="28"/>
+          <w:lang w:val="en-IE"/>
+        </w:rPr>
+        <w:t xml:space="preserve">Display pending approvals </w:t>
+      </w:r>
+    </w:p>
+    <w:p>
+      <w:pPr>
+        <w:numPr>
+          <w:ilvl w:val="0"/>
+          <w:numId w:val="18"/>
+        </w:numPr>
+        <w:rPr>
+          <w:color w:val="000000" w:themeColor="text1"/>
+          <w:sz w:val="28"/>
+          <w:szCs w:val="28"/>
+          <w:lang w:val="en-IE"/>
+        </w:rPr>
+      </w:pPr>
+      <w:r>
+        <w:rPr>
+          <w:color w:val="000000" w:themeColor="text1"/>
+          <w:sz w:val="28"/>
+          <w:szCs w:val="28"/>
+          <w:lang w:val="en-IE"/>
+        </w:rPr>
+        <w:t xml:space="preserve">Implement Supervisor approval review </w:t>
+      </w:r>
+    </w:p>
+    <w:p>
+      <w:pPr>
+        <w:numPr>
+          <w:ilvl w:val="0"/>
+          <w:numId w:val="18"/>
+        </w:numPr>
+        <w:rPr>
+          <w:color w:val="000000" w:themeColor="text1"/>
+          <w:sz w:val="28"/>
+          <w:szCs w:val="28"/>
+          <w:lang w:val="en-IE"/>
+        </w:rPr>
+      </w:pPr>
+      <w:r>
+        <w:rPr>
+          <w:color w:val="000000" w:themeColor="text1"/>
+          <w:sz w:val="28"/>
+          <w:szCs w:val="28"/>
+          <w:lang w:val="en-IE"/>
+        </w:rPr>
+        <w:t xml:space="preserve">Reset lifecycle following approval </w:t>
+      </w:r>
+    </w:p>
+    <w:p>
+      <w:pPr>
+        <w:numPr>
+          <w:ilvl w:val="0"/>
+          <w:numId w:val="18"/>
+        </w:numPr>
+        <w:rPr>
+          <w:color w:val="000000" w:themeColor="text1"/>
+          <w:sz w:val="28"/>
+          <w:szCs w:val="28"/>
+          <w:lang w:val="en-IE"/>
+        </w:rPr>
+      </w:pPr>
+      <w:r>
+        <w:rPr>
+          <w:color w:val="000000" w:themeColor="text1"/>
+          <w:sz w:val="28"/>
+          <w:szCs w:val="28"/>
+          <w:lang w:val="en-IE"/>
+        </w:rPr>
+        <w:t xml:space="preserve">Validate approval permissions </w:t>
+      </w:r>
+    </w:p>
+    <w:p>
+      <w:pPr>
+        <w:numPr>
+          <w:ilvl w:val="0"/>
+          <w:numId w:val="18"/>
+        </w:numPr>
+        <w:rPr>
+          <w:color w:val="000000" w:themeColor="text1"/>
+          <w:sz w:val="28"/>
+          <w:szCs w:val="28"/>
+          <w:lang w:val="en-IE"/>
+        </w:rPr>
+      </w:pPr>
+      <w:r>
+        <w:rPr>
+          <w:color w:val="000000" w:themeColor="text1"/>
+          <w:sz w:val="28"/>
+          <w:szCs w:val="28"/>
+          <w:lang w:val="en-IE"/>
+        </w:rPr>
+        <w:t xml:space="preserve">Complete end-to-end approval workflow </w:t>
+      </w:r>
+    </w:p>
+    <w:p>
+      <w:pPr>
+        <w:rPr>
+          <w:color w:val="000000" w:themeColor="text1"/>
+          <w:sz w:val="28"/>
+          <w:szCs w:val="28"/>
+          <w:lang w:val="en-IE"/>
+        </w:rPr>
+      </w:pPr>
+      <w:r>
+        <w:rPr>
+          <w:color w:val="000000" w:themeColor="text1"/>
+          <w:sz w:val="28"/>
+          <w:szCs w:val="28"/>
+          <w:lang w:val="en-IE"/>
+        </w:rPr>
+        <w:t>PB-24 – Dashboard</w:t>
+      </w:r>
+    </w:p>
+    <w:p>
+      <w:pPr>
+        <w:numPr>
+          <w:ilvl w:val="0"/>
+          <w:numId w:val="19"/>
+        </w:numPr>
+        <w:rPr>
+          <w:color w:val="000000" w:themeColor="text1"/>
+          <w:sz w:val="28"/>
+          <w:szCs w:val="28"/>
+          <w:lang w:val="en-IE"/>
+        </w:rPr>
+      </w:pPr>
+      <w:r>
+        <w:rPr>
+          <w:color w:val="000000" w:themeColor="text1"/>
+          <w:sz w:val="28"/>
+          <w:szCs w:val="28"/>
+          <w:lang w:val="en-IE"/>
+        </w:rPr>
+        <w:t xml:space="preserve">Display operational summary cards </w:t>
+      </w:r>
+    </w:p>
+    <w:p>
+      <w:pPr>
+        <w:numPr>
+          <w:ilvl w:val="0"/>
+          <w:numId w:val="19"/>
+        </w:numPr>
+        <w:rPr>
+          <w:color w:val="000000" w:themeColor="text1"/>
+          <w:sz w:val="28"/>
+          <w:szCs w:val="28"/>
+          <w:lang w:val="en-IE"/>
+        </w:rPr>
+      </w:pPr>
+      <w:r>
+        <w:rPr>
+          <w:color w:val="000000" w:themeColor="text1"/>
+          <w:sz w:val="28"/>
+          <w:szCs w:val="28"/>
+          <w:lang w:val="en-IE"/>
+        </w:rPr>
+        <w:t xml:space="preserve">Display pending approvals count </w:t>
+      </w:r>
+    </w:p>
+    <w:p>
+      <w:pPr>
+        <w:numPr>
+          <w:ilvl w:val="0"/>
+          <w:numId w:val="19"/>
+        </w:numPr>
+        <w:rPr>
+          <w:color w:val="000000" w:themeColor="text1"/>
+          <w:sz w:val="28"/>
+          <w:szCs w:val="28"/>
+          <w:lang w:val="en-IE"/>
+        </w:rPr>
+      </w:pPr>
+      <w:r>
+        <w:rPr>
+          <w:color w:val="000000" w:themeColor="text1"/>
+          <w:sz w:val="28"/>
+          <w:szCs w:val="28"/>
+          <w:lang w:val="en-IE"/>
+        </w:rPr>
+        <w:t xml:space="preserve">Display production statistics </w:t>
+      </w:r>
+    </w:p>
+    <w:p>
+      <w:pPr>
+        <w:numPr>
+          <w:ilvl w:val="0"/>
+          <w:numId w:val="19"/>
+        </w:numPr>
+        <w:rPr>
+          <w:color w:val="000000" w:themeColor="text1"/>
+          <w:sz w:val="28"/>
+          <w:szCs w:val="28"/>
+          <w:lang w:val="en-IE"/>
+        </w:rPr>
+      </w:pPr>
+      <w:r>
+        <w:rPr>
+          <w:color w:val="000000" w:themeColor="text1"/>
+          <w:sz w:val="28"/>
+          <w:szCs w:val="28"/>
+          <w:lang w:val="en-IE"/>
+        </w:rPr>
+        <w:t xml:space="preserve">Display cleaning statistics </w:t>
+      </w:r>
+    </w:p>
+    <w:p>
+      <w:pPr>
+        <w:numPr>
+          <w:ilvl w:val="0"/>
+          <w:numId w:val="19"/>
+        </w:numPr>
+        <w:rPr>
+          <w:color w:val="000000" w:themeColor="text1"/>
+          <w:sz w:val="28"/>
+          <w:szCs w:val="28"/>
+          <w:lang w:val="en-IE"/>
+        </w:rPr>
+      </w:pPr>
+      <w:r>
+        <w:rPr>
+          <w:color w:val="000000" w:themeColor="text1"/>
+          <w:sz w:val="28"/>
+          <w:szCs w:val="28"/>
+          <w:lang w:val="en-IE"/>
+        </w:rPr>
+        <w:t xml:space="preserve">Add lifecycle warning information </w:t>
+      </w:r>
+    </w:p>
+    <w:p>
+      <w:pPr>
+        <w:numPr>
+          <w:ilvl w:val="0"/>
+          <w:numId w:val="19"/>
+        </w:numPr>
+        <w:rPr>
+          <w:color w:val="000000" w:themeColor="text1"/>
+          <w:sz w:val="28"/>
+          <w:szCs w:val="28"/>
+          <w:lang w:val="en-IE"/>
+        </w:rPr>
+      </w:pPr>
+      <w:r>
+        <w:rPr>
+          <w:color w:val="000000" w:themeColor="text1"/>
+          <w:sz w:val="28"/>
+          <w:szCs w:val="28"/>
+          <w:lang w:val="en-IE"/>
+        </w:rPr>
+        <w:t xml:space="preserve">Prepare dashboard for reporting charts </w:t>
+      </w:r>
+    </w:p>
+    <w:p>
+      <w:pPr>
+        <w:rPr>
+          <w:b/>
+          <w:bCs/>
+          <w:color w:val="000000" w:themeColor="text1"/>
+          <w:sz w:val="28"/>
+          <w:szCs w:val="28"/>
+          <w:lang w:val="en-IE"/>
+        </w:rPr>
+      </w:pPr>
+    </w:p>
+    <w:p>
+      <w:pPr>
+        <w:rPr>
+          <w:b/>
+          <w:bCs/>
+          <w:color w:val="000000" w:themeColor="text1"/>
+          <w:sz w:val="28"/>
+          <w:szCs w:val="28"/>
+          <w:lang w:val="en-IE"/>
+        </w:rPr>
+      </w:pPr>
+      <w:r>
+        <w:rPr>
+          <w:b/>
+          <w:bCs/>
+          <w:color w:val="000000" w:themeColor="text1"/>
+          <w:sz w:val="28"/>
+          <w:szCs w:val="28"/>
+          <w:lang w:val="en-IE"/>
+        </w:rPr>
+        <w:lastRenderedPageBreak/>
+        <w:t>Definition of Done</w:t>
+      </w:r>
+    </w:p>
+    <w:p>
+      <w:pPr>
+        <w:numPr>
+          <w:ilvl w:val="0"/>
+          <w:numId w:val="20"/>
+        </w:numPr>
+        <w:rPr>
+          <w:color w:val="000000" w:themeColor="text1"/>
+          <w:sz w:val="28"/>
+          <w:szCs w:val="28"/>
+          <w:lang w:val="en-IE"/>
+        </w:rPr>
+      </w:pPr>
+      <w:r>
+        <w:rPr>
+          <w:color w:val="000000" w:themeColor="text1"/>
+          <w:sz w:val="28"/>
+          <w:szCs w:val="28"/>
+          <w:lang w:val="en-IE"/>
+        </w:rPr>
+        <w:t xml:space="preserve">Container management pages completed. </w:t>
+      </w:r>
+    </w:p>
+    <w:p>
+      <w:pPr>
+        <w:numPr>
+          <w:ilvl w:val="0"/>
+          <w:numId w:val="20"/>
+        </w:numPr>
+        <w:rPr>
+          <w:color w:val="000000" w:themeColor="text1"/>
+          <w:sz w:val="28"/>
+          <w:szCs w:val="28"/>
+          <w:lang w:val="en-IE"/>
+        </w:rPr>
+      </w:pPr>
+      <w:r>
+        <w:rPr>
+          <w:color w:val="000000" w:themeColor="text1"/>
+          <w:sz w:val="28"/>
+          <w:szCs w:val="28"/>
+          <w:lang w:val="en-IE"/>
+        </w:rPr>
+        <w:t xml:space="preserve">Approval interface implemented. </w:t>
+      </w:r>
+    </w:p>
+    <w:p>
+      <w:pPr>
+        <w:numPr>
+          <w:ilvl w:val="0"/>
+          <w:numId w:val="20"/>
+        </w:numPr>
+        <w:rPr>
+          <w:color w:val="000000" w:themeColor="text1"/>
+          <w:sz w:val="28"/>
+          <w:szCs w:val="28"/>
+          <w:lang w:val="en-IE"/>
+        </w:rPr>
+      </w:pPr>
+      <w:r>
+        <w:rPr>
+          <w:color w:val="000000" w:themeColor="text1"/>
+          <w:sz w:val="28"/>
+          <w:szCs w:val="28"/>
+          <w:lang w:val="en-IE"/>
+        </w:rPr>
+        <w:t xml:space="preserve">Supervisor approval workflow operational. </w:t>
+      </w:r>
+    </w:p>
+    <w:p>
+      <w:pPr>
+        <w:numPr>
+          <w:ilvl w:val="0"/>
+          <w:numId w:val="20"/>
+        </w:numPr>
+        <w:rPr>
+          <w:color w:val="000000" w:themeColor="text1"/>
+          <w:sz w:val="28"/>
+          <w:szCs w:val="28"/>
+          <w:lang w:val="en-IE"/>
+        </w:rPr>
+      </w:pPr>
+      <w:r>
+        <w:rPr>
+          <w:color w:val="000000" w:themeColor="text1"/>
+          <w:sz w:val="28"/>
+          <w:szCs w:val="28"/>
+          <w:lang w:val="en-IE"/>
+        </w:rPr>
+        <w:t xml:space="preserve">Lifecycle reset verified. </w:t>
+      </w:r>
+    </w:p>
+    <w:p>
+      <w:pPr>
+        <w:numPr>
+          <w:ilvl w:val="0"/>
+          <w:numId w:val="20"/>
+        </w:numPr>
+        <w:rPr>
+          <w:color w:val="000000" w:themeColor="text1"/>
+          <w:sz w:val="28"/>
+          <w:szCs w:val="28"/>
+          <w:lang w:val="en-IE"/>
+        </w:rPr>
+      </w:pPr>
+      <w:r>
+        <w:rPr>
+          <w:color w:val="000000" w:themeColor="text1"/>
+          <w:sz w:val="28"/>
+          <w:szCs w:val="28"/>
+          <w:lang w:val="en-IE"/>
+        </w:rPr>
+        <w:t xml:space="preserve">Dashboard displays live operational statistics. </w:t>
+      </w:r>
+    </w:p>
+    <w:p>
+      <w:pPr>
+        <w:numPr>
+          <w:ilvl w:val="0"/>
+          <w:numId w:val="20"/>
+        </w:numPr>
+        <w:rPr>
+          <w:color w:val="000000" w:themeColor="text1"/>
+          <w:sz w:val="28"/>
+          <w:szCs w:val="28"/>
+          <w:lang w:val="en-IE"/>
+        </w:rPr>
+      </w:pPr>
+      <w:r>
+        <w:rPr>
+          <w:color w:val="000000" w:themeColor="text1"/>
+          <w:sz w:val="28"/>
+          <w:szCs w:val="28"/>
+          <w:lang w:val="en-IE"/>
+        </w:rPr>
+        <w:t xml:space="preserve">End-to-end workflow tested. </w:t>
+      </w:r>
+    </w:p>
+    <w:p>
+      <w:pPr>
+        <w:numPr>
+          <w:ilvl w:val="0"/>
+          <w:numId w:val="20"/>
+        </w:numPr>
+        <w:rPr>
+          <w:color w:val="000000" w:themeColor="text1"/>
+          <w:sz w:val="28"/>
+          <w:szCs w:val="28"/>
+          <w:lang w:val="en-IE"/>
+        </w:rPr>
+      </w:pPr>
+      <w:r>
+        <w:rPr>
+          <w:color w:val="000000" w:themeColor="text1"/>
+          <w:sz w:val="28"/>
+          <w:szCs w:val="28"/>
+          <w:lang w:val="en-IE"/>
+        </w:rPr>
+        <w:t xml:space="preserve">Code committed to Git. </w:t>
+      </w:r>
+    </w:p>
+    <w:p>
+      <w:pPr>
+        <w:numPr>
+          <w:ilvl w:val="0"/>
+          <w:numId w:val="20"/>
+        </w:numPr>
+        <w:rPr>
+          <w:color w:val="000000" w:themeColor="text1"/>
+          <w:sz w:val="28"/>
+          <w:szCs w:val="28"/>
+          <w:lang w:val="en-IE"/>
+        </w:rPr>
+      </w:pPr>
+      <w:r>
+        <w:rPr>
+          <w:color w:val="000000" w:themeColor="text1"/>
+          <w:sz w:val="28"/>
+          <w:szCs w:val="28"/>
+          <w:lang w:val="en-IE"/>
+        </w:rPr>
+        <w:t xml:space="preserve">Documentation updated. </w:t>
+      </w:r>
+    </w:p>
+    <w:p>
+      <w:pPr>
+        <w:rPr>
+          <w:color w:val="000000" w:themeColor="text1"/>
+          <w:sz w:val="28"/>
+          <w:szCs w:val="28"/>
+          <w:lang w:val="en-IE"/>
+        </w:rPr>
+      </w:pPr>
+    </w:p>
+    <w:p>
+      <w:pPr>
+        <w:rPr>
+          <w:b/>
+          <w:bCs/>
+          <w:color w:val="000000" w:themeColor="text1"/>
+          <w:sz w:val="28"/>
+          <w:szCs w:val="28"/>
+          <w:lang w:val="en-IE"/>
+        </w:rPr>
+      </w:pPr>
+      <w:r>
+        <w:rPr>
+          <w:b/>
+          <w:bCs/>
+          <w:color w:val="000000" w:themeColor="text1"/>
+          <w:sz w:val="28"/>
+          <w:szCs w:val="28"/>
+          <w:lang w:val="en-IE"/>
+        </w:rPr>
+        <w:t>Sprint Review</w:t>
+      </w:r>
+    </w:p>
+    <w:p>
+      <w:pPr>
+        <w:numPr>
+          <w:ilvl w:val="0"/>
+          <w:numId w:val="21"/>
+        </w:numPr>
+        <w:rPr>
+          <w:color w:val="000000" w:themeColor="text1"/>
+          <w:sz w:val="28"/>
+          <w:szCs w:val="28"/>
+          <w:lang w:val="en-IE"/>
+        </w:rPr>
+      </w:pPr>
+      <w:r>
+        <w:rPr>
+          <w:color w:val="000000" w:themeColor="text1"/>
+          <w:sz w:val="28"/>
+          <w:szCs w:val="28"/>
+          <w:lang w:val="en-IE"/>
+        </w:rPr>
+        <w:t xml:space="preserve">Container management interface completed. </w:t>
+      </w:r>
+    </w:p>
+    <w:p>
+      <w:pPr>
+        <w:numPr>
+          <w:ilvl w:val="0"/>
+          <w:numId w:val="21"/>
+        </w:numPr>
+        <w:rPr>
+          <w:color w:val="000000" w:themeColor="text1"/>
+          <w:sz w:val="28"/>
+          <w:szCs w:val="28"/>
+          <w:lang w:val="en-IE"/>
+        </w:rPr>
+      </w:pPr>
+      <w:r>
+        <w:rPr>
+          <w:color w:val="000000" w:themeColor="text1"/>
+          <w:sz w:val="28"/>
+          <w:szCs w:val="28"/>
+          <w:lang w:val="en-IE"/>
+        </w:rPr>
+        <w:t xml:space="preserve">Container movement workflow implemented. </w:t>
+      </w:r>
+    </w:p>
+    <w:p>
+      <w:pPr>
+        <w:numPr>
+          <w:ilvl w:val="0"/>
+          <w:numId w:val="21"/>
+        </w:numPr>
+        <w:rPr>
+          <w:color w:val="000000" w:themeColor="text1"/>
+          <w:sz w:val="28"/>
+          <w:szCs w:val="28"/>
+          <w:lang w:val="en-IE"/>
+        </w:rPr>
+      </w:pPr>
+      <w:r>
+        <w:rPr>
+          <w:color w:val="000000" w:themeColor="text1"/>
+          <w:sz w:val="28"/>
+          <w:szCs w:val="28"/>
+          <w:lang w:val="en-IE"/>
+        </w:rPr>
+        <w:t xml:space="preserve">Production lifecycle tracking verified. </w:t>
+      </w:r>
+    </w:p>
+    <w:p>
+      <w:pPr>
+        <w:numPr>
+          <w:ilvl w:val="0"/>
+          <w:numId w:val="21"/>
+        </w:numPr>
+        <w:rPr>
+          <w:color w:val="000000" w:themeColor="text1"/>
+          <w:sz w:val="28"/>
+          <w:szCs w:val="28"/>
+          <w:lang w:val="en-IE"/>
+        </w:rPr>
+      </w:pPr>
+      <w:r>
+        <w:rPr>
+          <w:color w:val="000000" w:themeColor="text1"/>
+          <w:sz w:val="28"/>
+          <w:szCs w:val="28"/>
+          <w:lang w:val="en-IE"/>
+        </w:rPr>
+        <w:t xml:space="preserve">Automatic lifecycle expiry implemented. </w:t>
+      </w:r>
+    </w:p>
+    <w:p>
+      <w:pPr>
+        <w:numPr>
+          <w:ilvl w:val="0"/>
+          <w:numId w:val="21"/>
+        </w:numPr>
+        <w:rPr>
+          <w:color w:val="000000" w:themeColor="text1"/>
+          <w:sz w:val="28"/>
+          <w:szCs w:val="28"/>
+          <w:lang w:val="en-IE"/>
+        </w:rPr>
+      </w:pPr>
+      <w:r>
+        <w:rPr>
+          <w:color w:val="000000" w:themeColor="text1"/>
+          <w:sz w:val="28"/>
+          <w:szCs w:val="28"/>
+          <w:lang w:val="en-IE"/>
+        </w:rPr>
+        <w:t xml:space="preserve">Automatic transition to Cleaning implemented. </w:t>
+      </w:r>
+    </w:p>
+    <w:p>
+      <w:pPr>
+        <w:numPr>
+          <w:ilvl w:val="0"/>
+          <w:numId w:val="21"/>
+        </w:numPr>
+        <w:rPr>
+          <w:color w:val="000000" w:themeColor="text1"/>
+          <w:sz w:val="28"/>
+          <w:szCs w:val="28"/>
+          <w:lang w:val="en-IE"/>
+        </w:rPr>
+      </w:pPr>
+      <w:r>
+        <w:rPr>
+          <w:color w:val="000000" w:themeColor="text1"/>
+          <w:sz w:val="28"/>
+          <w:szCs w:val="28"/>
+          <w:lang w:val="en-IE"/>
+        </w:rPr>
+        <w:t xml:space="preserve">Supervisor approval requests generated automatically. </w:t>
+      </w:r>
+    </w:p>
+    <w:p>
+      <w:pPr>
+        <w:numPr>
+          <w:ilvl w:val="0"/>
+          <w:numId w:val="21"/>
+        </w:numPr>
+        <w:rPr>
+          <w:color w:val="000000" w:themeColor="text1"/>
+          <w:sz w:val="28"/>
+          <w:szCs w:val="28"/>
+          <w:lang w:val="en-IE"/>
+        </w:rPr>
+      </w:pPr>
+      <w:r>
+        <w:rPr>
+          <w:color w:val="000000" w:themeColor="text1"/>
+          <w:sz w:val="28"/>
+          <w:szCs w:val="28"/>
+          <w:lang w:val="en-IE"/>
+        </w:rPr>
+        <w:t xml:space="preserve">Supervisor approval interface completed. </w:t>
+      </w:r>
+    </w:p>
+    <w:p>
+      <w:pPr>
+        <w:numPr>
+          <w:ilvl w:val="0"/>
+          <w:numId w:val="21"/>
+        </w:numPr>
+        <w:rPr>
+          <w:color w:val="000000" w:themeColor="text1"/>
+          <w:sz w:val="28"/>
+          <w:szCs w:val="28"/>
+          <w:lang w:val="en-IE"/>
+        </w:rPr>
+      </w:pPr>
+      <w:r>
+        <w:rPr>
+          <w:color w:val="000000" w:themeColor="text1"/>
+          <w:sz w:val="28"/>
+          <w:szCs w:val="28"/>
+          <w:lang w:val="en-IE"/>
+        </w:rPr>
+        <w:t xml:space="preserve">Lifecycle reset successfully implemented. </w:t>
+      </w:r>
+    </w:p>
+    <w:p>
+      <w:pPr>
+        <w:numPr>
+          <w:ilvl w:val="0"/>
+          <w:numId w:val="21"/>
+        </w:numPr>
+        <w:rPr>
+          <w:color w:val="000000" w:themeColor="text1"/>
+          <w:sz w:val="28"/>
+          <w:szCs w:val="28"/>
+          <w:lang w:val="en-IE"/>
+        </w:rPr>
+      </w:pPr>
+      <w:r>
+        <w:rPr>
+          <w:color w:val="000000" w:themeColor="text1"/>
+          <w:sz w:val="28"/>
+          <w:szCs w:val="28"/>
+          <w:lang w:val="en-IE"/>
+        </w:rPr>
+        <w:t xml:space="preserve">New lifecycle begins correctly after approval. </w:t>
+      </w:r>
+    </w:p>
+    <w:p>
+      <w:pPr>
+        <w:numPr>
+          <w:ilvl w:val="0"/>
+          <w:numId w:val="21"/>
+        </w:numPr>
+        <w:rPr>
+          <w:color w:val="000000" w:themeColor="text1"/>
+          <w:sz w:val="28"/>
+          <w:szCs w:val="28"/>
+          <w:lang w:val="en-IE"/>
+        </w:rPr>
+      </w:pPr>
+      <w:r>
+        <w:rPr>
+          <w:color w:val="000000" w:themeColor="text1"/>
+          <w:sz w:val="28"/>
+          <w:szCs w:val="28"/>
+          <w:lang w:val="en-IE"/>
+        </w:rPr>
+        <w:t xml:space="preserve">Dashboard operational statistics enhanced. </w:t>
+      </w:r>
+    </w:p>
+    <w:p>
+      <w:pPr>
+        <w:numPr>
+          <w:ilvl w:val="0"/>
+          <w:numId w:val="21"/>
+        </w:numPr>
+        <w:rPr>
+          <w:color w:val="000000" w:themeColor="text1"/>
+          <w:sz w:val="28"/>
+          <w:szCs w:val="28"/>
+          <w:lang w:val="en-IE"/>
+        </w:rPr>
+      </w:pPr>
+      <w:r>
+        <w:rPr>
+          <w:color w:val="000000" w:themeColor="text1"/>
+          <w:sz w:val="28"/>
+          <w:szCs w:val="28"/>
+          <w:lang w:val="en-IE"/>
+        </w:rPr>
+        <w:t xml:space="preserve">Complete lifecycle successfully demonstrated through end-to-end testing. </w:t>
+      </w:r>
+    </w:p>
+    <w:p>
+      <w:pPr>
+        <w:rPr>
+          <w:color w:val="000000" w:themeColor="text1"/>
+          <w:sz w:val="28"/>
+          <w:szCs w:val="28"/>
+          <w:lang w:val="en-IE"/>
+        </w:rPr>
+      </w:pPr>
+    </w:p>
+    <w:p>
+      <w:pPr>
+        <w:rPr>
+          <w:b/>
+          <w:bCs/>
+          <w:color w:val="000000" w:themeColor="text1"/>
+          <w:sz w:val="28"/>
+          <w:szCs w:val="28"/>
+          <w:lang w:val="en-IE"/>
+        </w:rPr>
+      </w:pPr>
+      <w:r>
+        <w:rPr>
+          <w:b/>
+          <w:bCs/>
+          <w:color w:val="000000" w:themeColor="text1"/>
+          <w:sz w:val="28"/>
+          <w:szCs w:val="28"/>
+          <w:lang w:val="en-IE"/>
+        </w:rPr>
+        <w:t>What Went Well</w:t>
+      </w:r>
+    </w:p>
+    <w:p>
+      <w:pPr>
+        <w:numPr>
+          <w:ilvl w:val="0"/>
+          <w:numId w:val="22"/>
+        </w:numPr>
+        <w:rPr>
+          <w:color w:val="000000" w:themeColor="text1"/>
+          <w:sz w:val="28"/>
+          <w:szCs w:val="28"/>
+          <w:lang w:val="en-IE"/>
+        </w:rPr>
+      </w:pPr>
+      <w:r>
+        <w:rPr>
+          <w:color w:val="000000" w:themeColor="text1"/>
+          <w:sz w:val="28"/>
+          <w:szCs w:val="28"/>
+          <w:lang w:val="en-IE"/>
+        </w:rPr>
+        <w:t xml:space="preserve">Business rules were successfully enforced throughout the application. </w:t>
+      </w:r>
+    </w:p>
+    <w:p>
+      <w:pPr>
+        <w:numPr>
+          <w:ilvl w:val="0"/>
+          <w:numId w:val="22"/>
+        </w:numPr>
+        <w:rPr>
+          <w:color w:val="000000" w:themeColor="text1"/>
+          <w:sz w:val="28"/>
+          <w:szCs w:val="28"/>
+          <w:lang w:val="en-IE"/>
+        </w:rPr>
+      </w:pPr>
+      <w:r>
+        <w:rPr>
+          <w:color w:val="000000" w:themeColor="text1"/>
+          <w:sz w:val="28"/>
+          <w:szCs w:val="28"/>
+          <w:lang w:val="en-IE"/>
+        </w:rPr>
+        <w:t xml:space="preserve">Backend and frontend integration progressed smoothly. </w:t>
+      </w:r>
+    </w:p>
+    <w:p>
+      <w:pPr>
+        <w:numPr>
+          <w:ilvl w:val="0"/>
+          <w:numId w:val="22"/>
+        </w:numPr>
+        <w:rPr>
+          <w:color w:val="000000" w:themeColor="text1"/>
+          <w:sz w:val="28"/>
+          <w:szCs w:val="28"/>
+          <w:lang w:val="en-IE"/>
+        </w:rPr>
+      </w:pPr>
+      <w:r>
+        <w:rPr>
+          <w:color w:val="000000" w:themeColor="text1"/>
+          <w:sz w:val="28"/>
+          <w:szCs w:val="28"/>
+          <w:lang w:val="en-IE"/>
+        </w:rPr>
+        <w:t xml:space="preserve">Lifecycle workflow is now stable and fully operational. </w:t>
+      </w:r>
+    </w:p>
+    <w:p>
+      <w:pPr>
+        <w:numPr>
+          <w:ilvl w:val="0"/>
+          <w:numId w:val="22"/>
+        </w:numPr>
+        <w:rPr>
+          <w:color w:val="000000" w:themeColor="text1"/>
+          <w:sz w:val="28"/>
+          <w:szCs w:val="28"/>
+          <w:lang w:val="en-IE"/>
+        </w:rPr>
+      </w:pPr>
+      <w:r>
+        <w:rPr>
+          <w:color w:val="000000" w:themeColor="text1"/>
+          <w:sz w:val="28"/>
+          <w:szCs w:val="28"/>
+          <w:lang w:val="en-IE"/>
+        </w:rPr>
+        <w:t xml:space="preserve">Approval workflow behaves consistently with business requirements. </w:t>
+      </w:r>
+    </w:p>
+    <w:p>
+      <w:pPr>
+        <w:numPr>
+          <w:ilvl w:val="0"/>
+          <w:numId w:val="22"/>
+        </w:numPr>
+        <w:rPr>
+          <w:color w:val="000000" w:themeColor="text1"/>
+          <w:sz w:val="28"/>
+          <w:szCs w:val="28"/>
+          <w:lang w:val="en-IE"/>
+        </w:rPr>
+      </w:pPr>
+      <w:r>
+        <w:rPr>
+          <w:color w:val="000000" w:themeColor="text1"/>
+          <w:sz w:val="28"/>
+          <w:szCs w:val="28"/>
+          <w:lang w:val="en-IE"/>
+        </w:rPr>
+        <w:t xml:space="preserve">React components remained reusable across multiple pages. </w:t>
+      </w:r>
+    </w:p>
+    <w:p>
+      <w:pPr>
+        <w:numPr>
+          <w:ilvl w:val="0"/>
+          <w:numId w:val="22"/>
+        </w:numPr>
+        <w:rPr>
+          <w:color w:val="000000" w:themeColor="text1"/>
+          <w:sz w:val="28"/>
+          <w:szCs w:val="28"/>
+          <w:lang w:val="en-IE"/>
+        </w:rPr>
+      </w:pPr>
+      <w:r>
+        <w:rPr>
+          <w:color w:val="000000" w:themeColor="text1"/>
+          <w:sz w:val="28"/>
+          <w:szCs w:val="28"/>
+          <w:lang w:val="en-IE"/>
+        </w:rPr>
+        <w:t xml:space="preserve">End-to-end testing confirmed the complete container lifecycle. </w:t>
+      </w:r>
+    </w:p>
+    <w:p>
+      <w:pPr>
+        <w:rPr>
+          <w:color w:val="000000" w:themeColor="text1"/>
+          <w:sz w:val="28"/>
+          <w:szCs w:val="28"/>
+          <w:lang w:val="en-IE"/>
+        </w:rPr>
+      </w:pPr>
+    </w:p>
+    <w:p>
+      <w:pPr>
+        <w:rPr>
+          <w:b/>
+          <w:bCs/>
+          <w:color w:val="000000" w:themeColor="text1"/>
+          <w:sz w:val="28"/>
+          <w:szCs w:val="28"/>
+          <w:lang w:val="en-IE"/>
+        </w:rPr>
+      </w:pPr>
+      <w:r>
+        <w:rPr>
+          <w:b/>
+          <w:bCs/>
+          <w:color w:val="000000" w:themeColor="text1"/>
+          <w:sz w:val="28"/>
+          <w:szCs w:val="28"/>
+          <w:lang w:val="en-IE"/>
+        </w:rPr>
+        <w:t>Challenges</w:t>
+      </w:r>
+    </w:p>
+    <w:p>
+      <w:pPr>
+        <w:numPr>
+          <w:ilvl w:val="0"/>
+          <w:numId w:val="23"/>
+        </w:numPr>
+        <w:rPr>
+          <w:color w:val="000000" w:themeColor="text1"/>
+          <w:sz w:val="28"/>
+          <w:szCs w:val="28"/>
+          <w:lang w:val="en-IE"/>
+        </w:rPr>
+      </w:pPr>
+      <w:r>
+        <w:rPr>
+          <w:color w:val="000000" w:themeColor="text1"/>
+          <w:sz w:val="28"/>
+          <w:szCs w:val="28"/>
+          <w:lang w:val="en-IE"/>
+        </w:rPr>
+        <w:t xml:space="preserve">Debugging lifecycle state transitions. </w:t>
+      </w:r>
+    </w:p>
+    <w:p>
+      <w:pPr>
+        <w:numPr>
+          <w:ilvl w:val="0"/>
+          <w:numId w:val="23"/>
+        </w:numPr>
+        <w:rPr>
+          <w:color w:val="000000" w:themeColor="text1"/>
+          <w:sz w:val="28"/>
+          <w:szCs w:val="28"/>
+          <w:lang w:val="en-IE"/>
+        </w:rPr>
+      </w:pPr>
+      <w:r>
+        <w:rPr>
+          <w:color w:val="000000" w:themeColor="text1"/>
+          <w:sz w:val="28"/>
+          <w:szCs w:val="28"/>
+          <w:lang w:val="en-IE"/>
+        </w:rPr>
+        <w:t xml:space="preserve">Synchronising frontend updates with backend workflow changes. </w:t>
+      </w:r>
+    </w:p>
+    <w:p>
+      <w:pPr>
+        <w:numPr>
+          <w:ilvl w:val="0"/>
+          <w:numId w:val="23"/>
+        </w:numPr>
+        <w:rPr>
+          <w:color w:val="000000" w:themeColor="text1"/>
+          <w:sz w:val="28"/>
+          <w:szCs w:val="28"/>
+          <w:lang w:val="en-IE"/>
+        </w:rPr>
+      </w:pPr>
+      <w:r>
+        <w:rPr>
+          <w:color w:val="000000" w:themeColor="text1"/>
+          <w:sz w:val="28"/>
+          <w:szCs w:val="28"/>
+          <w:lang w:val="en-IE"/>
+        </w:rPr>
+        <w:t xml:space="preserve">Managing approval logic for multiple lifecycle states. </w:t>
+      </w:r>
+    </w:p>
+    <w:p>
+      <w:pPr>
+        <w:numPr>
+          <w:ilvl w:val="0"/>
+          <w:numId w:val="23"/>
+        </w:numPr>
+        <w:rPr>
+          <w:color w:val="000000" w:themeColor="text1"/>
+          <w:sz w:val="28"/>
+          <w:szCs w:val="28"/>
+          <w:lang w:val="en-IE"/>
+        </w:rPr>
+      </w:pPr>
+      <w:r>
+        <w:rPr>
+          <w:color w:val="000000" w:themeColor="text1"/>
+          <w:sz w:val="28"/>
+          <w:szCs w:val="28"/>
+          <w:lang w:val="en-IE"/>
+        </w:rPr>
+        <w:t xml:space="preserve">Ensuring lifecycle counters reset correctly after Supervisor approval. </w:t>
+      </w:r>
+    </w:p>
+    <w:p>
+      <w:pPr>
+        <w:numPr>
+          <w:ilvl w:val="0"/>
+          <w:numId w:val="23"/>
+        </w:numPr>
+        <w:rPr>
+          <w:color w:val="000000" w:themeColor="text1"/>
+          <w:sz w:val="28"/>
+          <w:szCs w:val="28"/>
+          <w:lang w:val="en-IE"/>
+        </w:rPr>
+      </w:pPr>
+      <w:r>
+        <w:rPr>
+          <w:color w:val="000000" w:themeColor="text1"/>
+          <w:sz w:val="28"/>
+          <w:szCs w:val="28"/>
+          <w:lang w:val="en-IE"/>
+        </w:rPr>
+        <w:t xml:space="preserve">Handling edge cases during expiry and approval processing. </w:t>
+      </w:r>
+    </w:p>
+    <w:p>
+      <w:pPr>
+        <w:rPr>
+          <w:color w:val="000000" w:themeColor="text1"/>
+          <w:sz w:val="28"/>
+          <w:szCs w:val="28"/>
+          <w:lang w:val="en-IE"/>
+        </w:rPr>
+      </w:pPr>
+    </w:p>
+    <w:p>
+      <w:pPr>
+        <w:rPr>
+          <w:b/>
+          <w:bCs/>
+          <w:color w:val="000000" w:themeColor="text1"/>
+          <w:sz w:val="28"/>
+          <w:szCs w:val="28"/>
+          <w:lang w:val="en-IE"/>
+        </w:rPr>
+      </w:pPr>
+      <w:r>
+        <w:rPr>
+          <w:b/>
+          <w:bCs/>
+          <w:color w:val="000000" w:themeColor="text1"/>
+          <w:sz w:val="28"/>
+          <w:szCs w:val="28"/>
+          <w:lang w:val="en-IE"/>
+        </w:rPr>
+        <w:t>Focus for Sprint 7</w:t>
+      </w:r>
+    </w:p>
+    <w:p>
+      <w:pPr>
+        <w:numPr>
+          <w:ilvl w:val="0"/>
+          <w:numId w:val="24"/>
+        </w:numPr>
+        <w:rPr>
+          <w:color w:val="000000" w:themeColor="text1"/>
+          <w:sz w:val="28"/>
+          <w:szCs w:val="28"/>
+          <w:lang w:val="en-IE"/>
+        </w:rPr>
+      </w:pPr>
+      <w:r>
+        <w:rPr>
+          <w:color w:val="000000" w:themeColor="text1"/>
+          <w:sz w:val="28"/>
+          <w:szCs w:val="28"/>
+          <w:lang w:val="en-IE"/>
+        </w:rPr>
+        <w:t xml:space="preserve">Complete dashboard charts and visualisations. </w:t>
+      </w:r>
+    </w:p>
+    <w:p>
+      <w:pPr>
+        <w:numPr>
+          <w:ilvl w:val="0"/>
+          <w:numId w:val="24"/>
+        </w:numPr>
+        <w:rPr>
+          <w:color w:val="000000" w:themeColor="text1"/>
+          <w:sz w:val="28"/>
+          <w:szCs w:val="28"/>
+          <w:lang w:val="en-IE"/>
+        </w:rPr>
+      </w:pPr>
+      <w:r>
+        <w:rPr>
+          <w:color w:val="000000" w:themeColor="text1"/>
+          <w:sz w:val="28"/>
+          <w:szCs w:val="28"/>
+          <w:lang w:val="en-IE"/>
+        </w:rPr>
+        <w:t xml:space="preserve">Develop reporting page. </w:t>
+      </w:r>
+    </w:p>
+    <w:p>
+      <w:pPr>
+        <w:numPr>
+          <w:ilvl w:val="0"/>
+          <w:numId w:val="24"/>
+        </w:numPr>
+        <w:rPr>
+          <w:color w:val="000000" w:themeColor="text1"/>
+          <w:sz w:val="28"/>
+          <w:szCs w:val="28"/>
+          <w:lang w:val="en-IE"/>
+        </w:rPr>
+      </w:pPr>
+      <w:r>
+        <w:rPr>
+          <w:color w:val="000000" w:themeColor="text1"/>
+          <w:sz w:val="28"/>
+          <w:szCs w:val="28"/>
+          <w:lang w:val="en-IE"/>
+        </w:rPr>
+        <w:t xml:space="preserve">Implement observations management. </w:t>
+      </w:r>
+    </w:p>
+    <w:p>
+      <w:pPr>
+        <w:numPr>
+          <w:ilvl w:val="0"/>
+          <w:numId w:val="24"/>
+        </w:numPr>
+        <w:rPr>
+          <w:color w:val="000000" w:themeColor="text1"/>
+          <w:sz w:val="28"/>
+          <w:szCs w:val="28"/>
+          <w:lang w:val="en-IE"/>
+        </w:rPr>
+      </w:pPr>
+      <w:r>
+        <w:rPr>
+          <w:color w:val="000000" w:themeColor="text1"/>
+          <w:sz w:val="28"/>
+          <w:szCs w:val="28"/>
+          <w:lang w:val="en-IE"/>
+        </w:rPr>
+        <w:lastRenderedPageBreak/>
+        <w:t xml:space="preserve">Add predictive analytics visualisations. </w:t>
+      </w:r>
+    </w:p>
+    <w:p>
+      <w:pPr>
+        <w:numPr>
+          <w:ilvl w:val="0"/>
+          <w:numId w:val="24"/>
+        </w:numPr>
+        <w:rPr>
+          <w:color w:val="000000" w:themeColor="text1"/>
+          <w:sz w:val="28"/>
+          <w:szCs w:val="28"/>
+          <w:lang w:val="en-IE"/>
+        </w:rPr>
+      </w:pPr>
+      <w:r>
+        <w:rPr>
+          <w:color w:val="000000" w:themeColor="text1"/>
+          <w:sz w:val="28"/>
+          <w:szCs w:val="28"/>
+          <w:lang w:val="en-IE"/>
+        </w:rPr>
+        <w:t xml:space="preserve">Improve UI consistency and responsiveness. </w:t>
+      </w:r>
+    </w:p>
+    <w:p>
+      <w:pPr>
+        <w:numPr>
+          <w:ilvl w:val="0"/>
+          <w:numId w:val="24"/>
+        </w:numPr>
+        <w:rPr>
+          <w:color w:val="000000" w:themeColor="text1"/>
+          <w:sz w:val="28"/>
+          <w:szCs w:val="28"/>
+          <w:lang w:val="en-IE"/>
+        </w:rPr>
+      </w:pPr>
+      <w:r>
+        <w:rPr>
+          <w:color w:val="000000" w:themeColor="text1"/>
+          <w:sz w:val="28"/>
+          <w:szCs w:val="28"/>
+          <w:lang w:val="en-IE"/>
+        </w:rPr>
+        <w:t xml:space="preserve">Complete final testing. </w:t>
+      </w:r>
+    </w:p>
+    <w:p>
+      <w:pPr>
+        <w:numPr>
+          <w:ilvl w:val="0"/>
+          <w:numId w:val="24"/>
+        </w:numPr>
+        <w:rPr>
+          <w:color w:val="000000" w:themeColor="text1"/>
+          <w:sz w:val="28"/>
+          <w:szCs w:val="28"/>
+          <w:lang w:val="en-IE"/>
+        </w:rPr>
+      </w:pPr>
+      <w:r>
+        <w:rPr>
+          <w:color w:val="000000" w:themeColor="text1"/>
+          <w:sz w:val="28"/>
+          <w:szCs w:val="28"/>
+          <w:lang w:val="en-IE"/>
+        </w:rPr>
+        <w:t xml:space="preserve">Complete dissertation documentation. </w:t>
+      </w:r>
+    </w:p>
+    <w:p>
+      <w:pPr>
+        <w:numPr>
+          <w:ilvl w:val="0"/>
+          <w:numId w:val="24"/>
+        </w:numPr>
+        <w:rPr>
+          <w:color w:val="000000" w:themeColor="text1"/>
+          <w:sz w:val="28"/>
+          <w:szCs w:val="28"/>
+          <w:lang w:val="en-IE"/>
+        </w:rPr>
+      </w:pPr>
+      <w:r>
+        <w:rPr>
+          <w:color w:val="000000" w:themeColor="text1"/>
+          <w:sz w:val="28"/>
+          <w:szCs w:val="28"/>
+          <w:lang w:val="en-IE"/>
+        </w:rPr>
+        <w:t>Prepare final project demonstration.</w:t>
+      </w:r>
+    </w:p>
+    <w:p>
+      <w:pPr>
+        <w:rPr>
+          <w:color w:val="000000" w:themeColor="text1"/>
+          <w:sz w:val="28"/>
+          <w:szCs w:val="28"/>
+          <w:lang w:val="en-IE"/>
+        </w:rPr>
+      </w:pPr>
+    </w:p>
+    <w:p>
+      <w:pPr>
+        <w:rPr>
+          <w:color w:val="000000" w:themeColor="text1"/>
+          <w:sz w:val="28"/>
+          <w:szCs w:val="28"/>
+        </w:rPr>
+      </w:pPr>
+    </w:p>
+    <w:p>
+      <w:pPr>
+        <w:rPr>
+          <w:color w:val="000000" w:themeColor="text1"/>
+          <w:sz w:val="28"/>
+          <w:szCs w:val="28"/>
+        </w:rPr>
+      </w:pPr>
+    </w:p>
     <w:sectPr>
       <w:pgSz w:w="12240" w:h="15840"/>
       <w:pgMar w:top="1440" w:right="1800" w:bottom="1440" w:left="1800" w:header="720" w:footer="720" w:gutter="0"/>
@@ -6992,6 +9282,304 @@
     </w:lvl>
   </w:abstractNum>
   <w:abstractNum w:abstractNumId="12" w15:restartNumberingAfterBreak="0">
+    <w:nsid w:val="122A7EF6"/>
+    <w:multiLevelType w:val="multilevel"/>
+    <w:tmpl w:val="F34E82EC"/>
+    <w:lvl w:ilvl="0">
+      <w:start w:val="1"/>
+      <w:numFmt w:val="bullet"/>
+      <w:lvlText w:val=""/>
+      <w:lvlJc w:val="left"/>
+      <w:pPr>
+        <w:tabs>
+          <w:tab w:val="num" w:pos="720"/>
+        </w:tabs>
+        <w:ind w:left="720" w:hanging="360"/>
+      </w:pPr>
+      <w:rPr>
+        <w:rFonts w:ascii="Symbol" w:hAnsi="Symbol" w:hint="default"/>
+        <w:sz w:val="20"/>
+      </w:rPr>
+    </w:lvl>
+    <w:lvl w:ilvl="1" w:tentative="1">
+      <w:start w:val="1"/>
+      <w:numFmt w:val="bullet"/>
+      <w:lvlText w:val="o"/>
+      <w:lvlJc w:val="left"/>
+      <w:pPr>
+        <w:tabs>
+          <w:tab w:val="num" w:pos="1440"/>
+        </w:tabs>
+        <w:ind w:left="1440" w:hanging="360"/>
+      </w:pPr>
+      <w:rPr>
+        <w:rFonts w:ascii="Courier New" w:hAnsi="Courier New" w:hint="default"/>
+        <w:sz w:val="20"/>
+      </w:rPr>
+    </w:lvl>
+    <w:lvl w:ilvl="2" w:tentative="1">
+      <w:start w:val="1"/>
+      <w:numFmt w:val="bullet"/>
+      <w:lvlText w:val=""/>
+      <w:lvlJc w:val="left"/>
+      <w:pPr>
+        <w:tabs>
+          <w:tab w:val="num" w:pos="2160"/>
+        </w:tabs>
+        <w:ind w:left="2160" w:hanging="360"/>
+      </w:pPr>
+      <w:rPr>
+        <w:rFonts w:ascii="Wingdings" w:hAnsi="Wingdings" w:hint="default"/>
+        <w:sz w:val="20"/>
+      </w:rPr>
+    </w:lvl>
+    <w:lvl w:ilvl="3" w:tentative="1">
+      <w:start w:val="1"/>
+      <w:numFmt w:val="bullet"/>
+      <w:lvlText w:val=""/>
+      <w:lvlJc w:val="left"/>
+      <w:pPr>
+        <w:tabs>
+          <w:tab w:val="num" w:pos="2880"/>
+        </w:tabs>
+        <w:ind w:left="2880" w:hanging="360"/>
+      </w:pPr>
+      <w:rPr>
+        <w:rFonts w:ascii="Wingdings" w:hAnsi="Wingdings" w:hint="default"/>
+        <w:sz w:val="20"/>
+      </w:rPr>
+    </w:lvl>
+    <w:lvl w:ilvl="4" w:tentative="1">
+      <w:start w:val="1"/>
+      <w:numFmt w:val="bullet"/>
+      <w:lvlText w:val=""/>
+      <w:lvlJc w:val="left"/>
+      <w:pPr>
+        <w:tabs>
+          <w:tab w:val="num" w:pos="3600"/>
+        </w:tabs>
+        <w:ind w:left="3600" w:hanging="360"/>
+      </w:pPr>
+      <w:rPr>
+        <w:rFonts w:ascii="Wingdings" w:hAnsi="Wingdings" w:hint="default"/>
+        <w:sz w:val="20"/>
+      </w:rPr>
+    </w:lvl>
+    <w:lvl w:ilvl="5" w:tentative="1">
+      <w:start w:val="1"/>
+      <w:numFmt w:val="bullet"/>
+      <w:lvlText w:val=""/>
+      <w:lvlJc w:val="left"/>
+      <w:pPr>
+        <w:tabs>
+          <w:tab w:val="num" w:pos="4320"/>
+        </w:tabs>
+        <w:ind w:left="4320" w:hanging="360"/>
+      </w:pPr>
+      <w:rPr>
+        <w:rFonts w:ascii="Wingdings" w:hAnsi="Wingdings" w:hint="default"/>
+        <w:sz w:val="20"/>
+      </w:rPr>
+    </w:lvl>
+    <w:lvl w:ilvl="6" w:tentative="1">
+      <w:start w:val="1"/>
+      <w:numFmt w:val="bullet"/>
+      <w:lvlText w:val=""/>
+      <w:lvlJc w:val="left"/>
+      <w:pPr>
+        <w:tabs>
+          <w:tab w:val="num" w:pos="5040"/>
+        </w:tabs>
+        <w:ind w:left="5040" w:hanging="360"/>
+      </w:pPr>
+      <w:rPr>
+        <w:rFonts w:ascii="Wingdings" w:hAnsi="Wingdings" w:hint="default"/>
+        <w:sz w:val="20"/>
+      </w:rPr>
+    </w:lvl>
+    <w:lvl w:ilvl="7" w:tentative="1">
+      <w:start w:val="1"/>
+      <w:numFmt w:val="bullet"/>
+      <w:lvlText w:val=""/>
+      <w:lvlJc w:val="left"/>
+      <w:pPr>
+        <w:tabs>
+          <w:tab w:val="num" w:pos="5760"/>
+        </w:tabs>
+        <w:ind w:left="5760" w:hanging="360"/>
+      </w:pPr>
+      <w:rPr>
+        <w:rFonts w:ascii="Wingdings" w:hAnsi="Wingdings" w:hint="default"/>
+        <w:sz w:val="20"/>
+      </w:rPr>
+    </w:lvl>
+    <w:lvl w:ilvl="8" w:tentative="1">
+      <w:start w:val="1"/>
+      <w:numFmt w:val="bullet"/>
+      <w:lvlText w:val=""/>
+      <w:lvlJc w:val="left"/>
+      <w:pPr>
+        <w:tabs>
+          <w:tab w:val="num" w:pos="6480"/>
+        </w:tabs>
+        <w:ind w:left="6480" w:hanging="360"/>
+      </w:pPr>
+      <w:rPr>
+        <w:rFonts w:ascii="Wingdings" w:hAnsi="Wingdings" w:hint="default"/>
+        <w:sz w:val="20"/>
+      </w:rPr>
+    </w:lvl>
+  </w:abstractNum>
+  <w:abstractNum w:abstractNumId="13" w15:restartNumberingAfterBreak="0">
+    <w:nsid w:val="238A1C11"/>
+    <w:multiLevelType w:val="multilevel"/>
+    <w:tmpl w:val="BD8ADED8"/>
+    <w:lvl w:ilvl="0">
+      <w:start w:val="1"/>
+      <w:numFmt w:val="bullet"/>
+      <w:lvlText w:val=""/>
+      <w:lvlJc w:val="left"/>
+      <w:pPr>
+        <w:tabs>
+          <w:tab w:val="num" w:pos="720"/>
+        </w:tabs>
+        <w:ind w:left="720" w:hanging="360"/>
+      </w:pPr>
+      <w:rPr>
+        <w:rFonts w:ascii="Symbol" w:hAnsi="Symbol" w:hint="default"/>
+        <w:sz w:val="20"/>
+      </w:rPr>
+    </w:lvl>
+    <w:lvl w:ilvl="1" w:tentative="1">
+      <w:start w:val="1"/>
+      <w:numFmt w:val="bullet"/>
+      <w:lvlText w:val="o"/>
+      <w:lvlJc w:val="left"/>
+      <w:pPr>
+        <w:tabs>
+          <w:tab w:val="num" w:pos="1440"/>
+        </w:tabs>
+        <w:ind w:left="1440" w:hanging="360"/>
+      </w:pPr>
+      <w:rPr>
+        <w:rFonts w:ascii="Courier New" w:hAnsi="Courier New" w:hint="default"/>
+        <w:sz w:val="20"/>
+      </w:rPr>
+    </w:lvl>
+    <w:lvl w:ilvl="2" w:tentative="1">
+      <w:start w:val="1"/>
+      <w:numFmt w:val="bullet"/>
+      <w:lvlText w:val=""/>
+      <w:lvlJc w:val="left"/>
+      <w:pPr>
+        <w:tabs>
+          <w:tab w:val="num" w:pos="2160"/>
+        </w:tabs>
+        <w:ind w:left="2160" w:hanging="360"/>
+      </w:pPr>
+      <w:rPr>
+        <w:rFonts w:ascii="Wingdings" w:hAnsi="Wingdings" w:hint="default"/>
+        <w:sz w:val="20"/>
+      </w:rPr>
+    </w:lvl>
+    <w:lvl w:ilvl="3" w:tentative="1">
+      <w:start w:val="1"/>
+      <w:numFmt w:val="bullet"/>
+      <w:lvlText w:val=""/>
+      <w:lvlJc w:val="left"/>
+      <w:pPr>
+        <w:tabs>
+          <w:tab w:val="num" w:pos="2880"/>
+        </w:tabs>
+        <w:ind w:left="2880" w:hanging="360"/>
+      </w:pPr>
+      <w:rPr>
+        <w:rFonts w:ascii="Wingdings" w:hAnsi="Wingdings" w:hint="default"/>
+        <w:sz w:val="20"/>
+      </w:rPr>
+    </w:lvl>
+    <w:lvl w:ilvl="4" w:tentative="1">
+      <w:start w:val="1"/>
+      <w:numFmt w:val="bullet"/>
+      <w:lvlText w:val=""/>
+      <w:lvlJc w:val="left"/>
+      <w:pPr>
+        <w:tabs>
+          <w:tab w:val="num" w:pos="3600"/>
+        </w:tabs>
+        <w:ind w:left="3600" w:hanging="360"/>
+      </w:pPr>
+      <w:rPr>
+        <w:rFonts w:ascii="Wingdings" w:hAnsi="Wingdings" w:hint="default"/>
+        <w:sz w:val="20"/>
+      </w:rPr>
+    </w:lvl>
+    <w:lvl w:ilvl="5" w:tentative="1">
+      <w:start w:val="1"/>
+      <w:numFmt w:val="bullet"/>
+      <w:lvlText w:val=""/>
+      <w:lvlJc w:val="left"/>
+      <w:pPr>
+        <w:tabs>
+          <w:tab w:val="num" w:pos="4320"/>
+        </w:tabs>
+        <w:ind w:left="4320" w:hanging="360"/>
+      </w:pPr>
+      <w:rPr>
+        <w:rFonts w:ascii="Wingdings" w:hAnsi="Wingdings" w:hint="default"/>
+        <w:sz w:val="20"/>
+      </w:rPr>
+    </w:lvl>
+    <w:lvl w:ilvl="6" w:tentative="1">
+      <w:start w:val="1"/>
+      <w:numFmt w:val="bullet"/>
+      <w:lvlText w:val=""/>
+      <w:lvlJc w:val="left"/>
+      <w:pPr>
+        <w:tabs>
+          <w:tab w:val="num" w:pos="5040"/>
+        </w:tabs>
+        <w:ind w:left="5040" w:hanging="360"/>
+      </w:pPr>
+      <w:rPr>
+        <w:rFonts w:ascii="Wingdings" w:hAnsi="Wingdings" w:hint="default"/>
+        <w:sz w:val="20"/>
+      </w:rPr>
+    </w:lvl>
+    <w:lvl w:ilvl="7" w:tentative="1">
+      <w:start w:val="1"/>
+      <w:numFmt w:val="bullet"/>
+      <w:lvlText w:val=""/>
+      <w:lvlJc w:val="left"/>
+      <w:pPr>
+        <w:tabs>
+          <w:tab w:val="num" w:pos="5760"/>
+        </w:tabs>
+        <w:ind w:left="5760" w:hanging="360"/>
+      </w:pPr>
+      <w:rPr>
+        <w:rFonts w:ascii="Wingdings" w:hAnsi="Wingdings" w:hint="default"/>
+        <w:sz w:val="20"/>
+      </w:rPr>
+    </w:lvl>
+    <w:lvl w:ilvl="8" w:tentative="1">
+      <w:start w:val="1"/>
+      <w:numFmt w:val="bullet"/>
+      <w:lvlText w:val=""/>
+      <w:lvlJc w:val="left"/>
+      <w:pPr>
+        <w:tabs>
+          <w:tab w:val="num" w:pos="6480"/>
+        </w:tabs>
+        <w:ind w:left="6480" w:hanging="360"/>
+      </w:pPr>
+      <w:rPr>
+        <w:rFonts w:ascii="Wingdings" w:hAnsi="Wingdings" w:hint="default"/>
+        <w:sz w:val="20"/>
+      </w:rPr>
+    </w:lvl>
+  </w:abstractNum>
+  <w:abstractNum w:abstractNumId="14" w15:restartNumberingAfterBreak="0">
     <w:nsid w:val="27D835FC"/>
     <w:multiLevelType w:val="hybridMultilevel"/>
     <w:tmpl w:val="7B4C75A4"/>
@@ -7104,7 +9692,156 @@
       </w:rPr>
     </w:lvl>
   </w:abstractNum>
-  <w:abstractNum w:abstractNumId="13" w15:restartNumberingAfterBreak="0">
+  <w:abstractNum w:abstractNumId="15" w15:restartNumberingAfterBreak="0">
+    <w:nsid w:val="2C23764F"/>
+    <w:multiLevelType w:val="multilevel"/>
+    <w:tmpl w:val="EEDCEBCA"/>
+    <w:lvl w:ilvl="0">
+      <w:start w:val="1"/>
+      <w:numFmt w:val="bullet"/>
+      <w:lvlText w:val=""/>
+      <w:lvlJc w:val="left"/>
+      <w:pPr>
+        <w:tabs>
+          <w:tab w:val="num" w:pos="720"/>
+        </w:tabs>
+        <w:ind w:left="720" w:hanging="360"/>
+      </w:pPr>
+      <w:rPr>
+        <w:rFonts w:ascii="Symbol" w:hAnsi="Symbol" w:hint="default"/>
+        <w:sz w:val="20"/>
+      </w:rPr>
+    </w:lvl>
+    <w:lvl w:ilvl="1" w:tentative="1">
+      <w:start w:val="1"/>
+      <w:numFmt w:val="bullet"/>
+      <w:lvlText w:val="o"/>
+      <w:lvlJc w:val="left"/>
+      <w:pPr>
+        <w:tabs>
+          <w:tab w:val="num" w:pos="1440"/>
+        </w:tabs>
+        <w:ind w:left="1440" w:hanging="360"/>
+      </w:pPr>
+      <w:rPr>
+        <w:rFonts w:ascii="Courier New" w:hAnsi="Courier New" w:hint="default"/>
+        <w:sz w:val="20"/>
+      </w:rPr>
+    </w:lvl>
+    <w:lvl w:ilvl="2" w:tentative="1">
+      <w:start w:val="1"/>
+      <w:numFmt w:val="bullet"/>
+      <w:lvlText w:val=""/>
+      <w:lvlJc w:val="left"/>
+      <w:pPr>
+        <w:tabs>
+          <w:tab w:val="num" w:pos="2160"/>
+        </w:tabs>
+        <w:ind w:left="2160" w:hanging="360"/>
+      </w:pPr>
+      <w:rPr>
+        <w:rFonts w:ascii="Wingdings" w:hAnsi="Wingdings" w:hint="default"/>
+        <w:sz w:val="20"/>
+      </w:rPr>
+    </w:lvl>
+    <w:lvl w:ilvl="3" w:tentative="1">
+      <w:start w:val="1"/>
+      <w:numFmt w:val="bullet"/>
+      <w:lvlText w:val=""/>
+      <w:lvlJc w:val="left"/>
+      <w:pPr>
+        <w:tabs>
+          <w:tab w:val="num" w:pos="2880"/>
+        </w:tabs>
+        <w:ind w:left="2880" w:hanging="360"/>
+      </w:pPr>
+      <w:rPr>
+        <w:rFonts w:ascii="Wingdings" w:hAnsi="Wingdings" w:hint="default"/>
+        <w:sz w:val="20"/>
+      </w:rPr>
+    </w:lvl>
+    <w:lvl w:ilvl="4" w:tentative="1">
+      <w:start w:val="1"/>
+      <w:numFmt w:val="bullet"/>
+      <w:lvlText w:val=""/>
+      <w:lvlJc w:val="left"/>
+      <w:pPr>
+        <w:tabs>
+          <w:tab w:val="num" w:pos="3600"/>
+        </w:tabs>
+        <w:ind w:left="3600" w:hanging="360"/>
+      </w:pPr>
+      <w:rPr>
+        <w:rFonts w:ascii="Wingdings" w:hAnsi="Wingdings" w:hint="default"/>
+        <w:sz w:val="20"/>
+      </w:rPr>
+    </w:lvl>
+    <w:lvl w:ilvl="5" w:tentative="1">
+      <w:start w:val="1"/>
+      <w:numFmt w:val="bullet"/>
+      <w:lvlText w:val=""/>
+      <w:lvlJc w:val="left"/>
+      <w:pPr>
+        <w:tabs>
+          <w:tab w:val="num" w:pos="4320"/>
+        </w:tabs>
+        <w:ind w:left="4320" w:hanging="360"/>
+      </w:pPr>
+      <w:rPr>
+        <w:rFonts w:ascii="Wingdings" w:hAnsi="Wingdings" w:hint="default"/>
+        <w:sz w:val="20"/>
+      </w:rPr>
+    </w:lvl>
+    <w:lvl w:ilvl="6" w:tentative="1">
+      <w:start w:val="1"/>
+      <w:numFmt w:val="bullet"/>
+      <w:lvlText w:val=""/>
+      <w:lvlJc w:val="left"/>
+      <w:pPr>
+        <w:tabs>
+          <w:tab w:val="num" w:pos="5040"/>
+        </w:tabs>
+        <w:ind w:left="5040" w:hanging="360"/>
+      </w:pPr>
+      <w:rPr>
+        <w:rFonts w:ascii="Wingdings" w:hAnsi="Wingdings" w:hint="default"/>
+        <w:sz w:val="20"/>
+      </w:rPr>
+    </w:lvl>
+    <w:lvl w:ilvl="7" w:tentative="1">
+      <w:start w:val="1"/>
+      <w:numFmt w:val="bullet"/>
+      <w:lvlText w:val=""/>
+      <w:lvlJc w:val="left"/>
+      <w:pPr>
+        <w:tabs>
+          <w:tab w:val="num" w:pos="5760"/>
+        </w:tabs>
+        <w:ind w:left="5760" w:hanging="360"/>
+      </w:pPr>
+      <w:rPr>
+        <w:rFonts w:ascii="Wingdings" w:hAnsi="Wingdings" w:hint="default"/>
+        <w:sz w:val="20"/>
+      </w:rPr>
+    </w:lvl>
+    <w:lvl w:ilvl="8" w:tentative="1">
+      <w:start w:val="1"/>
+      <w:numFmt w:val="bullet"/>
+      <w:lvlText w:val=""/>
+      <w:lvlJc w:val="left"/>
+      <w:pPr>
+        <w:tabs>
+          <w:tab w:val="num" w:pos="6480"/>
+        </w:tabs>
+        <w:ind w:left="6480" w:hanging="360"/>
+      </w:pPr>
+      <w:rPr>
+        <w:rFonts w:ascii="Wingdings" w:hAnsi="Wingdings" w:hint="default"/>
+        <w:sz w:val="20"/>
+      </w:rPr>
+    </w:lvl>
+  </w:abstractNum>
+  <w:abstractNum w:abstractNumId="16" w15:restartNumberingAfterBreak="0">
     <w:nsid w:val="3E5E67E7"/>
     <w:multiLevelType w:val="hybridMultilevel"/>
     <w:tmpl w:val="9BFA4006"/>
@@ -7217,7 +9954,7 @@
       </w:rPr>
     </w:lvl>
   </w:abstractNum>
-  <w:abstractNum w:abstractNumId="14" w15:restartNumberingAfterBreak="0">
+  <w:abstractNum w:abstractNumId="17" w15:restartNumberingAfterBreak="0">
     <w:nsid w:val="45EF335E"/>
     <w:multiLevelType w:val="hybridMultilevel"/>
     <w:tmpl w:val="B15A6A94"/>
@@ -7330,7 +10067,156 @@
       </w:rPr>
     </w:lvl>
   </w:abstractNum>
-  <w:abstractNum w:abstractNumId="15" w15:restartNumberingAfterBreak="0">
+  <w:abstractNum w:abstractNumId="18" w15:restartNumberingAfterBreak="0">
+    <w:nsid w:val="53CF66FB"/>
+    <w:multiLevelType w:val="multilevel"/>
+    <w:tmpl w:val="E0780B8A"/>
+    <w:lvl w:ilvl="0">
+      <w:start w:val="1"/>
+      <w:numFmt w:val="bullet"/>
+      <w:lvlText w:val=""/>
+      <w:lvlJc w:val="left"/>
+      <w:pPr>
+        <w:tabs>
+          <w:tab w:val="num" w:pos="720"/>
+        </w:tabs>
+        <w:ind w:left="720" w:hanging="360"/>
+      </w:pPr>
+      <w:rPr>
+        <w:rFonts w:ascii="Symbol" w:hAnsi="Symbol" w:hint="default"/>
+        <w:sz w:val="20"/>
+      </w:rPr>
+    </w:lvl>
+    <w:lvl w:ilvl="1" w:tentative="1">
+      <w:start w:val="1"/>
+      <w:numFmt w:val="bullet"/>
+      <w:lvlText w:val="o"/>
+      <w:lvlJc w:val="left"/>
+      <w:pPr>
+        <w:tabs>
+          <w:tab w:val="num" w:pos="1440"/>
+        </w:tabs>
+        <w:ind w:left="1440" w:hanging="360"/>
+      </w:pPr>
+      <w:rPr>
+        <w:rFonts w:ascii="Courier New" w:hAnsi="Courier New" w:hint="default"/>
+        <w:sz w:val="20"/>
+      </w:rPr>
+    </w:lvl>
+    <w:lvl w:ilvl="2" w:tentative="1">
+      <w:start w:val="1"/>
+      <w:numFmt w:val="bullet"/>
+      <w:lvlText w:val=""/>
+      <w:lvlJc w:val="left"/>
+      <w:pPr>
+        <w:tabs>
+          <w:tab w:val="num" w:pos="2160"/>
+        </w:tabs>
+        <w:ind w:left="2160" w:hanging="360"/>
+      </w:pPr>
+      <w:rPr>
+        <w:rFonts w:ascii="Wingdings" w:hAnsi="Wingdings" w:hint="default"/>
+        <w:sz w:val="20"/>
+      </w:rPr>
+    </w:lvl>
+    <w:lvl w:ilvl="3" w:tentative="1">
+      <w:start w:val="1"/>
+      <w:numFmt w:val="bullet"/>
+      <w:lvlText w:val=""/>
+      <w:lvlJc w:val="left"/>
+      <w:pPr>
+        <w:tabs>
+          <w:tab w:val="num" w:pos="2880"/>
+        </w:tabs>
+        <w:ind w:left="2880" w:hanging="360"/>
+      </w:pPr>
+      <w:rPr>
+        <w:rFonts w:ascii="Wingdings" w:hAnsi="Wingdings" w:hint="default"/>
+        <w:sz w:val="20"/>
+      </w:rPr>
+    </w:lvl>
+    <w:lvl w:ilvl="4" w:tentative="1">
+      <w:start w:val="1"/>
+      <w:numFmt w:val="bullet"/>
+      <w:lvlText w:val=""/>
+      <w:lvlJc w:val="left"/>
+      <w:pPr>
+        <w:tabs>
+          <w:tab w:val="num" w:pos="3600"/>
+        </w:tabs>
+        <w:ind w:left="3600" w:hanging="360"/>
+      </w:pPr>
+      <w:rPr>
+        <w:rFonts w:ascii="Wingdings" w:hAnsi="Wingdings" w:hint="default"/>
+        <w:sz w:val="20"/>
+      </w:rPr>
+    </w:lvl>
+    <w:lvl w:ilvl="5" w:tentative="1">
+      <w:start w:val="1"/>
+      <w:numFmt w:val="bullet"/>
+      <w:lvlText w:val=""/>
+      <w:lvlJc w:val="left"/>
+      <w:pPr>
+        <w:tabs>
+          <w:tab w:val="num" w:pos="4320"/>
+        </w:tabs>
+        <w:ind w:left="4320" w:hanging="360"/>
+      </w:pPr>
+      <w:rPr>
+        <w:rFonts w:ascii="Wingdings" w:hAnsi="Wingdings" w:hint="default"/>
+        <w:sz w:val="20"/>
+      </w:rPr>
+    </w:lvl>
+    <w:lvl w:ilvl="6" w:tentative="1">
+      <w:start w:val="1"/>
+      <w:numFmt w:val="bullet"/>
+      <w:lvlText w:val=""/>
+      <w:lvlJc w:val="left"/>
+      <w:pPr>
+        <w:tabs>
+          <w:tab w:val="num" w:pos="5040"/>
+        </w:tabs>
+        <w:ind w:left="5040" w:hanging="360"/>
+      </w:pPr>
+      <w:rPr>
+        <w:rFonts w:ascii="Wingdings" w:hAnsi="Wingdings" w:hint="default"/>
+        <w:sz w:val="20"/>
+      </w:rPr>
+    </w:lvl>
+    <w:lvl w:ilvl="7" w:tentative="1">
+      <w:start w:val="1"/>
+      <w:numFmt w:val="bullet"/>
+      <w:lvlText w:val=""/>
+      <w:lvlJc w:val="left"/>
+      <w:pPr>
+        <w:tabs>
+          <w:tab w:val="num" w:pos="5760"/>
+        </w:tabs>
+        <w:ind w:left="5760" w:hanging="360"/>
+      </w:pPr>
+      <w:rPr>
+        <w:rFonts w:ascii="Wingdings" w:hAnsi="Wingdings" w:hint="default"/>
+        <w:sz w:val="20"/>
+      </w:rPr>
+    </w:lvl>
+    <w:lvl w:ilvl="8" w:tentative="1">
+      <w:start w:val="1"/>
+      <w:numFmt w:val="bullet"/>
+      <w:lvlText w:val=""/>
+      <w:lvlJc w:val="left"/>
+      <w:pPr>
+        <w:tabs>
+          <w:tab w:val="num" w:pos="6480"/>
+        </w:tabs>
+        <w:ind w:left="6480" w:hanging="360"/>
+      </w:pPr>
+      <w:rPr>
+        <w:rFonts w:ascii="Wingdings" w:hAnsi="Wingdings" w:hint="default"/>
+        <w:sz w:val="20"/>
+      </w:rPr>
+    </w:lvl>
+  </w:abstractNum>
+  <w:abstractNum w:abstractNumId="19" w15:restartNumberingAfterBreak="0">
     <w:nsid w:val="56FA08AD"/>
     <w:multiLevelType w:val="hybridMultilevel"/>
     <w:tmpl w:val="09C07A04"/>
@@ -7440,6 +10326,602 @@
       </w:pPr>
       <w:rPr>
         <w:rFonts w:ascii="Wingdings" w:hAnsi="Wingdings" w:hint="default"/>
+      </w:rPr>
+    </w:lvl>
+  </w:abstractNum>
+  <w:abstractNum w:abstractNumId="20" w15:restartNumberingAfterBreak="0">
+    <w:nsid w:val="64486339"/>
+    <w:multiLevelType w:val="multilevel"/>
+    <w:tmpl w:val="BBA2A5E2"/>
+    <w:lvl w:ilvl="0">
+      <w:start w:val="1"/>
+      <w:numFmt w:val="bullet"/>
+      <w:lvlText w:val=""/>
+      <w:lvlJc w:val="left"/>
+      <w:pPr>
+        <w:tabs>
+          <w:tab w:val="num" w:pos="720"/>
+        </w:tabs>
+        <w:ind w:left="720" w:hanging="360"/>
+      </w:pPr>
+      <w:rPr>
+        <w:rFonts w:ascii="Symbol" w:hAnsi="Symbol" w:hint="default"/>
+        <w:sz w:val="20"/>
+      </w:rPr>
+    </w:lvl>
+    <w:lvl w:ilvl="1" w:tentative="1">
+      <w:start w:val="1"/>
+      <w:numFmt w:val="bullet"/>
+      <w:lvlText w:val="o"/>
+      <w:lvlJc w:val="left"/>
+      <w:pPr>
+        <w:tabs>
+          <w:tab w:val="num" w:pos="1440"/>
+        </w:tabs>
+        <w:ind w:left="1440" w:hanging="360"/>
+      </w:pPr>
+      <w:rPr>
+        <w:rFonts w:ascii="Courier New" w:hAnsi="Courier New" w:hint="default"/>
+        <w:sz w:val="20"/>
+      </w:rPr>
+    </w:lvl>
+    <w:lvl w:ilvl="2" w:tentative="1">
+      <w:start w:val="1"/>
+      <w:numFmt w:val="bullet"/>
+      <w:lvlText w:val=""/>
+      <w:lvlJc w:val="left"/>
+      <w:pPr>
+        <w:tabs>
+          <w:tab w:val="num" w:pos="2160"/>
+        </w:tabs>
+        <w:ind w:left="2160" w:hanging="360"/>
+      </w:pPr>
+      <w:rPr>
+        <w:rFonts w:ascii="Wingdings" w:hAnsi="Wingdings" w:hint="default"/>
+        <w:sz w:val="20"/>
+      </w:rPr>
+    </w:lvl>
+    <w:lvl w:ilvl="3" w:tentative="1">
+      <w:start w:val="1"/>
+      <w:numFmt w:val="bullet"/>
+      <w:lvlText w:val=""/>
+      <w:lvlJc w:val="left"/>
+      <w:pPr>
+        <w:tabs>
+          <w:tab w:val="num" w:pos="2880"/>
+        </w:tabs>
+        <w:ind w:left="2880" w:hanging="360"/>
+      </w:pPr>
+      <w:rPr>
+        <w:rFonts w:ascii="Wingdings" w:hAnsi="Wingdings" w:hint="default"/>
+        <w:sz w:val="20"/>
+      </w:rPr>
+    </w:lvl>
+    <w:lvl w:ilvl="4" w:tentative="1">
+      <w:start w:val="1"/>
+      <w:numFmt w:val="bullet"/>
+      <w:lvlText w:val=""/>
+      <w:lvlJc w:val="left"/>
+      <w:pPr>
+        <w:tabs>
+          <w:tab w:val="num" w:pos="3600"/>
+        </w:tabs>
+        <w:ind w:left="3600" w:hanging="360"/>
+      </w:pPr>
+      <w:rPr>
+        <w:rFonts w:ascii="Wingdings" w:hAnsi="Wingdings" w:hint="default"/>
+        <w:sz w:val="20"/>
+      </w:rPr>
+    </w:lvl>
+    <w:lvl w:ilvl="5" w:tentative="1">
+      <w:start w:val="1"/>
+      <w:numFmt w:val="bullet"/>
+      <w:lvlText w:val=""/>
+      <w:lvlJc w:val="left"/>
+      <w:pPr>
+        <w:tabs>
+          <w:tab w:val="num" w:pos="4320"/>
+        </w:tabs>
+        <w:ind w:left="4320" w:hanging="360"/>
+      </w:pPr>
+      <w:rPr>
+        <w:rFonts w:ascii="Wingdings" w:hAnsi="Wingdings" w:hint="default"/>
+        <w:sz w:val="20"/>
+      </w:rPr>
+    </w:lvl>
+    <w:lvl w:ilvl="6" w:tentative="1">
+      <w:start w:val="1"/>
+      <w:numFmt w:val="bullet"/>
+      <w:lvlText w:val=""/>
+      <w:lvlJc w:val="left"/>
+      <w:pPr>
+        <w:tabs>
+          <w:tab w:val="num" w:pos="5040"/>
+        </w:tabs>
+        <w:ind w:left="5040" w:hanging="360"/>
+      </w:pPr>
+      <w:rPr>
+        <w:rFonts w:ascii="Wingdings" w:hAnsi="Wingdings" w:hint="default"/>
+        <w:sz w:val="20"/>
+      </w:rPr>
+    </w:lvl>
+    <w:lvl w:ilvl="7" w:tentative="1">
+      <w:start w:val="1"/>
+      <w:numFmt w:val="bullet"/>
+      <w:lvlText w:val=""/>
+      <w:lvlJc w:val="left"/>
+      <w:pPr>
+        <w:tabs>
+          <w:tab w:val="num" w:pos="5760"/>
+        </w:tabs>
+        <w:ind w:left="5760" w:hanging="360"/>
+      </w:pPr>
+      <w:rPr>
+        <w:rFonts w:ascii="Wingdings" w:hAnsi="Wingdings" w:hint="default"/>
+        <w:sz w:val="20"/>
+      </w:rPr>
+    </w:lvl>
+    <w:lvl w:ilvl="8" w:tentative="1">
+      <w:start w:val="1"/>
+      <w:numFmt w:val="bullet"/>
+      <w:lvlText w:val=""/>
+      <w:lvlJc w:val="left"/>
+      <w:pPr>
+        <w:tabs>
+          <w:tab w:val="num" w:pos="6480"/>
+        </w:tabs>
+        <w:ind w:left="6480" w:hanging="360"/>
+      </w:pPr>
+      <w:rPr>
+        <w:rFonts w:ascii="Wingdings" w:hAnsi="Wingdings" w:hint="default"/>
+        <w:sz w:val="20"/>
+      </w:rPr>
+    </w:lvl>
+  </w:abstractNum>
+  <w:abstractNum w:abstractNumId="21" w15:restartNumberingAfterBreak="0">
+    <w:nsid w:val="6B2E10E3"/>
+    <w:multiLevelType w:val="multilevel"/>
+    <w:tmpl w:val="F0385AA8"/>
+    <w:lvl w:ilvl="0">
+      <w:start w:val="1"/>
+      <w:numFmt w:val="bullet"/>
+      <w:lvlText w:val=""/>
+      <w:lvlJc w:val="left"/>
+      <w:pPr>
+        <w:tabs>
+          <w:tab w:val="num" w:pos="720"/>
+        </w:tabs>
+        <w:ind w:left="720" w:hanging="360"/>
+      </w:pPr>
+      <w:rPr>
+        <w:rFonts w:ascii="Symbol" w:hAnsi="Symbol" w:hint="default"/>
+        <w:sz w:val="20"/>
+      </w:rPr>
+    </w:lvl>
+    <w:lvl w:ilvl="1" w:tentative="1">
+      <w:start w:val="1"/>
+      <w:numFmt w:val="bullet"/>
+      <w:lvlText w:val="o"/>
+      <w:lvlJc w:val="left"/>
+      <w:pPr>
+        <w:tabs>
+          <w:tab w:val="num" w:pos="1440"/>
+        </w:tabs>
+        <w:ind w:left="1440" w:hanging="360"/>
+      </w:pPr>
+      <w:rPr>
+        <w:rFonts w:ascii="Courier New" w:hAnsi="Courier New" w:hint="default"/>
+        <w:sz w:val="20"/>
+      </w:rPr>
+    </w:lvl>
+    <w:lvl w:ilvl="2" w:tentative="1">
+      <w:start w:val="1"/>
+      <w:numFmt w:val="bullet"/>
+      <w:lvlText w:val=""/>
+      <w:lvlJc w:val="left"/>
+      <w:pPr>
+        <w:tabs>
+          <w:tab w:val="num" w:pos="2160"/>
+        </w:tabs>
+        <w:ind w:left="2160" w:hanging="360"/>
+      </w:pPr>
+      <w:rPr>
+        <w:rFonts w:ascii="Wingdings" w:hAnsi="Wingdings" w:hint="default"/>
+        <w:sz w:val="20"/>
+      </w:rPr>
+    </w:lvl>
+    <w:lvl w:ilvl="3" w:tentative="1">
+      <w:start w:val="1"/>
+      <w:numFmt w:val="bullet"/>
+      <w:lvlText w:val=""/>
+      <w:lvlJc w:val="left"/>
+      <w:pPr>
+        <w:tabs>
+          <w:tab w:val="num" w:pos="2880"/>
+        </w:tabs>
+        <w:ind w:left="2880" w:hanging="360"/>
+      </w:pPr>
+      <w:rPr>
+        <w:rFonts w:ascii="Wingdings" w:hAnsi="Wingdings" w:hint="default"/>
+        <w:sz w:val="20"/>
+      </w:rPr>
+    </w:lvl>
+    <w:lvl w:ilvl="4" w:tentative="1">
+      <w:start w:val="1"/>
+      <w:numFmt w:val="bullet"/>
+      <w:lvlText w:val=""/>
+      <w:lvlJc w:val="left"/>
+      <w:pPr>
+        <w:tabs>
+          <w:tab w:val="num" w:pos="3600"/>
+        </w:tabs>
+        <w:ind w:left="3600" w:hanging="360"/>
+      </w:pPr>
+      <w:rPr>
+        <w:rFonts w:ascii="Wingdings" w:hAnsi="Wingdings" w:hint="default"/>
+        <w:sz w:val="20"/>
+      </w:rPr>
+    </w:lvl>
+    <w:lvl w:ilvl="5" w:tentative="1">
+      <w:start w:val="1"/>
+      <w:numFmt w:val="bullet"/>
+      <w:lvlText w:val=""/>
+      <w:lvlJc w:val="left"/>
+      <w:pPr>
+        <w:tabs>
+          <w:tab w:val="num" w:pos="4320"/>
+        </w:tabs>
+        <w:ind w:left="4320" w:hanging="360"/>
+      </w:pPr>
+      <w:rPr>
+        <w:rFonts w:ascii="Wingdings" w:hAnsi="Wingdings" w:hint="default"/>
+        <w:sz w:val="20"/>
+      </w:rPr>
+    </w:lvl>
+    <w:lvl w:ilvl="6" w:tentative="1">
+      <w:start w:val="1"/>
+      <w:numFmt w:val="bullet"/>
+      <w:lvlText w:val=""/>
+      <w:lvlJc w:val="left"/>
+      <w:pPr>
+        <w:tabs>
+          <w:tab w:val="num" w:pos="5040"/>
+        </w:tabs>
+        <w:ind w:left="5040" w:hanging="360"/>
+      </w:pPr>
+      <w:rPr>
+        <w:rFonts w:ascii="Wingdings" w:hAnsi="Wingdings" w:hint="default"/>
+        <w:sz w:val="20"/>
+      </w:rPr>
+    </w:lvl>
+    <w:lvl w:ilvl="7" w:tentative="1">
+      <w:start w:val="1"/>
+      <w:numFmt w:val="bullet"/>
+      <w:lvlText w:val=""/>
+      <w:lvlJc w:val="left"/>
+      <w:pPr>
+        <w:tabs>
+          <w:tab w:val="num" w:pos="5760"/>
+        </w:tabs>
+        <w:ind w:left="5760" w:hanging="360"/>
+      </w:pPr>
+      <w:rPr>
+        <w:rFonts w:ascii="Wingdings" w:hAnsi="Wingdings" w:hint="default"/>
+        <w:sz w:val="20"/>
+      </w:rPr>
+    </w:lvl>
+    <w:lvl w:ilvl="8" w:tentative="1">
+      <w:start w:val="1"/>
+      <w:numFmt w:val="bullet"/>
+      <w:lvlText w:val=""/>
+      <w:lvlJc w:val="left"/>
+      <w:pPr>
+        <w:tabs>
+          <w:tab w:val="num" w:pos="6480"/>
+        </w:tabs>
+        <w:ind w:left="6480" w:hanging="360"/>
+      </w:pPr>
+      <w:rPr>
+        <w:rFonts w:ascii="Wingdings" w:hAnsi="Wingdings" w:hint="default"/>
+        <w:sz w:val="20"/>
+      </w:rPr>
+    </w:lvl>
+  </w:abstractNum>
+  <w:abstractNum w:abstractNumId="22" w15:restartNumberingAfterBreak="0">
+    <w:nsid w:val="763822FC"/>
+    <w:multiLevelType w:val="multilevel"/>
+    <w:tmpl w:val="8B9675A0"/>
+    <w:lvl w:ilvl="0">
+      <w:start w:val="1"/>
+      <w:numFmt w:val="bullet"/>
+      <w:lvlText w:val=""/>
+      <w:lvlJc w:val="left"/>
+      <w:pPr>
+        <w:tabs>
+          <w:tab w:val="num" w:pos="720"/>
+        </w:tabs>
+        <w:ind w:left="720" w:hanging="360"/>
+      </w:pPr>
+      <w:rPr>
+        <w:rFonts w:ascii="Symbol" w:hAnsi="Symbol" w:hint="default"/>
+        <w:sz w:val="20"/>
+      </w:rPr>
+    </w:lvl>
+    <w:lvl w:ilvl="1" w:tentative="1">
+      <w:start w:val="1"/>
+      <w:numFmt w:val="bullet"/>
+      <w:lvlText w:val="o"/>
+      <w:lvlJc w:val="left"/>
+      <w:pPr>
+        <w:tabs>
+          <w:tab w:val="num" w:pos="1440"/>
+        </w:tabs>
+        <w:ind w:left="1440" w:hanging="360"/>
+      </w:pPr>
+      <w:rPr>
+        <w:rFonts w:ascii="Courier New" w:hAnsi="Courier New" w:hint="default"/>
+        <w:sz w:val="20"/>
+      </w:rPr>
+    </w:lvl>
+    <w:lvl w:ilvl="2" w:tentative="1">
+      <w:start w:val="1"/>
+      <w:numFmt w:val="bullet"/>
+      <w:lvlText w:val=""/>
+      <w:lvlJc w:val="left"/>
+      <w:pPr>
+        <w:tabs>
+          <w:tab w:val="num" w:pos="2160"/>
+        </w:tabs>
+        <w:ind w:left="2160" w:hanging="360"/>
+      </w:pPr>
+      <w:rPr>
+        <w:rFonts w:ascii="Wingdings" w:hAnsi="Wingdings" w:hint="default"/>
+        <w:sz w:val="20"/>
+      </w:rPr>
+    </w:lvl>
+    <w:lvl w:ilvl="3" w:tentative="1">
+      <w:start w:val="1"/>
+      <w:numFmt w:val="bullet"/>
+      <w:lvlText w:val=""/>
+      <w:lvlJc w:val="left"/>
+      <w:pPr>
+        <w:tabs>
+          <w:tab w:val="num" w:pos="2880"/>
+        </w:tabs>
+        <w:ind w:left="2880" w:hanging="360"/>
+      </w:pPr>
+      <w:rPr>
+        <w:rFonts w:ascii="Wingdings" w:hAnsi="Wingdings" w:hint="default"/>
+        <w:sz w:val="20"/>
+      </w:rPr>
+    </w:lvl>
+    <w:lvl w:ilvl="4" w:tentative="1">
+      <w:start w:val="1"/>
+      <w:numFmt w:val="bullet"/>
+      <w:lvlText w:val=""/>
+      <w:lvlJc w:val="left"/>
+      <w:pPr>
+        <w:tabs>
+          <w:tab w:val="num" w:pos="3600"/>
+        </w:tabs>
+        <w:ind w:left="3600" w:hanging="360"/>
+      </w:pPr>
+      <w:rPr>
+        <w:rFonts w:ascii="Wingdings" w:hAnsi="Wingdings" w:hint="default"/>
+        <w:sz w:val="20"/>
+      </w:rPr>
+    </w:lvl>
+    <w:lvl w:ilvl="5" w:tentative="1">
+      <w:start w:val="1"/>
+      <w:numFmt w:val="bullet"/>
+      <w:lvlText w:val=""/>
+      <w:lvlJc w:val="left"/>
+      <w:pPr>
+        <w:tabs>
+          <w:tab w:val="num" w:pos="4320"/>
+        </w:tabs>
+        <w:ind w:left="4320" w:hanging="360"/>
+      </w:pPr>
+      <w:rPr>
+        <w:rFonts w:ascii="Wingdings" w:hAnsi="Wingdings" w:hint="default"/>
+        <w:sz w:val="20"/>
+      </w:rPr>
+    </w:lvl>
+    <w:lvl w:ilvl="6" w:tentative="1">
+      <w:start w:val="1"/>
+      <w:numFmt w:val="bullet"/>
+      <w:lvlText w:val=""/>
+      <w:lvlJc w:val="left"/>
+      <w:pPr>
+        <w:tabs>
+          <w:tab w:val="num" w:pos="5040"/>
+        </w:tabs>
+        <w:ind w:left="5040" w:hanging="360"/>
+      </w:pPr>
+      <w:rPr>
+        <w:rFonts w:ascii="Wingdings" w:hAnsi="Wingdings" w:hint="default"/>
+        <w:sz w:val="20"/>
+      </w:rPr>
+    </w:lvl>
+    <w:lvl w:ilvl="7" w:tentative="1">
+      <w:start w:val="1"/>
+      <w:numFmt w:val="bullet"/>
+      <w:lvlText w:val=""/>
+      <w:lvlJc w:val="left"/>
+      <w:pPr>
+        <w:tabs>
+          <w:tab w:val="num" w:pos="5760"/>
+        </w:tabs>
+        <w:ind w:left="5760" w:hanging="360"/>
+      </w:pPr>
+      <w:rPr>
+        <w:rFonts w:ascii="Wingdings" w:hAnsi="Wingdings" w:hint="default"/>
+        <w:sz w:val="20"/>
+      </w:rPr>
+    </w:lvl>
+    <w:lvl w:ilvl="8" w:tentative="1">
+      <w:start w:val="1"/>
+      <w:numFmt w:val="bullet"/>
+      <w:lvlText w:val=""/>
+      <w:lvlJc w:val="left"/>
+      <w:pPr>
+        <w:tabs>
+          <w:tab w:val="num" w:pos="6480"/>
+        </w:tabs>
+        <w:ind w:left="6480" w:hanging="360"/>
+      </w:pPr>
+      <w:rPr>
+        <w:rFonts w:ascii="Wingdings" w:hAnsi="Wingdings" w:hint="default"/>
+        <w:sz w:val="20"/>
+      </w:rPr>
+    </w:lvl>
+  </w:abstractNum>
+  <w:abstractNum w:abstractNumId="23" w15:restartNumberingAfterBreak="0">
+    <w:nsid w:val="76F44BC9"/>
+    <w:multiLevelType w:val="multilevel"/>
+    <w:tmpl w:val="534E2742"/>
+    <w:lvl w:ilvl="0">
+      <w:start w:val="1"/>
+      <w:numFmt w:val="bullet"/>
+      <w:lvlText w:val=""/>
+      <w:lvlJc w:val="left"/>
+      <w:pPr>
+        <w:tabs>
+          <w:tab w:val="num" w:pos="720"/>
+        </w:tabs>
+        <w:ind w:left="720" w:hanging="360"/>
+      </w:pPr>
+      <w:rPr>
+        <w:rFonts w:ascii="Symbol" w:hAnsi="Symbol" w:hint="default"/>
+        <w:sz w:val="20"/>
+      </w:rPr>
+    </w:lvl>
+    <w:lvl w:ilvl="1" w:tentative="1">
+      <w:start w:val="1"/>
+      <w:numFmt w:val="bullet"/>
+      <w:lvlText w:val="o"/>
+      <w:lvlJc w:val="left"/>
+      <w:pPr>
+        <w:tabs>
+          <w:tab w:val="num" w:pos="1440"/>
+        </w:tabs>
+        <w:ind w:left="1440" w:hanging="360"/>
+      </w:pPr>
+      <w:rPr>
+        <w:rFonts w:ascii="Courier New" w:hAnsi="Courier New" w:hint="default"/>
+        <w:sz w:val="20"/>
+      </w:rPr>
+    </w:lvl>
+    <w:lvl w:ilvl="2" w:tentative="1">
+      <w:start w:val="1"/>
+      <w:numFmt w:val="bullet"/>
+      <w:lvlText w:val=""/>
+      <w:lvlJc w:val="left"/>
+      <w:pPr>
+        <w:tabs>
+          <w:tab w:val="num" w:pos="2160"/>
+        </w:tabs>
+        <w:ind w:left="2160" w:hanging="360"/>
+      </w:pPr>
+      <w:rPr>
+        <w:rFonts w:ascii="Wingdings" w:hAnsi="Wingdings" w:hint="default"/>
+        <w:sz w:val="20"/>
+      </w:rPr>
+    </w:lvl>
+    <w:lvl w:ilvl="3" w:tentative="1">
+      <w:start w:val="1"/>
+      <w:numFmt w:val="bullet"/>
+      <w:lvlText w:val=""/>
+      <w:lvlJc w:val="left"/>
+      <w:pPr>
+        <w:tabs>
+          <w:tab w:val="num" w:pos="2880"/>
+        </w:tabs>
+        <w:ind w:left="2880" w:hanging="360"/>
+      </w:pPr>
+      <w:rPr>
+        <w:rFonts w:ascii="Wingdings" w:hAnsi="Wingdings" w:hint="default"/>
+        <w:sz w:val="20"/>
+      </w:rPr>
+    </w:lvl>
+    <w:lvl w:ilvl="4" w:tentative="1">
+      <w:start w:val="1"/>
+      <w:numFmt w:val="bullet"/>
+      <w:lvlText w:val=""/>
+      <w:lvlJc w:val="left"/>
+      <w:pPr>
+        <w:tabs>
+          <w:tab w:val="num" w:pos="3600"/>
+        </w:tabs>
+        <w:ind w:left="3600" w:hanging="360"/>
+      </w:pPr>
+      <w:rPr>
+        <w:rFonts w:ascii="Wingdings" w:hAnsi="Wingdings" w:hint="default"/>
+        <w:sz w:val="20"/>
+      </w:rPr>
+    </w:lvl>
+    <w:lvl w:ilvl="5" w:tentative="1">
+      <w:start w:val="1"/>
+      <w:numFmt w:val="bullet"/>
+      <w:lvlText w:val=""/>
+      <w:lvlJc w:val="left"/>
+      <w:pPr>
+        <w:tabs>
+          <w:tab w:val="num" w:pos="4320"/>
+        </w:tabs>
+        <w:ind w:left="4320" w:hanging="360"/>
+      </w:pPr>
+      <w:rPr>
+        <w:rFonts w:ascii="Wingdings" w:hAnsi="Wingdings" w:hint="default"/>
+        <w:sz w:val="20"/>
+      </w:rPr>
+    </w:lvl>
+    <w:lvl w:ilvl="6" w:tentative="1">
+      <w:start w:val="1"/>
+      <w:numFmt w:val="bullet"/>
+      <w:lvlText w:val=""/>
+      <w:lvlJc w:val="left"/>
+      <w:pPr>
+        <w:tabs>
+          <w:tab w:val="num" w:pos="5040"/>
+        </w:tabs>
+        <w:ind w:left="5040" w:hanging="360"/>
+      </w:pPr>
+      <w:rPr>
+        <w:rFonts w:ascii="Wingdings" w:hAnsi="Wingdings" w:hint="default"/>
+        <w:sz w:val="20"/>
+      </w:rPr>
+    </w:lvl>
+    <w:lvl w:ilvl="7" w:tentative="1">
+      <w:start w:val="1"/>
+      <w:numFmt w:val="bullet"/>
+      <w:lvlText w:val=""/>
+      <w:lvlJc w:val="left"/>
+      <w:pPr>
+        <w:tabs>
+          <w:tab w:val="num" w:pos="5760"/>
+        </w:tabs>
+        <w:ind w:left="5760" w:hanging="360"/>
+      </w:pPr>
+      <w:rPr>
+        <w:rFonts w:ascii="Wingdings" w:hAnsi="Wingdings" w:hint="default"/>
+        <w:sz w:val="20"/>
+      </w:rPr>
+    </w:lvl>
+    <w:lvl w:ilvl="8" w:tentative="1">
+      <w:start w:val="1"/>
+      <w:numFmt w:val="bullet"/>
+      <w:lvlText w:val=""/>
+      <w:lvlJc w:val="left"/>
+      <w:pPr>
+        <w:tabs>
+          <w:tab w:val="num" w:pos="6480"/>
+        </w:tabs>
+        <w:ind w:left="6480" w:hanging="360"/>
+      </w:pPr>
+      <w:rPr>
+        <w:rFonts w:ascii="Wingdings" w:hAnsi="Wingdings" w:hint="default"/>
+        <w:sz w:val="20"/>
       </w:rPr>
     </w:lvl>
   </w:abstractNum>
@@ -7471,25 +10953,49 @@
     <w:abstractNumId w:val="0"/>
   </w:num>
   <w:num w:numId="10" w16cid:durableId="602418386">
-    <w:abstractNumId w:val="12"/>
+    <w:abstractNumId w:val="14"/>
   </w:num>
   <w:num w:numId="11" w16cid:durableId="1595169676">
-    <w:abstractNumId w:val="14"/>
+    <w:abstractNumId w:val="17"/>
   </w:num>
   <w:num w:numId="12" w16cid:durableId="898400234">
     <w:abstractNumId w:val="10"/>
   </w:num>
   <w:num w:numId="13" w16cid:durableId="1153791886">
-    <w:abstractNumId w:val="15"/>
+    <w:abstractNumId w:val="19"/>
   </w:num>
   <w:num w:numId="14" w16cid:durableId="403719604">
-    <w:abstractNumId w:val="13"/>
+    <w:abstractNumId w:val="16"/>
   </w:num>
   <w:num w:numId="15" w16cid:durableId="1783106351">
     <w:abstractNumId w:val="11"/>
   </w:num>
   <w:num w:numId="16" w16cid:durableId="1429426107">
     <w:abstractNumId w:val="9"/>
+  </w:num>
+  <w:num w:numId="17" w16cid:durableId="1889027468">
+    <w:abstractNumId w:val="22"/>
+  </w:num>
+  <w:num w:numId="18" w16cid:durableId="2047871954">
+    <w:abstractNumId w:val="18"/>
+  </w:num>
+  <w:num w:numId="19" w16cid:durableId="1592271762">
+    <w:abstractNumId w:val="13"/>
+  </w:num>
+  <w:num w:numId="20" w16cid:durableId="614286888">
+    <w:abstractNumId w:val="21"/>
+  </w:num>
+  <w:num w:numId="21" w16cid:durableId="868294487">
+    <w:abstractNumId w:val="15"/>
+  </w:num>
+  <w:num w:numId="22" w16cid:durableId="1273321921">
+    <w:abstractNumId w:val="23"/>
+  </w:num>
+  <w:num w:numId="23" w16cid:durableId="349572068">
+    <w:abstractNumId w:val="12"/>
+  </w:num>
+  <w:num w:numId="24" w16cid:durableId="595596243">
+    <w:abstractNumId w:val="20"/>
   </w:num>
 </w:numbering>
 </file>

</xml_diff>